<commit_message>
Updated bibliography and some more edits.
</commit_message>
<xml_diff>
--- a/kelly_2026_weta_morph_investment_updated.docx
+++ b/kelly_2026_weta_morph_investment_updated.docx
@@ -83,7 +83,25 @@
         <w:pStyle w:val="FirstParagraph"/>
       </w:pPr>
       <w:r>
-        <w:t xml:space="preserve">Alternative mating strategies allow males to achieve reproductive success through divergent solutions to competition for mates. In many species, large or well-armed males defend females or reproductive resources, whereas smaller males avoid direct contests and obtain matings through sneaking, satellite behaviour or active searching (Gross 1996; Shuster &amp; Wade 2003; Oliveira et al. 2008). These strategies are frequently associated with conspicuous differences in body size and weaponry, but alternative male phenotypes can differ in many additional aspects of morphology, physiology, behaviour and life history. They are therefore better understood as integrated phenotypes than as otherwise similar males differing only in the exaggerated trait used to classify them (West-Eberhard 2003). Selection should favour coordinated combinations of traits that facilitate the behaviour and ecological circumstances associated with each strategy.</w:t>
+        <w:t xml:space="preserve">Alternative mating strategies allow males to achieve reproductive success through divergent solutions to competition for mates. In many species, large or well-armed males defend females or reproductive resources, whereas smaller males avoid direct contests and obtain matings through sneaking, satellite behaviour or active searching</w:t>
+      </w:r>
+      <w:r>
+        <w:t xml:space="preserve"> </w:t>
+      </w:r>
+      <w:r>
+        <w:t xml:space="preserve">(Gross 1996; Shuster and Wade 2003; Oliveira, Taborsky, and Brockmann 2008)</w:t>
+      </w:r>
+      <w:r>
+        <w:t xml:space="preserve">. These strategies are frequently associated with conspicuous differences in body size and weaponry, but alternative male phenotypes can differ in many additional aspects of morphology, physiology, behaviour and life history. They are therefore better understood as integrated phenotypes than as otherwise similar males differing only in the exaggerated trait used to classify them</w:t>
+      </w:r>
+      <w:r>
+        <w:t xml:space="preserve"> </w:t>
+      </w:r>
+      <w:r>
+        <w:t xml:space="preserve">(West-Eberhard 2003)</w:t>
+      </w:r>
+      <w:r>
+        <w:t xml:space="preserve">. Selection should favour coordinated combinations of traits that facilitate the behaviour and ecological circumstances associated with each strategy.</w:t>
       </w:r>
     </w:p>
     <w:p>
@@ -91,7 +109,43 @@
         <w:pStyle w:val="BodyText"/>
       </w:pPr>
       <w:r>
-        <w:t xml:space="preserve">Such phenotypic integration may arise because the development of one structure affects the resources available to others or because selection favours the coordinated expression of functionally complementary traits. Exaggerated sexually selected structures can impose developmental or performance costs that are mitigated by corresponding changes in supporting structures—a process termed secondary sexual trait compensation (Tomkins et al. 2005; Husak &amp; Swallow 2011). Alternatively, investment in an exaggerated structure may occur at the expense of other traits when their development competes for a limited pool of resources (Nijhout &amp; Emlen 1998; Emlen 2001; Moczek &amp; Nijhout 2004). A third possibility is that investment in weapons and investment in supporting structures are positively integrated, such that individuals or morphs with larger weapons also invest more in locomotory and sensory traits—an outcome expected when overall phenotypic quality or developmental resources simultaneously elevate multiple traits (Bonduriansky &amp; Day 2003; Tomkins et al. 2005). These processes need not be uniform among male morphs. Developmental switches underlying alternative phenotypes can alter the covariance among traits, producing morph-specific patterns of integration even though the morphs possess the same basic anatomical structures (Snell-Rood et al. 2010; Rohner et al. 2020).</w:t>
+        <w:t xml:space="preserve">Such phenotypic integration may arise because the development of one structure affects the resources available to others or because selection favours the coordinated expression of functionally complementary traits. Exaggerated sexually selected structures can impose developmental or performance costs that are mitigated by corresponding changes in supporting structures—a process termed secondary sexual trait compensation</w:t>
+      </w:r>
+      <w:r>
+        <w:t xml:space="preserve"> </w:t>
+      </w:r>
+      <w:r>
+        <w:t xml:space="preserve">(Tomkins, Kotiaho, and Lebas 2005; Husak and Swallow 2011)</w:t>
+      </w:r>
+      <w:r>
+        <w:t xml:space="preserve">. Alternatively, investment in an exaggerated structure may occur at the expense of other traits when their development competes for a limited pool of resources</w:t>
+      </w:r>
+      <w:r>
+        <w:t xml:space="preserve"> </w:t>
+      </w:r>
+      <w:r>
+        <w:t xml:space="preserve">(Nijhout and Emlen 1998; Emlen 2001; Moczek and Nijhout 2004)</w:t>
+      </w:r>
+      <w:r>
+        <w:t xml:space="preserve">. A third possibility is that investment in weapons and investment in supporting structures are positively integrated, such that individuals or morphs with larger weapons also invest more in locomotory and sensory traits—an outcome expected when overall phenotypic quality or developmental resources simultaneously elevate multiple traits</w:t>
+      </w:r>
+      <w:r>
+        <w:t xml:space="preserve"> </w:t>
+      </w:r>
+      <w:r>
+        <w:t xml:space="preserve">(Bonduriansky and Day 2003; Tomkins, Kotiaho, and Lebas 2005)</w:t>
+      </w:r>
+      <w:r>
+        <w:t xml:space="preserve">. These processes need not be uniform among male morphs. Developmental switches underlying alternative phenotypes can alter the covariance among traits, producing morph-specific patterns of integration even though the morphs possess the same basic anatomical structures</w:t>
+      </w:r>
+      <w:r>
+        <w:t xml:space="preserve"> </w:t>
+      </w:r>
+      <w:r>
+        <w:t xml:space="preserve">(Snell-Rood et al. 2010; Rohner, Macagno, and Moczek 2020)</w:t>
+      </w:r>
+      <w:r>
+        <w:t xml:space="preserve">.</w:t>
       </w:r>
     </w:p>
     <w:p>
@@ -99,7 +153,25 @@
         <w:pStyle w:val="BodyText"/>
       </w:pPr>
       <w:r>
-        <w:t xml:space="preserve">Most work on morph-specific integration has focused on weapons and the structures that support their use. In horned dung beetles, for example, horn length is positively integrated with fore- and hindleg morphology, and this integration can be stronger in major than in minor males (Tomkins et al. 2005; Rohner et al. 2020), consistent with positive co-expression of weapons and supporting structures in the conventional morph. Similarly, male rhinoceros beetles with relatively long horns also have relatively long wings and foretibiae, potentially improving locomotion and leverage during combat, although horn size is unrelated to eye size after accounting for body size (McCullough &amp; Emlen 2013). By contrast, in the male-dimorphic stag beetle</w:t>
+        <w:t xml:space="preserve">Most work on morph-specific integration has focused on weapons and the structures that support their use. In horned dung beetles, for example, horn length is positively integrated with fore- and hindleg morphology, and this integration can be stronger in major than in minor males</w:t>
+      </w:r>
+      <w:r>
+        <w:t xml:space="preserve"> </w:t>
+      </w:r>
+      <w:r>
+        <w:t xml:space="preserve">(Tomkins, Kotiaho, and Lebas 2005; Rohner, Macagno, and Moczek 2020)</w:t>
+      </w:r>
+      <w:r>
+        <w:t xml:space="preserve">, consistent with positive co-expression of weapons and supporting structures in the conventional morph. Similarly, male rhinoceros beetles with relatively long horns also have relatively long wings and foretibiae, potentially improving locomotion and leverage during combat, although horn size is unrelated to eye size after accounting for body size</w:t>
+      </w:r>
+      <w:r>
+        <w:t xml:space="preserve"> </w:t>
+      </w:r>
+      <w:r>
+        <w:t xml:space="preserve">(McCullough and Emlen 2013)</w:t>
+      </w:r>
+      <w:r>
+        <w:t xml:space="preserve">. By contrast, in the male-dimorphic stag beetle</w:t>
       </w:r>
       <w:r>
         <w:t xml:space="preserve"> </w:t>
@@ -112,7 +184,16 @@
         <w:t xml:space="preserve">Prosopocoilus inclinatus</w:t>
       </w:r>
       <w:r>
-        <w:t xml:space="preserve">, weapon size is integrated with eye size in major males but with foreleg length in minor males (Ito et al. 2017), suggesting that the traits co-expressed with weaponry can differ between morphs rather than being uniformly larger in the morph with the largest weapons. These findings show that weapon exaggeration can be accompanied by coordinated changes in other traits, but that the pattern and direction of integration need not be predictable from weapon size alone.</w:t>
+        <w:t xml:space="preserve">, weapon size is integrated with eye size in major males but with foreleg length in minor males</w:t>
+      </w:r>
+      <w:r>
+        <w:t xml:space="preserve"> </w:t>
+      </w:r>
+      <w:r>
+        <w:t xml:space="preserve">(Ito, Ohkubo, and Hasegawa 2017)</w:t>
+      </w:r>
+      <w:r>
+        <w:t xml:space="preserve">, suggesting that the traits co-expressed with weaponry can differ between morphs rather than being uniformly larger in the morph with the largest weapons. These findings show that weapon exaggeration can be accompanied by coordinated changes in other traits, but that the pattern and direction of integration need not be predictable from weapon size alone.</w:t>
       </w:r>
     </w:p>
     <w:p>
@@ -120,7 +201,16 @@
         <w:pStyle w:val="BodyText"/>
       </w:pPr>
       <w:r>
-        <w:t xml:space="preserve">Locomotor and sensory traits should be especially relevant to alternative mating strategies because males must both locate mating opportunities and gain access to them. The spatial distribution of receptive females can generate a fundamental contrast between remaining with and defending current mates and searching for additional mates (Shuster &amp; Wade 2003). Males that patrol widely or move among defended mating sites may consequently benefit from locomotor structures that enhance movement, whereas males that defend females may benefit from appendages that provide support or leverage during combat. Sensory demands may also differ among strategies, though the direction of morph differences is not predetermined. In the desert bee</w:t>
+        <w:t xml:space="preserve">Locomotor and sensory traits should be especially relevant to alternative mating strategies because males must both locate mating opportunities and gain access to them. The spatial distribution of receptive females can generate a fundamental contrast between remaining with and defending current mates and searching for additional mates</w:t>
+      </w:r>
+      <w:r>
+        <w:t xml:space="preserve"> </w:t>
+      </w:r>
+      <w:r>
+        <w:t xml:space="preserve">(Shuster and Wade 2003)</w:t>
+      </w:r>
+      <w:r>
+        <w:t xml:space="preserve">. Males that patrol widely or move among defended mating sites may consequently benefit from locomotor structures that enhance movement, whereas males that defend females may benefit from appendages that provide support or leverage during combat. Sensory demands may also differ among strategies, though the direction of morph differences is not predetermined. In the desert bee</w:t>
       </w:r>
       <w:r>
         <w:t xml:space="preserve"> </w:t>
@@ -133,7 +223,16 @@
         <w:t xml:space="preserve">Centris pallida</w:t>
       </w:r>
       <w:r>
-        <w:t xml:space="preserve">, small males rely primarily on vision for mate detection while large males use chemosensory cues; correspondingly, small males possess relatively larger eyes despite their smaller body size (Barrett et al. 2021; Barrett &amp; O’Donnell 2026), consistent with enhanced sensory investment in the morph that actively searches for mates. However, if conventional males require accurate sensory assessment of rivals or of gallery quality to defend harems effectively, the direction of morph differences in sensory investment could be reversed. Few studies have examined locomotor and sensory traits together within a single species to determine whether such differences represent coordinated phenotypic divergence or trait-specific responses to the demands of each strategy.</w:t>
+        <w:t xml:space="preserve">, small males rely primarily on vision for mate detection while large males use chemosensory cues; correspondingly, small males possess relatively larger eyes despite their smaller body size</w:t>
+      </w:r>
+      <w:r>
+        <w:t xml:space="preserve"> </w:t>
+      </w:r>
+      <w:r>
+        <w:t xml:space="preserve">(Meghan Barrett et al. 2021; M. Barrett and O’Donnell 2026)</w:t>
+      </w:r>
+      <w:r>
+        <w:t xml:space="preserve">, consistent with enhanced sensory investment in the morph that actively searches for mates. However, if conventional males require accurate sensory assessment of rivals or of gallery quality to defend harems effectively, the direction of morph differences in sensory investment could be reversed. Few studies have examined locomotor and sensory traits together within a single species to determine whether such differences represent coordinated phenotypic divergence or trait-specific responses to the demands of each strategy.</w:t>
       </w:r>
     </w:p>
     <w:p>
@@ -154,7 +253,43 @@
         <w:t xml:space="preserve">Hemideina crassidens</w:t>
       </w:r>
       <w:r>
-        <w:t xml:space="preserve">, provides an opportunity to address this question. This flightless, nocturnal orthopteran is harem-polygynous, and females shelter communally in cavities in trees, hereafter galleries. Males use their enlarged heads and mandibles as weapons in contests for control of female-occupied galleries, and males with larger weapons generally have an advantage during escalated fights (Kelly 2005, 2006; Kelly &amp; Adams 2010). Males express three genetically polymorphic, irreversible morphotypes through maturation at the eighth, ninth or tenth juvenile instar (Nason &amp; Kelly 2020; Kelly 2024). Large tenth-instar males possess the most exaggerated weaponry and commonly fight for control of galleries. Small eighth-instar males possess much smaller weapons and may circumvent larger defenders to obtain copulations or search vegetation for undefended females, whereas ninth-instar males exhibit an intermediate strategy that combines fighting and sneaking depending on the social context (Wilson &amp; Kelly 2019; Kelly 2025). The three strategies attain similar average reproductive fitness, consistent with their maintenance as a balanced polymorphism (Nason &amp; Kelly 2020).</w:t>
+        <w:t xml:space="preserve">, provides an opportunity to address this question. This flightless, nocturnal orthopteran is harem-polygynous, and females shelter communally in cavities in trees, hereafter galleries. Males use their enlarged heads and mandibles as weapons in contests for control of female-occupied galleries, and males with larger weapons generally have an advantage during escalated fights</w:t>
+      </w:r>
+      <w:r>
+        <w:t xml:space="preserve"> </w:t>
+      </w:r>
+      <w:r>
+        <w:t xml:space="preserve">(Kelly 2005, 2006; Kelly and Adams 2010)</w:t>
+      </w:r>
+      <w:r>
+        <w:t xml:space="preserve">. Males express three genetically polymorphic, irreversible morphotypes through maturation at the eighth, ninth or tenth juvenile instar</w:t>
+      </w:r>
+      <w:r>
+        <w:t xml:space="preserve"> </w:t>
+      </w:r>
+      <w:r>
+        <w:t xml:space="preserve">(Nason and Kelly 2020; Kelly 2024)</w:t>
+      </w:r>
+      <w:r>
+        <w:t xml:space="preserve">. Large tenth-instar males possess the most exaggerated weaponry and commonly fight for control of galleries. Small eighth-instar males possess much smaller weapons and may circumvent larger defenders to obtain copulations or search vegetation for undefended females, whereas ninth-instar males exhibit an intermediate strategy that combines fighting and sneaking depending on the social context</w:t>
+      </w:r>
+      <w:r>
+        <w:t xml:space="preserve"> </w:t>
+      </w:r>
+      <w:r>
+        <w:t xml:space="preserve">(Wilson and Kelly 2019; Kelly 2025)</w:t>
+      </w:r>
+      <w:r>
+        <w:t xml:space="preserve">. The three strategies attain similar average reproductive fitness, consistent with their maintenance as a balanced polymorphism</w:t>
+      </w:r>
+      <w:r>
+        <w:t xml:space="preserve"> </w:t>
+      </w:r>
+      <w:r>
+        <w:t xml:space="preserve">(Nason and Kelly 2020)</w:t>
+      </w:r>
+      <w:r>
+        <w:t xml:space="preserve">.</w:t>
       </w:r>
     </w:p>
     <w:p>
@@ -309,42 +444,34 @@
         <w:pStyle w:val="BodyText"/>
       </w:pPr>
       <w:r>
-        <w:t xml:space="preserve">Adult males were assigned to eighth-, ninth- or tenth-instar morphotypes from their head lengths using the morph-specific distribution parameters established for this population by Kelly</w:t>
+        <w:t xml:space="preserve">Adult males were assigned to eighth-, ninth- or tenth-instar morphotypes from their head lengths following</w:t>
       </w:r>
       <w:r>
         <w:t xml:space="preserve"> </w:t>
       </w:r>
       <w:r>
-        <w:t xml:space="preserve">(</w:t>
-      </w:r>
-      <w:r>
-        <w:rPr>
-          <w:b/>
-          <w:bCs/>
-        </w:rPr>
-        <w:t xml:space="preserve">Kelly2025?</w:t>
-      </w:r>
-      <w:r>
-        <w:t xml:space="preserve">)</w:t>
-      </w:r>
-      <w:r>
-        <w:t xml:space="preserve">. These parameters were derived from a trimodal mixture model of male head length</w:t>
+        <w:t xml:space="preserve">Kelly and Adams (2010)</w:t>
       </w:r>
       <w:r>
         <w:t xml:space="preserve"> </w:t>
       </w:r>
       <w:r>
-        <w:t xml:space="preserve">(</w:t>
-      </w:r>
-      <w:r>
-        <w:rPr>
-          <w:b/>
-          <w:bCs/>
-        </w:rPr>
-        <w:t xml:space="preserve">Kelly2025?</w:t>
-      </w:r>
-      <w:r>
-        <w:t xml:space="preserve">)</w:t>
+        <w:t xml:space="preserve">and</w:t>
+      </w:r>
+      <w:r>
+        <w:t xml:space="preserve"> </w:t>
+      </w:r>
+      <w:r>
+        <w:t xml:space="preserve">Kelly (2026)</w:t>
+      </w:r>
+      <w:r>
+        <w:t xml:space="preserve">. The later parameters were derived from a trimodal mixture model of male head length</w:t>
+      </w:r>
+      <w:r>
+        <w:t xml:space="preserve"> </w:t>
+      </w:r>
+      <w:r>
+        <w:t xml:space="preserve">(Kelly 2026)</w:t>
       </w:r>
       <w:r>
         <w:t xml:space="preserve">.</w:t>
@@ -387,17 +514,7 @@
         <w:t xml:space="preserve"> </w:t>
       </w:r>
       <w:r>
-        <w:t xml:space="preserve">(</w:t>
-      </w:r>
-      <w:r>
-        <w:rPr>
-          <w:b/>
-          <w:bCs/>
-        </w:rPr>
-        <w:t xml:space="preserve">Schindelin2012?</w:t>
-      </w:r>
-      <w:r>
-        <w:t xml:space="preserve">)</w:t>
+        <w:t xml:space="preserve">(Schindelin et al. 2012)</w:t>
       </w:r>
       <w:r>
         <w:t xml:space="preserve">. All linear traits were measured using the straight-line tool, with measurement endpoints defined by consistent anatomical landmarks illustrated in Figure 1. Ear area was measured by tracing the perimeter of the tympanal membrane using the freehand selection tool.</w:t>
@@ -692,6 +809,12 @@
         <w:t xml:space="preserve">rptR</w:t>
       </w:r>
       <w:r>
+        <w:t xml:space="preserve"> </w:t>
+      </w:r>
+      <w:r>
+        <w:t xml:space="preserve">(Stoffel, Nakagawa, and Schielzeth 2017)</w:t>
+      </w:r>
+      <w:r>
         <w:t xml:space="preserve">. Ninety-five per cent confidence intervals were obtained from 1,000 parametric bootstrap replicates. Because females and the three male morphs differ substantially in mean morphology, each analysis was repeated with morph included as a fixed effect. These adjusted estimates quantify repeatability among individuals after removing average differences among morphs. A further model included both morph and measurement round as fixed effects to estimate consistency after accounting for systematic session differences.</w:t>
       </w:r>
     </w:p>
@@ -808,17 +931,7 @@
         <w:t xml:space="preserve"> </w:t>
       </w:r>
       <w:r>
-        <w:t xml:space="preserve">(</w:t>
-      </w:r>
-      <w:r>
-        <w:rPr>
-          <w:b/>
-          <w:bCs/>
-        </w:rPr>
-        <w:t xml:space="preserve">R-base?</w:t>
-      </w:r>
-      <w:r>
-        <w:t xml:space="preserve">)</w:t>
+        <w:t xml:space="preserve">(R Core Team 2025)</w:t>
       </w:r>
       <w:r>
         <w:t xml:space="preserve">. Data preparation and visualization were performed using the</w:t>
@@ -837,17 +950,7 @@
         <w:t xml:space="preserve"> </w:t>
       </w:r>
       <w:r>
-        <w:t xml:space="preserve">(</w:t>
-      </w:r>
-      <w:r>
-        <w:rPr>
-          <w:b/>
-          <w:bCs/>
-        </w:rPr>
-        <w:t xml:space="preserve">R-tidyverse?</w:t>
-      </w:r>
-      <w:r>
-        <w:t xml:space="preserve">)</w:t>
+        <w:t xml:space="preserve">(Wickham et al. 2019)</w:t>
       </w:r>
       <w:r>
         <w:t xml:space="preserve">. Ordinary least-squares models were fitted using base R. Linear mixed-effects models were fitted using</w:t>
@@ -866,17 +969,7 @@
         <w:t xml:space="preserve"> </w:t>
       </w:r>
       <w:r>
-        <w:t xml:space="preserve">(</w:t>
-      </w:r>
-      <w:r>
-        <w:rPr>
-          <w:b/>
-          <w:bCs/>
-        </w:rPr>
-        <w:t xml:space="preserve">R-lme4?</w:t>
-      </w:r>
-      <w:r>
-        <w:t xml:space="preserve">)</w:t>
+        <w:t xml:space="preserve">(Bates et al. 2015)</w:t>
       </w:r>
       <w:r>
         <w:t xml:space="preserve"> </w:t>
@@ -898,17 +991,7 @@
         <w:t xml:space="preserve"> </w:t>
       </w:r>
       <w:r>
-        <w:t xml:space="preserve">(</w:t>
-      </w:r>
-      <w:r>
-        <w:rPr>
-          <w:b/>
-          <w:bCs/>
-        </w:rPr>
-        <w:t xml:space="preserve">R-lmerTest?</w:t>
-      </w:r>
-      <w:r>
-        <w:t xml:space="preserve">)</w:t>
+        <w:t xml:space="preserve">(Kuznetsova, Brockhoff, and Christensen 2017)</w:t>
       </w:r>
       <w:r>
         <w:t xml:space="preserve">. Estimated marginal means, allometric trends and contrasts were calculated using</w:t>
@@ -927,17 +1010,7 @@
         <w:t xml:space="preserve"> </w:t>
       </w:r>
       <w:r>
-        <w:t xml:space="preserve">(</w:t>
-      </w:r>
-      <w:r>
-        <w:rPr>
-          <w:b/>
-          <w:bCs/>
-        </w:rPr>
-        <w:t xml:space="preserve">R-emmeans?</w:t>
-      </w:r>
-      <w:r>
-        <w:t xml:space="preserve">)</w:t>
+        <w:t xml:space="preserve">(Lenth et al. 2019)</w:t>
       </w:r>
       <w:r>
         <w:t xml:space="preserve">, with Kenward–Roger approximations supported by</w:t>
@@ -956,17 +1029,7 @@
         <w:t xml:space="preserve"> </w:t>
       </w:r>
       <w:r>
-        <w:t xml:space="preserve">(</w:t>
-      </w:r>
-      <w:r>
-        <w:rPr>
-          <w:b/>
-          <w:bCs/>
-        </w:rPr>
-        <w:t xml:space="preserve">R-pbkrtest?</w:t>
-      </w:r>
-      <w:r>
-        <w:t xml:space="preserve">)</w:t>
+        <w:t xml:space="preserve">(Halekoh and Højsgaard 2014)</w:t>
       </w:r>
       <w:r>
         <w:t xml:space="preserve">. Model diagnostics and graphical checks were produced using</w:t>
@@ -985,17 +1048,7 @@
         <w:t xml:space="preserve"> </w:t>
       </w:r>
       <w:r>
-        <w:t xml:space="preserve">(</w:t>
-      </w:r>
-      <w:r>
-        <w:rPr>
-          <w:b/>
-          <w:bCs/>
-        </w:rPr>
-        <w:t xml:space="preserve">R-performance?</w:t>
-      </w:r>
-      <w:r>
-        <w:t xml:space="preserve">)</w:t>
+        <w:t xml:space="preserve">(Lüdecke, Ben-Shachar, et al. 2021)</w:t>
       </w:r>
       <w:r>
         <w:t xml:space="preserve">,</w:t>
@@ -1014,17 +1067,7 @@
         <w:t xml:space="preserve"> </w:t>
       </w:r>
       <w:r>
-        <w:t xml:space="preserve">(</w:t>
-      </w:r>
-      <w:r>
-        <w:rPr>
-          <w:b/>
-          <w:bCs/>
-        </w:rPr>
-        <w:t xml:space="preserve">R-see?</w:t>
-      </w:r>
-      <w:r>
-        <w:t xml:space="preserve">)</w:t>
+        <w:t xml:space="preserve">(Lüdecke, Patil, et al. 2021)</w:t>
       </w:r>
       <w:r>
         <w:t xml:space="preserve"> </w:t>
@@ -1046,17 +1089,7 @@
         <w:t xml:space="preserve"> </w:t>
       </w:r>
       <w:r>
-        <w:t xml:space="preserve">(</w:t>
-      </w:r>
-      <w:r>
-        <w:rPr>
-          <w:b/>
-          <w:bCs/>
-        </w:rPr>
-        <w:t xml:space="preserve">R-broom?</w:t>
-      </w:r>
-      <w:r>
-        <w:t xml:space="preserve">)</w:t>
+        <w:t xml:space="preserve">(Robinson 2014)</w:t>
       </w:r>
       <w:r>
         <w:t xml:space="preserve">. The R version and package versions used in the analysis were recorded using</w:t>
@@ -5084,7 +5117,16 @@
         <w:pStyle w:val="FirstParagraph"/>
       </w:pPr>
       <w:r>
-        <w:t xml:space="preserve">The three male morphs formed a consistent gradient in size-adjusted leg length, with tenth-instar males possessing the longest fore-, mid- and hindlegs and eighth-instar males the shortest. Ninth-instar males were generally intermediate and statistically indistinguishable from the midpoint between the two other male morphs. This morphological intermediacy is consistent with their proposed jack-of-all-trades strategy, in which males can either fight for galleries or circumvent larger competitors depending on the social context (Wilson &amp; Kelly 2019; Kelly 2025). It does not, however, indicate that ninth-instar morphology is specifically adapted for behavioural flexibility. An intermediate phenotype could also arise directly from maturation at an intermediate instar. Functional tests are therefore needed to establish whether the morphological position of ninth-instar males enhances their ability to alternate between fighting and searching tactics.</w:t>
+        <w:t xml:space="preserve">The three male morphs formed a consistent gradient in size-adjusted leg length, with tenth-instar males possessing the longest fore-, mid- and hindlegs and eighth-instar males the shortest. Ninth-instar males were generally intermediate and statistically indistinguishable from the midpoint between the two other male morphs. This morphological intermediacy is consistent with their proposed jack-of-all-trades strategy, in which males can either fight for galleries or circumvent larger competitors depending on the social context</w:t>
+      </w:r>
+      <w:r>
+        <w:t xml:space="preserve"> </w:t>
+      </w:r>
+      <w:r>
+        <w:t xml:space="preserve">(Wilson and Kelly 2019; Kelly 2025)</w:t>
+      </w:r>
+      <w:r>
+        <w:t xml:space="preserve">. It does not, however, indicate that ninth-instar morphology is specifically adapted for behavioural flexibility. An intermediate phenotype could also arise directly from maturation at an intermediate instar. Functional tests are therefore needed to establish whether the morphological position of ninth-instar males enhances their ability to alternate between fighting and searching tactics.</w:t>
       </w:r>
     </w:p>
     <w:p>
@@ -5092,7 +5134,16 @@
         <w:pStyle w:val="BodyText"/>
       </w:pPr>
       <w:r>
-        <w:t xml:space="preserve">Comparisons with females revealed a pattern that was not apparent from comparisons among male morphs alone. All male groups had relatively longer forelegs than females, whereas male–female differences in hindleg length varied from negative in eighth-instar males to positive in tenth-instar males. Consequently, tenth-instar males displayed a pronounced anterior shift in leg allocation relative to females. The anterior legs may contribute to stabilizing the body, maintaining purchase on the substrate or manoeuvring during encounters involving the head and mandibles. Such functions would make disproportionate anterior investment particularly valuable to heavily armed, gallery-defending males. Similar reasoning has been applied to the association between horns and foreleg morphology in dung and rhinoceros beetles, where the legs can provide leverage or support during contests (Tomkins et al. 2005; McCullough &amp; Emlen 2013). Nevertheless, the present data describe morphology rather than mechanical performance, and the proposed role of anterior legs in combat remains to be tested directly.</w:t>
+        <w:t xml:space="preserve">Comparisons with females revealed a pattern that was not apparent from comparisons among male morphs alone. All male groups had relatively longer forelegs than females, whereas male–female differences in hindleg length varied from negative in eighth-instar males to positive in tenth-instar males. Consequently, tenth-instar males displayed a pronounced anterior shift in leg allocation relative to females. The anterior legs may contribute to stabilizing the body, maintaining purchase on the substrate or manoeuvring during encounters involving the head and mandibles. Such functions would make disproportionate anterior investment particularly valuable to heavily armed, gallery-defending males. Similar reasoning has been applied to the association between horns and foreleg morphology in dung and rhinoceros beetles, where the legs can provide leverage or support during contests</w:t>
+      </w:r>
+      <w:r>
+        <w:t xml:space="preserve"> </w:t>
+      </w:r>
+      <w:r>
+        <w:t xml:space="preserve">(Tomkins, Kotiaho, and Lebas 2005; McCullough and Emlen 2013)</w:t>
+      </w:r>
+      <w:r>
+        <w:t xml:space="preserve">. Nevertheless, the present data describe morphology rather than mechanical performance, and the proposed role of anterior legs in combat remains to be tested directly.</w:t>
       </w:r>
     </w:p>
     <w:p>
@@ -5108,7 +5159,16 @@
         <w:pStyle w:val="BodyText"/>
       </w:pPr>
       <w:r>
-        <w:t xml:space="preserve">All leg traits scaled hypoallometrically with pronotum length, meaning that larger individuals within each group possessed proportionally shorter legs. Tenth-instar males generally had the shallowest estimated slopes, although support for specific slope differences was limited primarily to the hindleg comparison between females and tenth-instar males. Thus, the leg differences among groups were driven more consistently by changes in trait elevation at a common body size than by wholesale reprogramming of allometric slopes. This contrasts with weapon allometry in the same population, which differs substantially among male morphs, with eighth-instar weapons scaling more steeply than those of ninth- and tenth-instar males (Kelly 2025). Locomotory and weapon morphology therefore need not share the same morph-specific scaling rules, further supporting a modular or mosaic interpretation of morphological divergence.</w:t>
+        <w:t xml:space="preserve">All leg traits scaled hypoallometrically with pronotum length, meaning that larger individuals within each group possessed proportionally shorter legs. Tenth-instar males generally had the shallowest estimated slopes, although support for specific slope differences was limited primarily to the hindleg comparison between females and tenth-instar males. Thus, the leg differences among groups were driven more consistently by changes in trait elevation at a common body size than by wholesale reprogramming of allometric slopes. This contrasts with weapon allometry in the same population, which differs substantially among male morphs, with eighth-instar weapons scaling more steeply than those of ninth- and tenth-instar males</w:t>
+      </w:r>
+      <w:r>
+        <w:t xml:space="preserve"> </w:t>
+      </w:r>
+      <w:r>
+        <w:t xml:space="preserve">(Kelly 2026)</w:t>
+      </w:r>
+      <w:r>
+        <w:t xml:space="preserve">. Locomotory and weapon morphology therefore need not share the same morph-specific scaling rules, further supporting a modular or mosaic interpretation of morphological divergence.</w:t>
       </w:r>
     </w:p>
     <w:bookmarkEnd w:id="47"/>
@@ -5126,7 +5186,16 @@
         <w:pStyle w:val="FirstParagraph"/>
       </w:pPr>
       <w:r>
-        <w:t xml:space="preserve">Within groups, individuals possessing relatively larger heads generally also possessed relatively longer legs. Eleven of the 12 group-by-leg slopes were clearly positive, and none was negative. These results provide no evidence for the hypothesis that greater investment in weaponry is realized at the expense of locomotory appendages. Instead, they are consistent with positive phenotypic integration between weapons and structures that may support their use. This pattern resembles secondary sexual trait compensation, in which enlargement of a sexual trait is accompanied by enlargement of structures that bear, manoeuvre or otherwise improve the performance of that trait (Tomkins et al. 2005; Husak &amp; Swallow 2011).</w:t>
+        <w:t xml:space="preserve">Within groups, individuals possessing relatively larger heads generally also possessed relatively longer legs. Eleven of the 12 group-by-leg slopes were clearly positive, and none was negative. These results provide no evidence for the hypothesis that greater investment in weaponry is realized at the expense of locomotory appendages. Instead, they are consistent with positive phenotypic integration between weapons and structures that may support their use. This pattern resembles secondary sexual trait compensation, in which enlargement of a sexual trait is accompanied by enlargement of structures that bear, manoeuvre or otherwise improve the performance of that trait</w:t>
+      </w:r>
+      <w:r>
+        <w:t xml:space="preserve"> </w:t>
+      </w:r>
+      <w:r>
+        <w:t xml:space="preserve">(Tomkins, Kotiaho, and Lebas 2005; Husak and Swallow 2011)</w:t>
+      </w:r>
+      <w:r>
+        <w:t xml:space="preserve">.</w:t>
       </w:r>
     </w:p>
     <w:p>
@@ -5134,7 +5203,19 @@
         <w:pStyle w:val="BodyText"/>
       </w:pPr>
       <w:r>
-        <w:t xml:space="preserve">The present results also resemble those reported for the European earwig, another hemimetabolous insect in which male morphs differ in weapon size. Tomkins et al. (2005) found positive integration between forceps length and hind-femur length in exaggerated macrolabic males, but no evidence that forceps enlargement traded off against the other measured traits. They proposed that morphological trade-offs may be less readily expressed in hemimetabolous insects than in holometabolous taxa because growth is not confined to a closed pupal developmental system. Wellington tree wētā likewise acquire resources and grow through successive nymphal instars, and the uniformly non-negative weapon–leg relationships are consistent with that proposal. This comparison remains tentative, however, because the absence of a negative phenotypic correlation does not demonstrate the absence of an underlying allocation cost. Variation among individuals in resource acquisition can produce positive covariance among costly traits even when those traits compete for resources during development.</w:t>
+        <w:t xml:space="preserve">The present results also resemble those reported for the European earwig, another hemimetabolous insect in which male morphs differ in weapon size.</w:t>
+      </w:r>
+      <w:r>
+        <w:t xml:space="preserve"> </w:t>
+      </w:r>
+      <w:r>
+        <w:t xml:space="preserve">Tomkins, Kotiaho, and Lebas (2005)</w:t>
+      </w:r>
+      <w:r>
+        <w:t xml:space="preserve"> </w:t>
+      </w:r>
+      <w:r>
+        <w:t xml:space="preserve">found positive integration between forceps length and hind-femur length in exaggerated macrolabic males, but no evidence that forceps enlargement traded off against the other measured traits. They proposed that morphological trade-offs may be less readily expressed in hemimetabolous insects than in holometabolous taxa because growth is not confined to a closed pupal developmental system. Wellington tree wētā likewise acquire resources and grow through successive nymphal instars, and the uniformly non-negative weapon–leg relationships are consistent with that proposal. This comparison remains tentative, however, because the absence of a negative phenotypic correlation does not demonstrate the absence of an underlying allocation cost. Variation among individuals in resource acquisition can produce positive covariance among costly traits even when those traits compete for resources during development.</w:t>
       </w:r>
     </w:p>
     <w:p>
@@ -5173,7 +5254,16 @@
         <w:t xml:space="preserve">Centris pallida</w:t>
       </w:r>
       <w:r>
-        <w:t xml:space="preserve">, in which small searching males rely more strongly on visual detection and possess relatively larger eyes than large males (Barrett et al. 2021; Barrett &amp; O’Donnell 2026). Sensory investment therefore cannot be predicted simply from whether a morph searches actively or defends access to females.</w:t>
+        <w:t xml:space="preserve">, in which small searching males rely more strongly on visual detection and possess relatively larger eyes than large males</w:t>
+      </w:r>
+      <w:r>
+        <w:t xml:space="preserve"> </w:t>
+      </w:r>
+      <w:r>
+        <w:t xml:space="preserve">(Meghan Barrett et al. 2021; M. Barrett and O’Donnell 2026)</w:t>
+      </w:r>
+      <w:r>
+        <w:t xml:space="preserve">. Sensory investment therefore cannot be predicted simply from whether a morph searches actively or defends access to females.</w:t>
       </w:r>
     </w:p>
     <w:p>
@@ -5181,7 +5271,16 @@
         <w:pStyle w:val="BodyText"/>
       </w:pPr>
       <w:r>
-        <w:t xml:space="preserve">The greater sensory dimensions of tenth-instar males could reflect demands associated with gallery defence, rival assessment or navigation between refuges and mating opportunities. Alternatively, sensory enlargement may form part of a broader developmental programme associated with delayed maturation and increased weapon expression, without having evolved specifically for the tenth-instar mating strategy. The common sensory allometric slopes favour the latter possibility in at least one respect. Morph differences in eye and ear size reflected shifts in elevation rather than differences in how sensory dimensions increased with body size. Thus, each group followed approximately the same scaling relationship but at a different relative level of sensory expression. Similar elevation shifts can generate substantial sexual or morph-specific exaggeration without the evolution of steeper allometric slopes, as recently demonstrated for elongated sensory antennae in crane flies (Hirani &amp; Bonduriansky 2026).</w:t>
+        <w:t xml:space="preserve">The greater sensory dimensions of tenth-instar males could reflect demands associated with gallery defence, rival assessment or navigation between refuges and mating opportunities. Alternatively, sensory enlargement may form part of a broader developmental programme associated with delayed maturation and increased weapon expression, without having evolved specifically for the tenth-instar mating strategy. The common sensory allometric slopes favour the latter possibility in at least one respect. Morph differences in eye and ear size reflected shifts in elevation rather than differences in how sensory dimensions increased with body size. Thus, each group followed approximately the same scaling relationship but at a different relative level of sensory expression. Similar elevation shifts can generate substantial sexual or morph-specific exaggeration without the evolution of steeper allometric slopes, as recently demonstrated for elongated sensory antennae in crane flies</w:t>
+      </w:r>
+      <w:r>
+        <w:t xml:space="preserve"> </w:t>
+      </w:r>
+      <w:r>
+        <w:t xml:space="preserve">(Hirani and Bonduriansky 2026)</w:t>
+      </w:r>
+      <w:r>
+        <w:t xml:space="preserve">.</w:t>
       </w:r>
     </w:p>
     <w:p>
@@ -5223,7 +5322,16 @@
         <w:pStyle w:val="BodyText"/>
       </w:pPr>
       <w:r>
-        <w:t xml:space="preserve">This distinction between among-group divergence and within-group covariance is central to interpreting integrated phenotypes. Traits can differ in parallel among morph means without being tightly integrated among individuals within each morph. Conversely, traits can covary strongly within groups even when the magnitude of that covariance does not differ among strategies. Recent work on an exaggerated male sensory trait likewise found that substantial sexual divergence can be accompanied by developmental decoupling from the rest of the phenotype (Hirani &amp; Bonduriansky 2026). Such decoupling may facilitate independent evolutionary change by reducing the extent to which enlargement of one structure alters others. In Wellington tree wētā, sensory traits appear to retain strong coupling with their immediate anatomical substrates while being more weakly connected to variation in weapon investment. Morphological integration is therefore hierarchical: strong locally, positive between weapons and legs, but comparatively weak between weapons and ears within male morphs.</w:t>
+        <w:t xml:space="preserve">This distinction between among-group divergence and within-group covariance is central to interpreting integrated phenotypes. Traits can differ in parallel among morph means without being tightly integrated among individuals within each morph. Conversely, traits can covary strongly within groups even when the magnitude of that covariance does not differ among strategies. Recent work on an exaggerated male sensory trait likewise found that substantial sexual divergence can be accompanied by developmental decoupling from the rest of the phenotype</w:t>
+      </w:r>
+      <w:r>
+        <w:t xml:space="preserve"> </w:t>
+      </w:r>
+      <w:r>
+        <w:t xml:space="preserve">(Hirani and Bonduriansky 2026)</w:t>
+      </w:r>
+      <w:r>
+        <w:t xml:space="preserve">. Such decoupling may facilitate independent evolutionary change by reducing the extent to which enlargement of one structure alters others. In Wellington tree wētā, sensory traits appear to retain strong coupling with their immediate anatomical substrates while being more weakly connected to variation in weapon investment. Morphological integration is therefore hierarchical: strong locally, positive between weapons and legs, but comparatively weak between weapons and ears within male morphs.</w:t>
       </w:r>
     </w:p>
     <w:bookmarkEnd w:id="50"/>
@@ -5267,7 +5375,16 @@
         <w:pStyle w:val="FirstParagraph"/>
       </w:pPr>
       <w:r>
-        <w:t xml:space="preserve">The genetically polymorphic expression of the three male strategies strengthens the interpretation of among-morph differences. In many insects with alternative male phenotypes, morph identity depends on nutritional condition, making it difficult to distinguish trait specialization from broad differences in resource acquisition. Wellington tree wētā males raised under common conditions nevertheless mature at different instars and express the corresponding weapon morphologies, indicating that morph identity is not simply induced by poor or favourable nutrition (Kelly 2024). The leg and sensory differences observed here are therefore less readily explained as incidental consequences of condition-dependent morph determination.</w:t>
+        <w:t xml:space="preserve">The genetically polymorphic expression of the three male strategies strengthens the interpretation of among-morph differences. In many insects with alternative male phenotypes, morph identity depends on nutritional condition, making it difficult to distinguish trait specialization from broad differences in resource acquisition. Wellington tree wētā males raised under common conditions nevertheless mature at different instars and express the corresponding weapon morphologies, indicating that morph identity is not simply induced by poor or favourable nutrition</w:t>
+      </w:r>
+      <w:r>
+        <w:t xml:space="preserve"> </w:t>
+      </w:r>
+      <w:r>
+        <w:t xml:space="preserve">(Kelly 2024)</w:t>
+      </w:r>
+      <w:r>
+        <w:t xml:space="preserve">. The leg and sensory differences observed here are therefore less readily explained as incidental consequences of condition-dependent morph determination.</w:t>
       </w:r>
     </w:p>
     <w:p>
@@ -5455,7 +5572,7 @@
       </w:r>
     </w:p>
     <w:bookmarkEnd w:id="62"/>
-    <w:bookmarkStart w:id="64" w:name="references"/>
+    <w:bookmarkStart w:id="130" w:name="references"/>
     <w:p>
       <w:pPr>
         <w:pStyle w:val="Heading1"/>
@@ -5464,15 +5581,2031 @@
         <w:t xml:space="preserve">References</w:t>
       </w:r>
     </w:p>
-    <w:bookmarkStart w:id="63" w:name="refs"/>
-    <w:bookmarkEnd w:id="63"/>
+    <w:bookmarkStart w:id="129" w:name="refs"/>
+    <w:bookmarkStart w:id="64" w:name="ref-barrett2021"/>
     <w:p>
-      <w:r>
-        <w:br w:type="page"/>
+      <w:pPr>
+        <w:pStyle w:val="Bibliography"/>
+      </w:pPr>
+      <w:r>
+        <w:t xml:space="preserve">Barrett, Meghan, Sophi Schneider, Purnima Sachdeva, Angelina Gomez, Stephen Buchmann, and Sean O’Donnell. 2021.</w:t>
+      </w:r>
+      <w:r>
+        <w:t xml:space="preserve"> </w:t>
+      </w:r>
+      <w:r>
+        <w:t xml:space="preserve">“Neuroanatomical Differentiation Associated with Alternative Reproductive Tactics in</w:t>
+      </w:r>
+      <w:r>
+        <w:t xml:space="preserve"> </w:t>
+      </w:r>
+      <w:r>
+        <w:t xml:space="preserve">Male</w:t>
+      </w:r>
+      <w:r>
+        <w:t xml:space="preserve"> </w:t>
+      </w:r>
+      <w:r>
+        <w:t xml:space="preserve">Arid Land Bees,</w:t>
+      </w:r>
+      <w:r>
+        <w:t xml:space="preserve"> </w:t>
+      </w:r>
+      <w:r>
+        <w:rPr>
+          <w:i/>
+          <w:iCs/>
+        </w:rPr>
+        <w:t xml:space="preserve">Centris</w:t>
+      </w:r>
+      <w:r>
+        <w:t xml:space="preserve"> </w:t>
+      </w:r>
+      <w:r>
+        <w:rPr>
+          <w:i/>
+          <w:iCs/>
+        </w:rPr>
+        <w:t xml:space="preserve">Pallida</w:t>
+      </w:r>
+      <w:r>
+        <w:t xml:space="preserve"> </w:t>
+      </w:r>
+      <w:r>
+        <w:t xml:space="preserve">and</w:t>
+      </w:r>
+      <w:r>
+        <w:t xml:space="preserve"> </w:t>
+      </w:r>
+      <w:r>
+        <w:rPr>
+          <w:i/>
+          <w:iCs/>
+        </w:rPr>
+        <w:t xml:space="preserve">Amegilla</w:t>
+      </w:r>
+      <w:r>
+        <w:t xml:space="preserve"> </w:t>
+      </w:r>
+      <w:r>
+        <w:rPr>
+          <w:i/>
+          <w:iCs/>
+        </w:rPr>
+        <w:t xml:space="preserve">Dawsoni</w:t>
+      </w:r>
+      <w:r>
+        <w:t xml:space="preserve">.”</w:t>
+      </w:r>
+      <w:r>
+        <w:t xml:space="preserve"> </w:t>
+      </w:r>
+      <w:r>
+        <w:rPr>
+          <w:i/>
+          <w:iCs/>
+        </w:rPr>
+        <w:t xml:space="preserve">J. Comp. Physiol. A</w:t>
+      </w:r>
+      <w:r>
+        <w:t xml:space="preserve"> </w:t>
+      </w:r>
+      <w:r>
+        <w:t xml:space="preserve">207 (4): 497–504.</w:t>
+      </w:r>
+      <w:r>
+        <w:t xml:space="preserve"> </w:t>
+      </w:r>
+      <w:hyperlink r:id="rId63">
+        <w:r>
+          <w:rPr>
+            <w:rStyle w:val="Hyperlink"/>
+          </w:rPr>
+          <w:t xml:space="preserve">https://doi.org/10.1007/s00359-021-01492-4</w:t>
+        </w:r>
+      </w:hyperlink>
+      <w:r>
+        <w:t xml:space="preserve">.</w:t>
       </w:r>
     </w:p>
     <w:bookmarkEnd w:id="64"/>
-    <w:bookmarkStart w:id="72" w:name="tables"/>
+    <w:bookmarkStart w:id="66" w:name="ref-barrett2026"/>
+    <w:p>
+      <w:pPr>
+        <w:pStyle w:val="Bibliography"/>
+      </w:pPr>
+      <w:r>
+        <w:t xml:space="preserve">Barrett, M, and S O’Donnell. 2026.</w:t>
+      </w:r>
+      <w:r>
+        <w:t xml:space="preserve"> </w:t>
+      </w:r>
+      <w:r>
+        <w:t xml:space="preserve">“Sex, Head Size, and</w:t>
+      </w:r>
+      <w:r>
+        <w:t xml:space="preserve"> </w:t>
+      </w:r>
+      <w:r>
+        <w:t xml:space="preserve">Male</w:t>
+      </w:r>
+      <w:r>
+        <w:t xml:space="preserve"> </w:t>
+      </w:r>
+      <w:r>
+        <w:t xml:space="preserve">Mate Location Behavior Affect Allometric Scaling of the Eyes in</w:t>
+      </w:r>
+      <w:r>
+        <w:t xml:space="preserve"> </w:t>
+      </w:r>
+      <w:r>
+        <w:rPr>
+          <w:i/>
+          <w:iCs/>
+        </w:rPr>
+        <w:t xml:space="preserve">Centris</w:t>
+      </w:r>
+      <w:r>
+        <w:t xml:space="preserve"> </w:t>
+      </w:r>
+      <w:r>
+        <w:rPr>
+          <w:i/>
+          <w:iCs/>
+        </w:rPr>
+        <w:t xml:space="preserve">Pallida</w:t>
+      </w:r>
+      <w:r>
+        <w:t xml:space="preserve"> </w:t>
+      </w:r>
+      <w:r>
+        <w:t xml:space="preserve">(Hymenoptera: Apidae) Bees.”</w:t>
+      </w:r>
+      <w:r>
+        <w:t xml:space="preserve"> </w:t>
+      </w:r>
+      <w:r>
+        <w:rPr>
+          <w:i/>
+          <w:iCs/>
+        </w:rPr>
+        <w:t xml:space="preserve">Integr. Org. Biol.</w:t>
+      </w:r>
+      <w:r>
+        <w:t xml:space="preserve"> </w:t>
+      </w:r>
+      <w:r>
+        <w:t xml:space="preserve">8 (1): obag016.</w:t>
+      </w:r>
+      <w:r>
+        <w:t xml:space="preserve"> </w:t>
+      </w:r>
+      <w:hyperlink r:id="rId65">
+        <w:r>
+          <w:rPr>
+            <w:rStyle w:val="Hyperlink"/>
+          </w:rPr>
+          <w:t xml:space="preserve">https://doi.org/10.1093/iob/obag016</w:t>
+        </w:r>
+      </w:hyperlink>
+      <w:r>
+        <w:t xml:space="preserve">.</w:t>
+      </w:r>
+    </w:p>
+    <w:bookmarkEnd w:id="66"/>
+    <w:bookmarkStart w:id="68" w:name="ref-bates2015"/>
+    <w:p>
+      <w:pPr>
+        <w:pStyle w:val="Bibliography"/>
+      </w:pPr>
+      <w:r>
+        <w:t xml:space="preserve">Bates, Douglas, Martin Mächler, Ben Bolker, and Steve Walker. 2015.</w:t>
+      </w:r>
+      <w:r>
+        <w:t xml:space="preserve"> </w:t>
+      </w:r>
+      <w:r>
+        <w:t xml:space="preserve">“Fitting Linear Mixed-Effects Models Using Lme4.”</w:t>
+      </w:r>
+      <w:r>
+        <w:t xml:space="preserve"> </w:t>
+      </w:r>
+      <w:r>
+        <w:rPr>
+          <w:i/>
+          <w:iCs/>
+        </w:rPr>
+        <w:t xml:space="preserve">J. Stat. Softw.</w:t>
+      </w:r>
+      <w:r>
+        <w:t xml:space="preserve"> </w:t>
+      </w:r>
+      <w:r>
+        <w:t xml:space="preserve">67 (1): 1–48.</w:t>
+      </w:r>
+      <w:r>
+        <w:t xml:space="preserve"> </w:t>
+      </w:r>
+      <w:hyperlink r:id="rId67">
+        <w:r>
+          <w:rPr>
+            <w:rStyle w:val="Hyperlink"/>
+          </w:rPr>
+          <w:t xml:space="preserve">https://doi.org/10.18637/jss.v067.i01</w:t>
+        </w:r>
+      </w:hyperlink>
+      <w:r>
+        <w:t xml:space="preserve">.</w:t>
+      </w:r>
+    </w:p>
+    <w:bookmarkEnd w:id="68"/>
+    <w:bookmarkStart w:id="69" w:name="ref-bonduriansky2003"/>
+    <w:p>
+      <w:pPr>
+        <w:pStyle w:val="Bibliography"/>
+      </w:pPr>
+      <w:r>
+        <w:t xml:space="preserve">Bonduriansky, R., and Troy Day. 2003.</w:t>
+      </w:r>
+      <w:r>
+        <w:t xml:space="preserve"> </w:t>
+      </w:r>
+      <w:r>
+        <w:t xml:space="preserve">“The Evolution of Static Allometry in Sexually Selected Traits.”</w:t>
+      </w:r>
+      <w:r>
+        <w:t xml:space="preserve"> </w:t>
+      </w:r>
+      <w:r>
+        <w:rPr>
+          <w:i/>
+          <w:iCs/>
+        </w:rPr>
+        <w:t xml:space="preserve">Evolution</w:t>
+      </w:r>
+      <w:r>
+        <w:t xml:space="preserve"> </w:t>
+      </w:r>
+      <w:r>
+        <w:t xml:space="preserve">57 (11): 2450–58.</w:t>
+      </w:r>
+    </w:p>
+    <w:bookmarkEnd w:id="69"/>
+    <w:bookmarkStart w:id="71" w:name="ref-emlen2001a"/>
+    <w:p>
+      <w:pPr>
+        <w:pStyle w:val="Bibliography"/>
+      </w:pPr>
+      <w:r>
+        <w:t xml:space="preserve">Emlen, D. J. 2001.</w:t>
+      </w:r>
+      <w:r>
+        <w:t xml:space="preserve"> </w:t>
+      </w:r>
+      <w:r>
+        <w:t xml:space="preserve">“Costs and the Diversification of Exaggerated Animal Structures.”</w:t>
+      </w:r>
+      <w:r>
+        <w:t xml:space="preserve"> </w:t>
+      </w:r>
+      <w:r>
+        <w:rPr>
+          <w:i/>
+          <w:iCs/>
+        </w:rPr>
+        <w:t xml:space="preserve">Science</w:t>
+      </w:r>
+      <w:r>
+        <w:t xml:space="preserve"> </w:t>
+      </w:r>
+      <w:r>
+        <w:t xml:space="preserve">291 (5508): 1534–36.</w:t>
+      </w:r>
+      <w:r>
+        <w:t xml:space="preserve"> </w:t>
+      </w:r>
+      <w:hyperlink r:id="rId70">
+        <w:r>
+          <w:rPr>
+            <w:rStyle w:val="Hyperlink"/>
+          </w:rPr>
+          <w:t xml:space="preserve">https://doi.org/10.1126/science.1056607</w:t>
+        </w:r>
+      </w:hyperlink>
+      <w:r>
+        <w:t xml:space="preserve">.</w:t>
+      </w:r>
+    </w:p>
+    <w:bookmarkEnd w:id="71"/>
+    <w:bookmarkStart w:id="73" w:name="ref-gross1996"/>
+    <w:p>
+      <w:pPr>
+        <w:pStyle w:val="Bibliography"/>
+      </w:pPr>
+      <w:r>
+        <w:t xml:space="preserve">Gross, M. R. 1996.</w:t>
+      </w:r>
+      <w:r>
+        <w:t xml:space="preserve"> </w:t>
+      </w:r>
+      <w:r>
+        <w:t xml:space="preserve">“Alternative Reproductive Strategies and Tactics: Diversity Within Sexes.”</w:t>
+      </w:r>
+      <w:r>
+        <w:t xml:space="preserve"> </w:t>
+      </w:r>
+      <w:r>
+        <w:rPr>
+          <w:i/>
+          <w:iCs/>
+        </w:rPr>
+        <w:t xml:space="preserve">Trends Ecol Evol</w:t>
+      </w:r>
+      <w:r>
+        <w:t xml:space="preserve"> </w:t>
+      </w:r>
+      <w:r>
+        <w:t xml:space="preserve">11 (2): 92–98.</w:t>
+      </w:r>
+      <w:r>
+        <w:t xml:space="preserve"> </w:t>
+      </w:r>
+      <w:hyperlink r:id="rId72">
+        <w:r>
+          <w:rPr>
+            <w:rStyle w:val="Hyperlink"/>
+          </w:rPr>
+          <w:t xml:space="preserve">https://doi.org/10.1016/0169-5347(96)81050-0</w:t>
+        </w:r>
+      </w:hyperlink>
+      <w:r>
+        <w:t xml:space="preserve">.</w:t>
+      </w:r>
+    </w:p>
+    <w:bookmarkEnd w:id="73"/>
+    <w:bookmarkStart w:id="75" w:name="ref-halekoh2014"/>
+    <w:p>
+      <w:pPr>
+        <w:pStyle w:val="Bibliography"/>
+      </w:pPr>
+      <w:r>
+        <w:t xml:space="preserve">Halekoh, Ulrich, and Søren Højsgaard. 2014.</w:t>
+      </w:r>
+      <w:r>
+        <w:t xml:space="preserve"> </w:t>
+      </w:r>
+      <w:r>
+        <w:t xml:space="preserve">“A</w:t>
+      </w:r>
+      <w:r>
+        <w:t xml:space="preserve"> </w:t>
+      </w:r>
+      <w:r>
+        <w:t xml:space="preserve">Enward-</w:t>
+      </w:r>
+      <w:r>
+        <w:t xml:space="preserve">Oger Approximation and Parametric Bootstrap Methods for Tests in Linear Mixed Models – the</w:t>
+      </w:r>
+      <w:r>
+        <w:t xml:space="preserve"> </w:t>
+      </w:r>
+      <w:r>
+        <w:t xml:space="preserve"> </w:t>
+      </w:r>
+      <w:r>
+        <w:t xml:space="preserve">Package Pbkrtest.”</w:t>
+      </w:r>
+      <w:r>
+        <w:t xml:space="preserve"> </w:t>
+      </w:r>
+      <w:r>
+        <w:rPr>
+          <w:i/>
+          <w:iCs/>
+        </w:rPr>
+        <w:t xml:space="preserve">J. Stat. Softw.</w:t>
+      </w:r>
+      <w:r>
+        <w:t xml:space="preserve"> </w:t>
+      </w:r>
+      <w:r>
+        <w:t xml:space="preserve">59: 1–32.</w:t>
+      </w:r>
+      <w:r>
+        <w:t xml:space="preserve"> </w:t>
+      </w:r>
+      <w:hyperlink r:id="rId74">
+        <w:r>
+          <w:rPr>
+            <w:rStyle w:val="Hyperlink"/>
+          </w:rPr>
+          <w:t xml:space="preserve">https://doi.org/10.18637/jss.v059.i09</w:t>
+        </w:r>
+      </w:hyperlink>
+      <w:r>
+        <w:t xml:space="preserve">.</w:t>
+      </w:r>
+    </w:p>
+    <w:bookmarkEnd w:id="75"/>
+    <w:bookmarkStart w:id="77" w:name="ref-hirani2026"/>
+    <w:p>
+      <w:pPr>
+        <w:pStyle w:val="Bibliography"/>
+      </w:pPr>
+      <w:r>
+        <w:t xml:space="preserve">Hirani, Shay, and Russell Bonduriansky. 2026.</w:t>
+      </w:r>
+      <w:r>
+        <w:t xml:space="preserve"> </w:t>
+      </w:r>
+      <w:r>
+        <w:t xml:space="preserve">“Scaling and Developmental Integration of a Secondary Sexual Sensory Trait.”</w:t>
+      </w:r>
+      <w:r>
+        <w:t xml:space="preserve"> </w:t>
+      </w:r>
+      <w:r>
+        <w:rPr>
+          <w:i/>
+          <w:iCs/>
+        </w:rPr>
+        <w:t xml:space="preserve">Evol. Ecol.</w:t>
+      </w:r>
+      <w:r>
+        <w:t xml:space="preserve"> </w:t>
+      </w:r>
+      <w:r>
+        <w:t xml:space="preserve">40 (1): 8–25.</w:t>
+      </w:r>
+      <w:r>
+        <w:t xml:space="preserve"> </w:t>
+      </w:r>
+      <w:hyperlink r:id="rId76">
+        <w:r>
+          <w:rPr>
+            <w:rStyle w:val="Hyperlink"/>
+          </w:rPr>
+          <w:t xml:space="preserve">https://doi.org/10.1007/s10682-025-10369-w</w:t>
+        </w:r>
+      </w:hyperlink>
+      <w:r>
+        <w:t xml:space="preserve">.</w:t>
+      </w:r>
+    </w:p>
+    <w:bookmarkEnd w:id="77"/>
+    <w:bookmarkStart w:id="79" w:name="ref-husak2011"/>
+    <w:p>
+      <w:pPr>
+        <w:pStyle w:val="Bibliography"/>
+      </w:pPr>
+      <w:r>
+        <w:t xml:space="preserve">Husak, Jerry F., and John G. Swallow. 2011.</w:t>
+      </w:r>
+      <w:r>
+        <w:t xml:space="preserve"> </w:t>
+      </w:r>
+      <w:r>
+        <w:t xml:space="preserve">“Compensatory Traits and the Evolution of Male Ornaments.”</w:t>
+      </w:r>
+      <w:r>
+        <w:t xml:space="preserve"> </w:t>
+      </w:r>
+      <w:r>
+        <w:rPr>
+          <w:i/>
+          <w:iCs/>
+        </w:rPr>
+        <w:t xml:space="preserve">Behaviour</w:t>
+      </w:r>
+      <w:r>
+        <w:t xml:space="preserve"> </w:t>
+      </w:r>
+      <w:r>
+        <w:t xml:space="preserve">148 (1): 1–29.</w:t>
+      </w:r>
+      <w:r>
+        <w:t xml:space="preserve"> </w:t>
+      </w:r>
+      <w:hyperlink r:id="rId78">
+        <w:r>
+          <w:rPr>
+            <w:rStyle w:val="Hyperlink"/>
+          </w:rPr>
+          <w:t xml:space="preserve">https://www.jstor.org/stable/25799795</w:t>
+        </w:r>
+      </w:hyperlink>
+      <w:r>
+        <w:t xml:space="preserve">.</w:t>
+      </w:r>
+    </w:p>
+    <w:bookmarkEnd w:id="79"/>
+    <w:bookmarkStart w:id="81" w:name="ref-ito2017"/>
+    <w:p>
+      <w:pPr>
+        <w:pStyle w:val="Bibliography"/>
+      </w:pPr>
+      <w:r>
+        <w:t xml:space="preserve">Ito, J., Y. Ohkubo, and E. Hasegawa. 2017.</w:t>
+      </w:r>
+      <w:r>
+        <w:t xml:space="preserve"> </w:t>
+      </w:r>
+      <w:r>
+        <w:t xml:space="preserve">“Morph-</w:t>
+      </w:r>
+      <w:r>
+        <w:t xml:space="preserve">Specific Weapon-Correlated Traits</w:t>
+      </w:r>
+      <w:r>
+        <w:t xml:space="preserve"> </w:t>
+      </w:r>
+      <w:r>
+        <w:t xml:space="preserve">in a</w:t>
+      </w:r>
+      <w:r>
+        <w:t xml:space="preserve"> </w:t>
+      </w:r>
+      <w:r>
+        <w:t xml:space="preserve">Male Dimorphic Stag Beetle Prosopocoilus</w:t>
+      </w:r>
+      <w:r>
+        <w:t xml:space="preserve"> </w:t>
+      </w:r>
+      <w:r>
+        <w:t xml:space="preserve">Inclinatus, (</w:t>
+      </w:r>
+      <w:r>
+        <w:t xml:space="preserve">Coleoptera</w:t>
+      </w:r>
+      <w:r>
+        <w:t xml:space="preserve">:</w:t>
+      </w:r>
+      <w:r>
+        <w:t xml:space="preserve"> </w:t>
+      </w:r>
+      <w:r>
+        <w:t xml:space="preserve">Lucanidae</w:t>
+      </w:r>
+      <w:r>
+        <w:t xml:space="preserve">).”</w:t>
+      </w:r>
+      <w:r>
+        <w:t xml:space="preserve"> </w:t>
+      </w:r>
+      <w:r>
+        <w:rPr>
+          <w:i/>
+          <w:iCs/>
+        </w:rPr>
+        <w:t xml:space="preserve">Ann. Entomol. Soc. Am.</w:t>
+      </w:r>
+      <w:r>
+        <w:t xml:space="preserve"> </w:t>
+      </w:r>
+      <w:r>
+        <w:t xml:space="preserve">110 (3): 281–85.</w:t>
+      </w:r>
+      <w:r>
+        <w:t xml:space="preserve"> </w:t>
+      </w:r>
+      <w:hyperlink r:id="rId80">
+        <w:r>
+          <w:rPr>
+            <w:rStyle w:val="Hyperlink"/>
+          </w:rPr>
+          <w:t xml:space="preserve">https://doi.org/10.1093/aesa/saw096</w:t>
+        </w:r>
+      </w:hyperlink>
+      <w:r>
+        <w:t xml:space="preserve">.</w:t>
+      </w:r>
+    </w:p>
+    <w:bookmarkEnd w:id="81"/>
+    <w:bookmarkStart w:id="83" w:name="ref-kelly2005a"/>
+    <w:p>
+      <w:pPr>
+        <w:pStyle w:val="Bibliography"/>
+      </w:pPr>
+      <w:r>
+        <w:t xml:space="preserve">Kelly, Clint D. 2005.</w:t>
+      </w:r>
+      <w:r>
+        <w:t xml:space="preserve"> </w:t>
+      </w:r>
+      <w:r>
+        <w:t xml:space="preserve">“Allometry and Sexual Selection of Male Weaponry in</w:t>
+      </w:r>
+      <w:r>
+        <w:t xml:space="preserve"> </w:t>
+      </w:r>
+      <w:r>
+        <w:t xml:space="preserve">Wellington</w:t>
+      </w:r>
+      <w:r>
+        <w:t xml:space="preserve"> </w:t>
+      </w:r>
+      <w:r>
+        <w:t xml:space="preserve">Tree Weta,</w:t>
+      </w:r>
+      <w:r>
+        <w:t xml:space="preserve"> </w:t>
+      </w:r>
+      <w:r>
+        <w:rPr>
+          <w:i/>
+          <w:iCs/>
+        </w:rPr>
+        <w:t xml:space="preserve">Hemideina Crassidens</w:t>
+      </w:r>
+      <w:r>
+        <w:t xml:space="preserve">.”</w:t>
+      </w:r>
+      <w:r>
+        <w:t xml:space="preserve"> </w:t>
+      </w:r>
+      <w:r>
+        <w:rPr>
+          <w:i/>
+          <w:iCs/>
+        </w:rPr>
+        <w:t xml:space="preserve">Behav. Ecol.</w:t>
+      </w:r>
+      <w:r>
+        <w:t xml:space="preserve"> </w:t>
+      </w:r>
+      <w:r>
+        <w:t xml:space="preserve">16 (1): 145–52.</w:t>
+      </w:r>
+      <w:r>
+        <w:t xml:space="preserve"> </w:t>
+      </w:r>
+      <w:hyperlink r:id="rId82">
+        <w:r>
+          <w:rPr>
+            <w:rStyle w:val="Hyperlink"/>
+          </w:rPr>
+          <w:t xml:space="preserve">https://doi.org/10.1093/beheco/arh141</w:t>
+        </w:r>
+      </w:hyperlink>
+      <w:r>
+        <w:t xml:space="preserve">.</w:t>
+      </w:r>
+    </w:p>
+    <w:bookmarkEnd w:id="83"/>
+    <w:bookmarkStart w:id="85" w:name="ref-kelly2006d"/>
+    <w:p>
+      <w:pPr>
+        <w:pStyle w:val="Bibliography"/>
+      </w:pPr>
+      <w:r>
+        <w:t xml:space="preserve">———. 2006.</w:t>
+      </w:r>
+      <w:r>
+        <w:t xml:space="preserve"> </w:t>
+      </w:r>
+      <w:r>
+        <w:t xml:space="preserve">“Fighting for Harems: Assessment Strategies During Male–Male Contests in the Sexually Dimorphic</w:t>
+      </w:r>
+      <w:r>
+        <w:t xml:space="preserve"> </w:t>
+      </w:r>
+      <w:r>
+        <w:t xml:space="preserve">Wellington</w:t>
+      </w:r>
+      <w:r>
+        <w:t xml:space="preserve"> </w:t>
+      </w:r>
+      <w:r>
+        <w:t xml:space="preserve">Tree Weta.”</w:t>
+      </w:r>
+      <w:r>
+        <w:t xml:space="preserve"> </w:t>
+      </w:r>
+      <w:r>
+        <w:rPr>
+          <w:i/>
+          <w:iCs/>
+        </w:rPr>
+        <w:t xml:space="preserve">Anim. Behav.</w:t>
+      </w:r>
+      <w:r>
+        <w:t xml:space="preserve"> </w:t>
+      </w:r>
+      <w:r>
+        <w:t xml:space="preserve">72 (3): 727–36.</w:t>
+      </w:r>
+      <w:r>
+        <w:t xml:space="preserve"> </w:t>
+      </w:r>
+      <w:hyperlink r:id="rId84">
+        <w:r>
+          <w:rPr>
+            <w:rStyle w:val="Hyperlink"/>
+          </w:rPr>
+          <w:t xml:space="preserve">https://doi.org/10.1016/j.anbehav.2006.02.007</w:t>
+        </w:r>
+      </w:hyperlink>
+      <w:r>
+        <w:t xml:space="preserve">.</w:t>
+      </w:r>
+    </w:p>
+    <w:bookmarkEnd w:id="85"/>
+    <w:bookmarkStart w:id="87" w:name="ref-kelly2024"/>
+    <w:p>
+      <w:pPr>
+        <w:pStyle w:val="Bibliography"/>
+      </w:pPr>
+      <w:r>
+        <w:t xml:space="preserve">———. 2024.</w:t>
+      </w:r>
+      <w:r>
+        <w:t xml:space="preserve"> </w:t>
+      </w:r>
+      <w:r>
+        <w:t xml:space="preserve">“Alternative Mating Strategies in the</w:t>
+      </w:r>
+      <w:r>
+        <w:t xml:space="preserve"> </w:t>
+      </w:r>
+      <w:r>
+        <w:t xml:space="preserve">Wellington</w:t>
+      </w:r>
+      <w:r>
+        <w:t xml:space="preserve"> </w:t>
+      </w:r>
+      <w:r>
+        <w:t xml:space="preserve">Tree Weta Expressed via Genetic Polymorphism for Precocial Male Maturation.”</w:t>
+      </w:r>
+      <w:r>
+        <w:t xml:space="preserve"> </w:t>
+      </w:r>
+      <w:r>
+        <w:rPr>
+          <w:i/>
+          <w:iCs/>
+        </w:rPr>
+        <w:t xml:space="preserve">R. Soc. Open Sci.</w:t>
+      </w:r>
+      <w:r>
+        <w:t xml:space="preserve"> </w:t>
+      </w:r>
+      <w:r>
+        <w:t xml:space="preserve">11 (2): 240100.</w:t>
+      </w:r>
+      <w:r>
+        <w:t xml:space="preserve"> </w:t>
+      </w:r>
+      <w:hyperlink r:id="rId86">
+        <w:r>
+          <w:rPr>
+            <w:rStyle w:val="Hyperlink"/>
+          </w:rPr>
+          <w:t xml:space="preserve">https://doi.org/10.1098/rsos.240100</w:t>
+        </w:r>
+      </w:hyperlink>
+      <w:r>
+        <w:t xml:space="preserve">.</w:t>
+      </w:r>
+    </w:p>
+    <w:bookmarkEnd w:id="87"/>
+    <w:bookmarkStart w:id="89" w:name="ref-kelly2025"/>
+    <w:p>
+      <w:pPr>
+        <w:pStyle w:val="Bibliography"/>
+      </w:pPr>
+      <w:r>
+        <w:t xml:space="preserve">———. 2025.</w:t>
+      </w:r>
+      <w:r>
+        <w:t xml:space="preserve"> </w:t>
+      </w:r>
+      <w:r>
+        <w:t xml:space="preserve">“A Behaviourally Plastic Jack-of-All-Trades Mating Strategy in the</w:t>
+      </w:r>
+      <w:r>
+        <w:t xml:space="preserve"> </w:t>
+      </w:r>
+      <w:r>
+        <w:t xml:space="preserve">Wellington</w:t>
+      </w:r>
+      <w:r>
+        <w:t xml:space="preserve"> </w:t>
+      </w:r>
+      <w:r>
+        <w:t xml:space="preserve">Tree Wētā.”</w:t>
+      </w:r>
+      <w:r>
+        <w:t xml:space="preserve"> </w:t>
+      </w:r>
+      <w:r>
+        <w:rPr>
+          <w:i/>
+          <w:iCs/>
+        </w:rPr>
+        <w:t xml:space="preserve">Anim. Behav.</w:t>
+      </w:r>
+      <w:r>
+        <w:t xml:space="preserve"> </w:t>
+      </w:r>
+      <w:r>
+        <w:t xml:space="preserve">229: 123332.</w:t>
+      </w:r>
+      <w:r>
+        <w:t xml:space="preserve"> </w:t>
+      </w:r>
+      <w:hyperlink r:id="rId88">
+        <w:r>
+          <w:rPr>
+            <w:rStyle w:val="Hyperlink"/>
+          </w:rPr>
+          <w:t xml:space="preserve">https://doi.org/10.1016/j.anbehav.2025.123332</w:t>
+        </w:r>
+      </w:hyperlink>
+      <w:r>
+        <w:t xml:space="preserve">.</w:t>
+      </w:r>
+    </w:p>
+    <w:bookmarkEnd w:id="89"/>
+    <w:bookmarkStart w:id="91" w:name="ref-kelly2026"/>
+    <w:p>
+      <w:pPr>
+        <w:pStyle w:val="Bibliography"/>
+      </w:pPr>
+      <w:r>
+        <w:t xml:space="preserve">———. 2026.</w:t>
+      </w:r>
+      <w:r>
+        <w:t xml:space="preserve"> </w:t>
+      </w:r>
+      <w:r>
+        <w:t xml:space="preserve">“Can the Form of Sexual Selection Explain Patterns of Static Weapon Allometry Expressed by Alternative Mating Morphotypes?”</w:t>
+      </w:r>
+      <w:r>
+        <w:t xml:space="preserve"> </w:t>
+      </w:r>
+      <w:r>
+        <w:rPr>
+          <w:i/>
+          <w:iCs/>
+        </w:rPr>
+        <w:t xml:space="preserve">Evolution</w:t>
+      </w:r>
+      <w:r>
+        <w:t xml:space="preserve"> </w:t>
+      </w:r>
+      <w:r>
+        <w:t xml:space="preserve">80 (1): 191–201.</w:t>
+      </w:r>
+      <w:r>
+        <w:t xml:space="preserve"> </w:t>
+      </w:r>
+      <w:hyperlink r:id="rId90">
+        <w:r>
+          <w:rPr>
+            <w:rStyle w:val="Hyperlink"/>
+          </w:rPr>
+          <w:t xml:space="preserve">https://doi.org/10.1093/evolut/qpaf215</w:t>
+        </w:r>
+      </w:hyperlink>
+      <w:r>
+        <w:t xml:space="preserve">.</w:t>
+      </w:r>
+    </w:p>
+    <w:bookmarkEnd w:id="91"/>
+    <w:bookmarkStart w:id="93" w:name="ref-kelly2010"/>
+    <w:p>
+      <w:pPr>
+        <w:pStyle w:val="Bibliography"/>
+      </w:pPr>
+      <w:r>
+        <w:t xml:space="preserve">Kelly, Clint D., and Dean C. Adams. 2010.</w:t>
+      </w:r>
+      <w:r>
+        <w:t xml:space="preserve"> </w:t>
+      </w:r>
+      <w:r>
+        <w:t xml:space="preserve">“Sexual Selection, Ontogenetic Acceleration, and Hypermorphosis Generates Male Trimorphism in</w:t>
+      </w:r>
+      <w:r>
+        <w:t xml:space="preserve"> </w:t>
+      </w:r>
+      <w:r>
+        <w:t xml:space="preserve">Wellington</w:t>
+      </w:r>
+      <w:r>
+        <w:t xml:space="preserve"> </w:t>
+      </w:r>
+      <w:r>
+        <w:t xml:space="preserve">Tree Weta.”</w:t>
+      </w:r>
+      <w:r>
+        <w:t xml:space="preserve"> </w:t>
+      </w:r>
+      <w:r>
+        <w:rPr>
+          <w:i/>
+          <w:iCs/>
+        </w:rPr>
+        <w:t xml:space="preserve">Evol. Biol.</w:t>
+      </w:r>
+      <w:r>
+        <w:t xml:space="preserve"> </w:t>
+      </w:r>
+      <w:r>
+        <w:t xml:space="preserve">37 (4): 200–209.</w:t>
+      </w:r>
+      <w:r>
+        <w:t xml:space="preserve"> </w:t>
+      </w:r>
+      <w:hyperlink r:id="rId92">
+        <w:r>
+          <w:rPr>
+            <w:rStyle w:val="Hyperlink"/>
+          </w:rPr>
+          <w:t xml:space="preserve">https://doi.org/10.1007/s11692-010-9096-1</w:t>
+        </w:r>
+      </w:hyperlink>
+      <w:r>
+        <w:t xml:space="preserve">.</w:t>
+      </w:r>
+    </w:p>
+    <w:bookmarkEnd w:id="93"/>
+    <w:bookmarkStart w:id="95" w:name="ref-kuznetsova2017"/>
+    <w:p>
+      <w:pPr>
+        <w:pStyle w:val="Bibliography"/>
+      </w:pPr>
+      <w:r>
+        <w:t xml:space="preserve">Kuznetsova, Alexandra, Per B. Brockhoff, and Rune H. B. Christensen. 2017.</w:t>
+      </w:r>
+      <w:r>
+        <w:t xml:space="preserve"> </w:t>
+      </w:r>
+      <w:r>
+        <w:t xml:space="preserve">“</w:t>
+      </w:r>
+      <w:r>
+        <w:rPr>
+          <w:b/>
+          <w:bCs/>
+        </w:rPr>
+        <w:t xml:space="preserve">lmerTest</w:t>
+      </w:r>
+      <w:r>
+        <w:t xml:space="preserve"> </w:t>
+      </w:r>
+      <w:r>
+        <w:t xml:space="preserve">Package</w:t>
+      </w:r>
+      <w:r>
+        <w:t xml:space="preserve">:</w:t>
+      </w:r>
+      <w:r>
+        <w:t xml:space="preserve"> </w:t>
+      </w:r>
+      <w:r>
+        <w:t xml:space="preserve">Tests</w:t>
+      </w:r>
+      <w:r>
+        <w:t xml:space="preserve"> </w:t>
+      </w:r>
+      <w:r>
+        <w:t xml:space="preserve">in</w:t>
+      </w:r>
+      <w:r>
+        <w:t xml:space="preserve"> </w:t>
+      </w:r>
+      <w:r>
+        <w:t xml:space="preserve">Linear Mixed Effects Models</w:t>
+      </w:r>
+      <w:r>
+        <w:t xml:space="preserve">.”</w:t>
+      </w:r>
+      <w:r>
+        <w:t xml:space="preserve"> </w:t>
+      </w:r>
+      <w:r>
+        <w:rPr>
+          <w:i/>
+          <w:iCs/>
+        </w:rPr>
+        <w:t xml:space="preserve">J. Stat. Softw.</w:t>
+      </w:r>
+      <w:r>
+        <w:t xml:space="preserve"> </w:t>
+      </w:r>
+      <w:r>
+        <w:t xml:space="preserve">82 (13).</w:t>
+      </w:r>
+      <w:r>
+        <w:t xml:space="preserve"> </w:t>
+      </w:r>
+      <w:hyperlink r:id="rId94">
+        <w:r>
+          <w:rPr>
+            <w:rStyle w:val="Hyperlink"/>
+          </w:rPr>
+          <w:t xml:space="preserve">https://doi.org/10.18637/jss.v082.i13</w:t>
+        </w:r>
+      </w:hyperlink>
+      <w:r>
+        <w:t xml:space="preserve">.</w:t>
+      </w:r>
+    </w:p>
+    <w:bookmarkEnd w:id="95"/>
+    <w:bookmarkStart w:id="96" w:name="ref-lenth2019package"/>
+    <w:p>
+      <w:pPr>
+        <w:pStyle w:val="Bibliography"/>
+      </w:pPr>
+      <w:r>
+        <w:t xml:space="preserve">Lenth, R., H. Singmann, J. Love, P. Buerkner, and M. Herve. 2019.</w:t>
+      </w:r>
+      <w:r>
+        <w:t xml:space="preserve"> </w:t>
+      </w:r>
+      <w:r>
+        <w:t xml:space="preserve">“Package</w:t>
+      </w:r>
+      <w:r>
+        <w:t xml:space="preserve"> </w:t>
+      </w:r>
+      <w:r>
+        <w:t xml:space="preserve">‘Emmeans’</w:t>
+      </w:r>
+      <w:r>
+        <w:t xml:space="preserve">:</w:t>
+      </w:r>
+      <w:r>
+        <w:t xml:space="preserve"> </w:t>
+      </w:r>
+      <w:r>
+        <w:t xml:space="preserve">Estimated</w:t>
+      </w:r>
+      <w:r>
+        <w:t xml:space="preserve"> </w:t>
+      </w:r>
+      <w:r>
+        <w:t xml:space="preserve">Marginal Means, Aka Least-Squares Means.”</w:t>
+      </w:r>
+    </w:p>
+    <w:bookmarkEnd w:id="96"/>
+    <w:bookmarkStart w:id="98" w:name="ref-ludecke2021"/>
+    <w:p>
+      <w:pPr>
+        <w:pStyle w:val="Bibliography"/>
+      </w:pPr>
+      <w:r>
+        <w:t xml:space="preserve">Lüdecke, Daniel, Mattan Ben-Shachar, Indrajeet Patil, Philip Waggoner, and Dominique Makowski. 2021.</w:t>
+      </w:r>
+      <w:r>
+        <w:t xml:space="preserve"> </w:t>
+      </w:r>
+      <w:r>
+        <w:t xml:space="preserve">“Performance: An</w:t>
+      </w:r>
+      <w:r>
+        <w:t xml:space="preserve"> </w:t>
+      </w:r>
+      <w:r>
+        <w:t xml:space="preserve"> </w:t>
+      </w:r>
+      <w:r>
+        <w:t xml:space="preserve">Package for Assessment, Comparison and Testing of Statistical Models.”</w:t>
+      </w:r>
+      <w:r>
+        <w:t xml:space="preserve"> </w:t>
+      </w:r>
+      <w:r>
+        <w:rPr>
+          <w:i/>
+          <w:iCs/>
+        </w:rPr>
+        <w:t xml:space="preserve">J. Open Source Softw.</w:t>
+      </w:r>
+      <w:r>
+        <w:t xml:space="preserve"> </w:t>
+      </w:r>
+      <w:r>
+        <w:t xml:space="preserve">6 (60): 3139.</w:t>
+      </w:r>
+      <w:r>
+        <w:t xml:space="preserve"> </w:t>
+      </w:r>
+      <w:hyperlink r:id="rId97">
+        <w:r>
+          <w:rPr>
+            <w:rStyle w:val="Hyperlink"/>
+          </w:rPr>
+          <w:t xml:space="preserve">https://doi.org/10.21105/joss.03139</w:t>
+        </w:r>
+      </w:hyperlink>
+      <w:r>
+        <w:t xml:space="preserve">.</w:t>
+      </w:r>
+    </w:p>
+    <w:bookmarkEnd w:id="98"/>
+    <w:bookmarkStart w:id="100" w:name="ref-ludecke2021a"/>
+    <w:p>
+      <w:pPr>
+        <w:pStyle w:val="Bibliography"/>
+      </w:pPr>
+      <w:r>
+        <w:t xml:space="preserve">Lüdecke, Daniel, Indrajeet Patil, Mattan S. Ben-Shachar, Brenton M. Wiernik, Philip Waggoner, and Dominique Makowski. 2021.</w:t>
+      </w:r>
+      <w:r>
+        <w:t xml:space="preserve"> </w:t>
+      </w:r>
+      <w:r>
+        <w:t xml:space="preserve">“See:</w:t>
+      </w:r>
+      <w:r>
+        <w:t xml:space="preserve"> </w:t>
+      </w:r>
+      <w:r>
+        <w:t xml:space="preserve">An R Package</w:t>
+      </w:r>
+      <w:r>
+        <w:t xml:space="preserve"> </w:t>
+      </w:r>
+      <w:r>
+        <w:t xml:space="preserve">for</w:t>
+      </w:r>
+      <w:r>
+        <w:t xml:space="preserve"> </w:t>
+      </w:r>
+      <w:r>
+        <w:t xml:space="preserve">Visualizing Statistical Models</w:t>
+      </w:r>
+      <w:r>
+        <w:t xml:space="preserve">.”</w:t>
+      </w:r>
+      <w:r>
+        <w:t xml:space="preserve"> </w:t>
+      </w:r>
+      <w:r>
+        <w:rPr>
+          <w:i/>
+          <w:iCs/>
+        </w:rPr>
+        <w:t xml:space="preserve">J. Open Source Softw.</w:t>
+      </w:r>
+      <w:r>
+        <w:t xml:space="preserve"> </w:t>
+      </w:r>
+      <w:r>
+        <w:t xml:space="preserve">6 (64): 3393.</w:t>
+      </w:r>
+      <w:r>
+        <w:t xml:space="preserve"> </w:t>
+      </w:r>
+      <w:hyperlink r:id="rId99">
+        <w:r>
+          <w:rPr>
+            <w:rStyle w:val="Hyperlink"/>
+          </w:rPr>
+          <w:t xml:space="preserve">https://doi.org/10.21105/joss.03393</w:t>
+        </w:r>
+      </w:hyperlink>
+      <w:r>
+        <w:t xml:space="preserve">.</w:t>
+      </w:r>
+    </w:p>
+    <w:bookmarkEnd w:id="100"/>
+    <w:bookmarkStart w:id="102" w:name="ref-mccullough2013"/>
+    <w:p>
+      <w:pPr>
+        <w:pStyle w:val="Bibliography"/>
+      </w:pPr>
+      <w:r>
+        <w:t xml:space="preserve">McCullough, Erin, and Douglas Emlen. 2013.</w:t>
+      </w:r>
+      <w:r>
+        <w:t xml:space="preserve"> </w:t>
+      </w:r>
+      <w:r>
+        <w:t xml:space="preserve">“Evaluating the Costs of a Sexually Selected Weapon:</w:t>
+      </w:r>
+      <w:r>
+        <w:t xml:space="preserve"> </w:t>
+      </w:r>
+      <w:r>
+        <w:t xml:space="preserve">Big</w:t>
+      </w:r>
+      <w:r>
+        <w:t xml:space="preserve"> </w:t>
+      </w:r>
+      <w:r>
+        <w:t xml:space="preserve">Horns at a Small Price.”</w:t>
+      </w:r>
+      <w:r>
+        <w:t xml:space="preserve"> </w:t>
+      </w:r>
+      <w:r>
+        <w:rPr>
+          <w:i/>
+          <w:iCs/>
+        </w:rPr>
+        <w:t xml:space="preserve">Anim. Behav.</w:t>
+      </w:r>
+      <w:r>
+        <w:t xml:space="preserve"> </w:t>
+      </w:r>
+      <w:r>
+        <w:t xml:space="preserve">86 (November): 977–85.</w:t>
+      </w:r>
+      <w:r>
+        <w:t xml:space="preserve"> </w:t>
+      </w:r>
+      <w:hyperlink r:id="rId101">
+        <w:r>
+          <w:rPr>
+            <w:rStyle w:val="Hyperlink"/>
+          </w:rPr>
+          <w:t xml:space="preserve">https://doi.org/10.1016/j.anbehav.2013.08.017</w:t>
+        </w:r>
+      </w:hyperlink>
+      <w:r>
+        <w:t xml:space="preserve">.</w:t>
+      </w:r>
+    </w:p>
+    <w:bookmarkEnd w:id="102"/>
+    <w:bookmarkStart w:id="104" w:name="ref-moczek2004"/>
+    <w:p>
+      <w:pPr>
+        <w:pStyle w:val="Bibliography"/>
+      </w:pPr>
+      <w:r>
+        <w:t xml:space="preserve">Moczek, Armin P., and H. Frederik Nijhout. 2004.</w:t>
+      </w:r>
+      <w:r>
+        <w:t xml:space="preserve"> </w:t>
+      </w:r>
+      <w:r>
+        <w:t xml:space="preserve">“Trade-Offs During the Development of Primary and Secondary Sexual Traits in a Horned Beetle.”</w:t>
+      </w:r>
+      <w:r>
+        <w:t xml:space="preserve"> </w:t>
+      </w:r>
+      <w:r>
+        <w:rPr>
+          <w:i/>
+          <w:iCs/>
+        </w:rPr>
+        <w:t xml:space="preserve">Am. Nat.</w:t>
+      </w:r>
+      <w:r>
+        <w:t xml:space="preserve"> </w:t>
+      </w:r>
+      <w:r>
+        <w:t xml:space="preserve">163 (2): 184–91.</w:t>
+      </w:r>
+      <w:r>
+        <w:t xml:space="preserve"> </w:t>
+      </w:r>
+      <w:hyperlink r:id="rId103">
+        <w:r>
+          <w:rPr>
+            <w:rStyle w:val="Hyperlink"/>
+          </w:rPr>
+          <w:t xml:space="preserve">https://doi.org/10.1086/381741</w:t>
+        </w:r>
+      </w:hyperlink>
+      <w:r>
+        <w:t xml:space="preserve">.</w:t>
+      </w:r>
+    </w:p>
+    <w:bookmarkEnd w:id="104"/>
+    <w:bookmarkStart w:id="106" w:name="ref-nason2020"/>
+    <w:p>
+      <w:pPr>
+        <w:pStyle w:val="Bibliography"/>
+      </w:pPr>
+      <w:r>
+        <w:t xml:space="preserve">Nason, Sarah E., and Clint D. Kelly. 2020.</w:t>
+      </w:r>
+      <w:r>
+        <w:t xml:space="preserve"> </w:t>
+      </w:r>
+      <w:r>
+        <w:t xml:space="preserve">“Equal Fitness Among Alternative Mating Strategies in a Harem Polygynous Insect.”</w:t>
+      </w:r>
+      <w:r>
+        <w:t xml:space="preserve"> </w:t>
+      </w:r>
+      <w:r>
+        <w:rPr>
+          <w:i/>
+          <w:iCs/>
+        </w:rPr>
+        <w:t xml:space="preserve">Proc. R. Soc. B Biol. Sci.</w:t>
+      </w:r>
+      <w:r>
+        <w:t xml:space="preserve"> </w:t>
+      </w:r>
+      <w:r>
+        <w:t xml:space="preserve">287 (1931): 20200975.</w:t>
+      </w:r>
+      <w:r>
+        <w:t xml:space="preserve"> </w:t>
+      </w:r>
+      <w:hyperlink r:id="rId105">
+        <w:r>
+          <w:rPr>
+            <w:rStyle w:val="Hyperlink"/>
+          </w:rPr>
+          <w:t xml:space="preserve">https://doi.org/10.1098/rspb.2020.0975</w:t>
+        </w:r>
+      </w:hyperlink>
+      <w:r>
+        <w:t xml:space="preserve">.</w:t>
+      </w:r>
+    </w:p>
+    <w:bookmarkEnd w:id="106"/>
+    <w:bookmarkStart w:id="108" w:name="ref-nijhout1998"/>
+    <w:p>
+      <w:pPr>
+        <w:pStyle w:val="Bibliography"/>
+      </w:pPr>
+      <w:r>
+        <w:t xml:space="preserve">Nijhout, H. F., and D. J. Emlen. 1998.</w:t>
+      </w:r>
+      <w:r>
+        <w:t xml:space="preserve"> </w:t>
+      </w:r>
+      <w:r>
+        <w:t xml:space="preserve">“Competition Among Body Parts in the Development and Evolution of Insect Morphology.”</w:t>
+      </w:r>
+      <w:r>
+        <w:t xml:space="preserve"> </w:t>
+      </w:r>
+      <w:r>
+        <w:rPr>
+          <w:i/>
+          <w:iCs/>
+        </w:rPr>
+        <w:t xml:space="preserve">Proc. Natl. Acad. Sci.</w:t>
+      </w:r>
+      <w:r>
+        <w:t xml:space="preserve"> </w:t>
+      </w:r>
+      <w:r>
+        <w:t xml:space="preserve">95 (7): 3685–89.</w:t>
+      </w:r>
+      <w:r>
+        <w:t xml:space="preserve"> </w:t>
+      </w:r>
+      <w:hyperlink r:id="rId107">
+        <w:r>
+          <w:rPr>
+            <w:rStyle w:val="Hyperlink"/>
+          </w:rPr>
+          <w:t xml:space="preserve">https://doi.org/10.1073/pnas.95.7.3685</w:t>
+        </w:r>
+      </w:hyperlink>
+      <w:r>
+        <w:t xml:space="preserve">.</w:t>
+      </w:r>
+    </w:p>
+    <w:bookmarkEnd w:id="108"/>
+    <w:bookmarkStart w:id="109" w:name="ref-oliveira2008"/>
+    <w:p>
+      <w:pPr>
+        <w:pStyle w:val="Bibliography"/>
+      </w:pPr>
+      <w:r>
+        <w:t xml:space="preserve">Oliveira, Rui F., Michael Taborsky, and H. Jane Brockmann. 2008.</w:t>
+      </w:r>
+      <w:r>
+        <w:t xml:space="preserve"> </w:t>
+      </w:r>
+      <w:r>
+        <w:rPr>
+          <w:i/>
+          <w:iCs/>
+        </w:rPr>
+        <w:t xml:space="preserve">Alternative</w:t>
+      </w:r>
+      <w:r>
+        <w:rPr>
+          <w:i/>
+          <w:iCs/>
+        </w:rPr>
+        <w:t xml:space="preserve"> </w:t>
+      </w:r>
+      <w:r>
+        <w:rPr>
+          <w:i/>
+          <w:iCs/>
+        </w:rPr>
+        <w:t xml:space="preserve">Reproductive Tactics</w:t>
+      </w:r>
+      <w:r>
+        <w:t xml:space="preserve">. Cambridge University Press.</w:t>
+      </w:r>
+    </w:p>
+    <w:bookmarkEnd w:id="109"/>
+    <w:bookmarkStart w:id="110" w:name="ref-rcoreteam2025"/>
+    <w:p>
+      <w:pPr>
+        <w:pStyle w:val="Bibliography"/>
+      </w:pPr>
+      <w:r>
+        <w:t xml:space="preserve">R Core Team. 2025.</w:t>
+      </w:r>
+      <w:r>
+        <w:t xml:space="preserve"> </w:t>
+      </w:r>
+      <w:r>
+        <w:t xml:space="preserve">“R:</w:t>
+      </w:r>
+      <w:r>
+        <w:t xml:space="preserve"> </w:t>
+      </w:r>
+      <w:r>
+        <w:t xml:space="preserve">A</w:t>
+      </w:r>
+      <w:r>
+        <w:t xml:space="preserve"> </w:t>
+      </w:r>
+      <w:r>
+        <w:t xml:space="preserve">Language and Environment for Statistical Computing.”</w:t>
+      </w:r>
+      <w:r>
+        <w:t xml:space="preserve"> </w:t>
+      </w:r>
+      <w:r>
+        <w:t xml:space="preserve">R Foundation for Statistical Computing.</w:t>
+      </w:r>
+    </w:p>
+    <w:bookmarkEnd w:id="110"/>
+    <w:bookmarkStart w:id="112" w:name="ref-robinson2014"/>
+    <w:p>
+      <w:pPr>
+        <w:pStyle w:val="Bibliography"/>
+      </w:pPr>
+      <w:r>
+        <w:t xml:space="preserve">Robinson, David. 2014.</w:t>
+      </w:r>
+      <w:r>
+        <w:t xml:space="preserve"> </w:t>
+      </w:r>
+      <w:r>
+        <w:t xml:space="preserve">“Broom:</w:t>
+      </w:r>
+      <w:r>
+        <w:t xml:space="preserve"> </w:t>
+      </w:r>
+      <w:r>
+        <w:t xml:space="preserve">An R Package</w:t>
+      </w:r>
+      <w:r>
+        <w:t xml:space="preserve"> </w:t>
+      </w:r>
+      <w:r>
+        <w:t xml:space="preserve">for</w:t>
+      </w:r>
+      <w:r>
+        <w:t xml:space="preserve"> </w:t>
+      </w:r>
+      <w:r>
+        <w:t xml:space="preserve">Converting Statistical Analysis Objects Into Tidy Data Frames</w:t>
+      </w:r>
+      <w:r>
+        <w:t xml:space="preserve">.”</w:t>
+      </w:r>
+      <w:r>
+        <w:t xml:space="preserve"> </w:t>
+      </w:r>
+      <w:r>
+        <w:t xml:space="preserve">arXiv.</w:t>
+      </w:r>
+      <w:r>
+        <w:t xml:space="preserve"> </w:t>
+      </w:r>
+      <w:hyperlink r:id="rId111">
+        <w:r>
+          <w:rPr>
+            <w:rStyle w:val="Hyperlink"/>
+          </w:rPr>
+          <w:t xml:space="preserve">https://doi.org/10.48550/arXiv.1412.3565</w:t>
+        </w:r>
+      </w:hyperlink>
+      <w:r>
+        <w:t xml:space="preserve">.</w:t>
+      </w:r>
+    </w:p>
+    <w:bookmarkEnd w:id="112"/>
+    <w:bookmarkStart w:id="114" w:name="ref-rohner2020"/>
+    <w:p>
+      <w:pPr>
+        <w:pStyle w:val="Bibliography"/>
+      </w:pPr>
+      <w:r>
+        <w:t xml:space="preserve">Rohner, Patrick T., Anna L. M. Macagno, and Armin P. Moczek. 2020.</w:t>
+      </w:r>
+      <w:r>
+        <w:t xml:space="preserve"> </w:t>
+      </w:r>
+      <w:r>
+        <w:t xml:space="preserve">“Evolution and Plasticity of Morph-Specific Integration in the Bull-Headed Dung Beetle</w:t>
+      </w:r>
+      <w:r>
+        <w:t xml:space="preserve"> </w:t>
+      </w:r>
+      <w:r>
+        <w:rPr>
+          <w:i/>
+          <w:iCs/>
+        </w:rPr>
+        <w:t xml:space="preserve">Onthophagus</w:t>
+      </w:r>
+      <w:r>
+        <w:t xml:space="preserve"> </w:t>
+      </w:r>
+      <w:r>
+        <w:rPr>
+          <w:i/>
+          <w:iCs/>
+        </w:rPr>
+        <w:t xml:space="preserve">Taurus</w:t>
+      </w:r>
+      <w:r>
+        <w:t xml:space="preserve">.”</w:t>
+      </w:r>
+      <w:r>
+        <w:t xml:space="preserve"> </w:t>
+      </w:r>
+      <w:r>
+        <w:rPr>
+          <w:i/>
+          <w:iCs/>
+        </w:rPr>
+        <w:t xml:space="preserve">Ecol. Evol.</w:t>
+      </w:r>
+      <w:r>
+        <w:t xml:space="preserve"> </w:t>
+      </w:r>
+      <w:r>
+        <w:t xml:space="preserve">10 (19): 10558–70.</w:t>
+      </w:r>
+      <w:r>
+        <w:t xml:space="preserve"> </w:t>
+      </w:r>
+      <w:hyperlink r:id="rId113">
+        <w:r>
+          <w:rPr>
+            <w:rStyle w:val="Hyperlink"/>
+          </w:rPr>
+          <w:t xml:space="preserve">https://doi.org/10.1002/ece3.6711</w:t>
+        </w:r>
+      </w:hyperlink>
+      <w:r>
+        <w:t xml:space="preserve">.</w:t>
+      </w:r>
+    </w:p>
+    <w:bookmarkEnd w:id="114"/>
+    <w:bookmarkStart w:id="116" w:name="ref-schindelin2012"/>
+    <w:p>
+      <w:pPr>
+        <w:pStyle w:val="Bibliography"/>
+      </w:pPr>
+      <w:r>
+        <w:t xml:space="preserve">Schindelin, Johannes, Ignacio Arganda-Carreras, Erwin Frise, Verena Kaynig, Mark Longair, Tobias Pietzsch, Stephan Preibisch, et al. 2012.</w:t>
+      </w:r>
+      <w:r>
+        <w:t xml:space="preserve"> </w:t>
+      </w:r>
+      <w:r>
+        <w:t xml:space="preserve">“Fiji: An Open-Source Platform for Biological-Image Analysis.”</w:t>
+      </w:r>
+      <w:r>
+        <w:t xml:space="preserve"> </w:t>
+      </w:r>
+      <w:r>
+        <w:rPr>
+          <w:i/>
+          <w:iCs/>
+        </w:rPr>
+        <w:t xml:space="preserve">Nat. Methods</w:t>
+      </w:r>
+      <w:r>
+        <w:t xml:space="preserve"> </w:t>
+      </w:r>
+      <w:r>
+        <w:t xml:space="preserve">9 (7): 676–82.</w:t>
+      </w:r>
+      <w:r>
+        <w:t xml:space="preserve"> </w:t>
+      </w:r>
+      <w:hyperlink r:id="rId115">
+        <w:r>
+          <w:rPr>
+            <w:rStyle w:val="Hyperlink"/>
+          </w:rPr>
+          <w:t xml:space="preserve">https://doi.org/10.1038/nmeth.2019</w:t>
+        </w:r>
+      </w:hyperlink>
+      <w:r>
+        <w:t xml:space="preserve">.</w:t>
+      </w:r>
+    </w:p>
+    <w:bookmarkEnd w:id="116"/>
+    <w:bookmarkStart w:id="117" w:name="ref-shuster2003"/>
+    <w:p>
+      <w:pPr>
+        <w:pStyle w:val="Bibliography"/>
+      </w:pPr>
+      <w:r>
+        <w:t xml:space="preserve">Shuster, S. M., and M. J. Wade. 2003.</w:t>
+      </w:r>
+      <w:r>
+        <w:t xml:space="preserve"> </w:t>
+      </w:r>
+      <w:r>
+        <w:rPr>
+          <w:i/>
+          <w:iCs/>
+        </w:rPr>
+        <w:t xml:space="preserve">Mating</w:t>
+      </w:r>
+      <w:r>
+        <w:rPr>
+          <w:i/>
+          <w:iCs/>
+        </w:rPr>
+        <w:t xml:space="preserve"> </w:t>
+      </w:r>
+      <w:r>
+        <w:rPr>
+          <w:i/>
+          <w:iCs/>
+        </w:rPr>
+        <w:t xml:space="preserve">Systems</w:t>
+      </w:r>
+      <w:r>
+        <w:rPr>
+          <w:i/>
+          <w:iCs/>
+        </w:rPr>
+        <w:t xml:space="preserve"> </w:t>
+      </w:r>
+      <w:r>
+        <w:rPr>
+          <w:i/>
+          <w:iCs/>
+        </w:rPr>
+        <w:t xml:space="preserve">and</w:t>
+      </w:r>
+      <w:r>
+        <w:rPr>
+          <w:i/>
+          <w:iCs/>
+        </w:rPr>
+        <w:t xml:space="preserve"> </w:t>
+      </w:r>
+      <w:r>
+        <w:rPr>
+          <w:i/>
+          <w:iCs/>
+        </w:rPr>
+        <w:t xml:space="preserve">Strategies</w:t>
+      </w:r>
+      <w:r>
+        <w:t xml:space="preserve">. Princeton University Press.</w:t>
+      </w:r>
+    </w:p>
+    <w:bookmarkEnd w:id="117"/>
+    <w:bookmarkStart w:id="119" w:name="ref-snell-rood2010"/>
+    <w:p>
+      <w:pPr>
+        <w:pStyle w:val="Bibliography"/>
+      </w:pPr>
+      <w:r>
+        <w:t xml:space="preserve">Snell-Rood, Emilie C., James David Van Dyken, Tami Cruickshank, Michael J. Wade, and Armin P. Moczek. 2010.</w:t>
+      </w:r>
+      <w:r>
+        <w:t xml:space="preserve"> </w:t>
+      </w:r>
+      <w:r>
+        <w:t xml:space="preserve">“Toward a Population Genetic Framework of Developmental Evolution: The Costs, Limits, and Consequences of Phenotypic Plasticity.”</w:t>
+      </w:r>
+      <w:r>
+        <w:t xml:space="preserve"> </w:t>
+      </w:r>
+      <w:r>
+        <w:rPr>
+          <w:i/>
+          <w:iCs/>
+        </w:rPr>
+        <w:t xml:space="preserve">Bioessays</w:t>
+      </w:r>
+      <w:r>
+        <w:t xml:space="preserve"> </w:t>
+      </w:r>
+      <w:r>
+        <w:t xml:space="preserve">32 (1): 71–81.</w:t>
+      </w:r>
+      <w:r>
+        <w:t xml:space="preserve"> </w:t>
+      </w:r>
+      <w:hyperlink r:id="rId118">
+        <w:r>
+          <w:rPr>
+            <w:rStyle w:val="Hyperlink"/>
+          </w:rPr>
+          <w:t xml:space="preserve">https://doi.org/10.1002/bies.200900132</w:t>
+        </w:r>
+      </w:hyperlink>
+      <w:r>
+        <w:t xml:space="preserve">.</w:t>
+      </w:r>
+    </w:p>
+    <w:bookmarkEnd w:id="119"/>
+    <w:bookmarkStart w:id="121" w:name="ref-stoffel2017"/>
+    <w:p>
+      <w:pPr>
+        <w:pStyle w:val="Bibliography"/>
+      </w:pPr>
+      <w:r>
+        <w:t xml:space="preserve">Stoffel, Martin A., Shinichi Nakagawa, and Holger Schielzeth. 2017.</w:t>
+      </w:r>
+      <w:r>
+        <w:t xml:space="preserve"> </w:t>
+      </w:r>
+      <w:r>
+        <w:t xml:space="preserve">“</w:t>
+      </w:r>
+      <w:r>
+        <w:t xml:space="preserve">rptR</w:t>
+      </w:r>
+      <w:r>
+        <w:t xml:space="preserve">: Repeatability Estimation and Variance Decomposition by Generalized Linear Mixed-Effects Models.”</w:t>
+      </w:r>
+      <w:r>
+        <w:t xml:space="preserve"> </w:t>
+      </w:r>
+      <w:r>
+        <w:t xml:space="preserve">Edited by Sarah Goslee.</w:t>
+      </w:r>
+      <w:r>
+        <w:t xml:space="preserve"> </w:t>
+      </w:r>
+      <w:r>
+        <w:rPr>
+          <w:i/>
+          <w:iCs/>
+        </w:rPr>
+        <w:t xml:space="preserve">Methods Ecol. Evol.</w:t>
+      </w:r>
+      <w:r>
+        <w:t xml:space="preserve"> </w:t>
+      </w:r>
+      <w:r>
+        <w:t xml:space="preserve">8 (11): 1639–44.</w:t>
+      </w:r>
+      <w:r>
+        <w:t xml:space="preserve"> </w:t>
+      </w:r>
+      <w:hyperlink r:id="rId120">
+        <w:r>
+          <w:rPr>
+            <w:rStyle w:val="Hyperlink"/>
+          </w:rPr>
+          <w:t xml:space="preserve">https://doi.org/10.1111/2041-210X.12797</w:t>
+        </w:r>
+      </w:hyperlink>
+      <w:r>
+        <w:t xml:space="preserve">.</w:t>
+      </w:r>
+    </w:p>
+    <w:bookmarkEnd w:id="121"/>
+    <w:bookmarkStart w:id="123" w:name="ref-tomkins2005"/>
+    <w:p>
+      <w:pPr>
+        <w:pStyle w:val="Bibliography"/>
+      </w:pPr>
+      <w:r>
+        <w:t xml:space="preserve">Tomkins, J. L., J. S. Kotiaho, and N. R. Lebas. 2005.</w:t>
+      </w:r>
+      <w:r>
+        <w:t xml:space="preserve"> </w:t>
+      </w:r>
+      <w:r>
+        <w:t xml:space="preserve">“Phenotypic Plasticity in the Developmental Integration of Morphological Trade-Offs and Secondary Sexual Trait Compensation.”</w:t>
+      </w:r>
+      <w:r>
+        <w:t xml:space="preserve"> </w:t>
+      </w:r>
+      <w:r>
+        <w:rPr>
+          <w:i/>
+          <w:iCs/>
+        </w:rPr>
+        <w:t xml:space="preserve">Proc Biol Sci</w:t>
+      </w:r>
+      <w:r>
+        <w:t xml:space="preserve"> </w:t>
+      </w:r>
+      <w:r>
+        <w:t xml:space="preserve">272 (1562): 543–51.</w:t>
+      </w:r>
+      <w:r>
+        <w:t xml:space="preserve"> </w:t>
+      </w:r>
+      <w:hyperlink r:id="rId122">
+        <w:r>
+          <w:rPr>
+            <w:rStyle w:val="Hyperlink"/>
+          </w:rPr>
+          <w:t xml:space="preserve">https://doi.org/10.1098/rspb.2004.2950</w:t>
+        </w:r>
+      </w:hyperlink>
+      <w:r>
+        <w:t xml:space="preserve">.</w:t>
+      </w:r>
+    </w:p>
+    <w:bookmarkEnd w:id="123"/>
+    <w:bookmarkStart w:id="124" w:name="ref-west-eberhard2003"/>
+    <w:p>
+      <w:pPr>
+        <w:pStyle w:val="Bibliography"/>
+      </w:pPr>
+      <w:r>
+        <w:t xml:space="preserve">West-Eberhard, Mary Jane. 2003.</w:t>
+      </w:r>
+      <w:r>
+        <w:t xml:space="preserve"> </w:t>
+      </w:r>
+      <w:r>
+        <w:rPr>
+          <w:i/>
+          <w:iCs/>
+        </w:rPr>
+        <w:t xml:space="preserve">Developmental</w:t>
+      </w:r>
+      <w:r>
+        <w:rPr>
+          <w:i/>
+          <w:iCs/>
+        </w:rPr>
+        <w:t xml:space="preserve"> </w:t>
+      </w:r>
+      <w:r>
+        <w:rPr>
+          <w:i/>
+          <w:iCs/>
+        </w:rPr>
+        <w:t xml:space="preserve">Plasticity</w:t>
+      </w:r>
+      <w:r>
+        <w:rPr>
+          <w:i/>
+          <w:iCs/>
+        </w:rPr>
+        <w:t xml:space="preserve"> </w:t>
+      </w:r>
+      <w:r>
+        <w:rPr>
+          <w:i/>
+          <w:iCs/>
+        </w:rPr>
+        <w:t xml:space="preserve">and</w:t>
+      </w:r>
+      <w:r>
+        <w:rPr>
+          <w:i/>
+          <w:iCs/>
+        </w:rPr>
+        <w:t xml:space="preserve"> </w:t>
+      </w:r>
+      <w:r>
+        <w:rPr>
+          <w:i/>
+          <w:iCs/>
+        </w:rPr>
+        <w:t xml:space="preserve">Evolution</w:t>
+      </w:r>
+      <w:r>
+        <w:t xml:space="preserve">. Oxford, UK: Oxford University Press.</w:t>
+      </w:r>
+    </w:p>
+    <w:bookmarkEnd w:id="124"/>
+    <w:bookmarkStart w:id="126" w:name="ref-wickham2019"/>
+    <w:p>
+      <w:pPr>
+        <w:pStyle w:val="Bibliography"/>
+      </w:pPr>
+      <w:r>
+        <w:t xml:space="preserve">Wickham, Hadley, Mara Averick, Jennifer Bryan, Winston Chang, Lucy D’Agostino McGowan, Romain François, Garrett Grolemund, et al. 2019.</w:t>
+      </w:r>
+      <w:r>
+        <w:t xml:space="preserve"> </w:t>
+      </w:r>
+      <w:r>
+        <w:t xml:space="preserve">“Welcome to the</w:t>
+      </w:r>
+      <w:r>
+        <w:t xml:space="preserve"> </w:t>
+      </w:r>
+      <w:r>
+        <w:t xml:space="preserve">Tidyverse</w:t>
+      </w:r>
+      <w:r>
+        <w:t xml:space="preserve">.”</w:t>
+      </w:r>
+      <w:r>
+        <w:t xml:space="preserve"> </w:t>
+      </w:r>
+      <w:r>
+        <w:rPr>
+          <w:i/>
+          <w:iCs/>
+        </w:rPr>
+        <w:t xml:space="preserve">J. Open Source Softw.</w:t>
+      </w:r>
+      <w:r>
+        <w:t xml:space="preserve"> </w:t>
+      </w:r>
+      <w:r>
+        <w:t xml:space="preserve">4 (43): 1686.</w:t>
+      </w:r>
+      <w:r>
+        <w:t xml:space="preserve"> </w:t>
+      </w:r>
+      <w:hyperlink r:id="rId125">
+        <w:r>
+          <w:rPr>
+            <w:rStyle w:val="Hyperlink"/>
+          </w:rPr>
+          <w:t xml:space="preserve">https://doi.org/10.21105/joss.01686</w:t>
+        </w:r>
+      </w:hyperlink>
+      <w:r>
+        <w:t xml:space="preserve">.</w:t>
+      </w:r>
+    </w:p>
+    <w:bookmarkEnd w:id="126"/>
+    <w:bookmarkStart w:id="128" w:name="ref-wilson2019"/>
+    <w:p>
+      <w:pPr>
+        <w:pStyle w:val="Bibliography"/>
+      </w:pPr>
+      <w:r>
+        <w:t xml:space="preserve">Wilson, Alexander D. M., and Clint D. Kelly. 2019.</w:t>
+      </w:r>
+      <w:r>
+        <w:t xml:space="preserve"> </w:t>
+      </w:r>
+      <w:r>
+        <w:t xml:space="preserve">“Do Alternative Reproductive Strategies in the</w:t>
+      </w:r>
+      <w:r>
+        <w:t xml:space="preserve"> </w:t>
+      </w:r>
+      <w:r>
+        <w:t xml:space="preserve">Ellington Tree Weta Represent Different Behavioural Types?”</w:t>
+      </w:r>
+      <w:r>
+        <w:t xml:space="preserve"> </w:t>
+      </w:r>
+      <w:r>
+        <w:rPr>
+          <w:i/>
+          <w:iCs/>
+        </w:rPr>
+        <w:t xml:space="preserve">Ethology</w:t>
+      </w:r>
+      <w:r>
+        <w:t xml:space="preserve"> </w:t>
+      </w:r>
+      <w:r>
+        <w:t xml:space="preserve">125 (6): 380–91.</w:t>
+      </w:r>
+      <w:r>
+        <w:t xml:space="preserve"> </w:t>
+      </w:r>
+      <w:hyperlink r:id="rId127">
+        <w:r>
+          <w:rPr>
+            <w:rStyle w:val="Hyperlink"/>
+          </w:rPr>
+          <w:t xml:space="preserve">https://doi.org/10.1111/eth.12862</w:t>
+        </w:r>
+      </w:hyperlink>
+      <w:r>
+        <w:t xml:space="preserve">.</w:t>
+      </w:r>
+    </w:p>
+    <w:bookmarkEnd w:id="128"/>
+    <w:bookmarkEnd w:id="129"/>
+    <w:p>
+      <w:r>
+        <w:br w:type="page"/>
+      </w:r>
+    </w:p>
+    <w:bookmarkEnd w:id="130"/>
+    <w:bookmarkStart w:id="138" w:name="tables"/>
     <w:p>
       <w:pPr>
         <w:pStyle w:val="Heading1"/>
@@ -5494,7 +7627,7 @@
       <w:tr>
         <w:tc>
           <w:tcPr/>
-          <w:bookmarkStart w:id="65" w:name="tbl-group-summary"/>
+          <w:bookmarkStart w:id="131" w:name="tbl-group-summary"/>
           <w:p>
             <w:pPr>
               <w:jc w:val="center"/>
@@ -7162,7 +9295,7 @@
               </w:tc>
             </w:tr>
           </w:tbl>
-          <w:bookmarkEnd w:id="65"/>
+          <w:bookmarkEnd w:id="131"/>
         </w:tc>
       </w:tr>
     </w:tbl>
@@ -7184,7 +9317,7 @@
       <w:tr>
         <w:tc>
           <w:tcPr/>
-          <w:bookmarkStart w:id="66" w:name="tbl-leg-contrasts"/>
+          <w:bookmarkStart w:id="132" w:name="tbl-leg-contrasts"/>
           <w:p>
             <w:pPr>
               <w:jc w:val="center"/>
@@ -10497,7 +12630,7 @@
               </w:tc>
             </w:tr>
           </w:tbl>
-          <w:bookmarkEnd w:id="66"/>
+          <w:bookmarkEnd w:id="132"/>
         </w:tc>
       </w:tr>
     </w:tbl>
@@ -10519,7 +12652,7 @@
       <w:tr>
         <w:tc>
           <w:tcPr/>
-          <w:bookmarkStart w:id="67" w:name="tbl-leg-slopes"/>
+          <w:bookmarkStart w:id="133" w:name="tbl-leg-slopes"/>
           <w:p>
             <w:pPr>
               <w:jc w:val="center"/>
@@ -14117,7 +16250,7 @@
               </w:tc>
             </w:tr>
           </w:tbl>
-          <w:bookmarkEnd w:id="67"/>
+          <w:bookmarkEnd w:id="133"/>
         </w:tc>
       </w:tr>
     </w:tbl>
@@ -14139,7 +16272,7 @@
       <w:tr>
         <w:tc>
           <w:tcPr/>
-          <w:bookmarkStart w:id="68" w:name="tbl-segment-tests"/>
+          <w:bookmarkStart w:id="134" w:name="tbl-segment-tests"/>
           <w:p>
             <w:pPr>
               <w:jc w:val="center"/>
@@ -16465,7 +18598,7 @@
               </w:tc>
             </w:tr>
           </w:tbl>
-          <w:bookmarkEnd w:id="68"/>
+          <w:bookmarkEnd w:id="134"/>
         </w:tc>
       </w:tr>
     </w:tbl>
@@ -16487,7 +18620,7 @@
       <w:tr>
         <w:tc>
           <w:tcPr/>
-          <w:bookmarkStart w:id="69" w:name="tbl-weapon-leg-slopes"/>
+          <w:bookmarkStart w:id="135" w:name="tbl-weapon-leg-slopes"/>
           <w:p>
             <w:pPr>
               <w:jc w:val="center"/>
@@ -20787,7 +22920,7 @@
               </w:tc>
             </w:tr>
           </w:tbl>
-          <w:bookmarkEnd w:id="69"/>
+          <w:bookmarkEnd w:id="135"/>
         </w:tc>
       </w:tr>
     </w:tbl>
@@ -20809,7 +22942,7 @@
       <w:tr>
         <w:tc>
           <w:tcPr/>
-          <w:bookmarkStart w:id="70" w:name="tbl-ear-means"/>
+          <w:bookmarkStart w:id="136" w:name="tbl-ear-means"/>
           <w:p>
             <w:pPr>
               <w:jc w:val="center"/>
@@ -21937,7 +24070,7 @@
               </w:tc>
             </w:tr>
           </w:tbl>
-          <w:bookmarkEnd w:id="70"/>
+          <w:bookmarkEnd w:id="136"/>
         </w:tc>
       </w:tr>
     </w:tbl>
@@ -21959,7 +24092,7 @@
       <w:tr>
         <w:tc>
           <w:tcPr/>
-          <w:bookmarkStart w:id="71" w:name="tbl-eye-means"/>
+          <w:bookmarkStart w:id="137" w:name="tbl-eye-means"/>
           <w:p>
             <w:pPr>
               <w:jc w:val="center"/>
@@ -23087,7 +25220,7 @@
               </w:tc>
             </w:tr>
           </w:tbl>
-          <w:bookmarkEnd w:id="71"/>
+          <w:bookmarkEnd w:id="137"/>
         </w:tc>
       </w:tr>
     </w:tbl>
@@ -23096,8 +25229,8 @@
         <w:br w:type="page"/>
       </w:r>
     </w:p>
-    <w:bookmarkEnd w:id="72"/>
-    <w:bookmarkStart w:id="93" w:name="figures"/>
+    <w:bookmarkEnd w:id="138"/>
+    <w:bookmarkStart w:id="159" w:name="figures"/>
     <w:p>
       <w:pPr>
         <w:pStyle w:val="Heading1"/>
@@ -23119,7 +25252,7 @@
       <w:tr>
         <w:tc>
           <w:tcPr/>
-          <w:bookmarkStart w:id="76" w:name="fig-adjusted-legs"/>
+          <w:bookmarkStart w:id="142" w:name="fig-adjusted-legs"/>
           <w:p>
             <w:pPr>
               <w:pStyle w:val="Compact"/>
@@ -23130,18 +25263,18 @@
                 <wp:inline>
                   <wp:extent cx="5969000" cy="3316111"/>
                   <wp:effectExtent b="0" l="0" r="0" t="0"/>
-                  <wp:docPr descr="" title="" id="74" name="Picture"/>
+                  <wp:docPr descr="" title="" id="140" name="Picture"/>
                   <a:graphic>
                     <a:graphicData uri="http://schemas.openxmlformats.org/drawingml/2006/picture">
                       <pic:pic>
                         <pic:nvPicPr>
-                          <pic:cNvPr descr="analysis_outputs/weta_trait_analysis/figures/adjusted_leg_means.png" id="75" name="Picture"/>
+                          <pic:cNvPr descr="analysis_outputs/weta_trait_analysis/figures/adjusted_leg_means.png" id="141" name="Picture"/>
                           <pic:cNvPicPr>
                             <a:picLocks noChangeArrowheads="1" noChangeAspect="1"/>
                           </pic:cNvPicPr>
                         </pic:nvPicPr>
                         <pic:blipFill>
-                          <a:blip r:embed="rId73"/>
+                          <a:blip r:embed="rId139"/>
                           <a:stretch>
                             <a:fillRect/>
                           </a:stretch>
@@ -23181,7 +25314,7 @@
               <w:t xml:space="preserve">Figure 1: Size-adjusted predicted foreleg, midleg, and hindleg lengths for females and the three male morphotypes at a pronotum length of 7.2 mm. Error bars are 95% confidence intervals.</w:t>
             </w:r>
           </w:p>
-          <w:bookmarkEnd w:id="76"/>
+          <w:bookmarkEnd w:id="142"/>
         </w:tc>
       </w:tr>
     </w:tbl>
@@ -23203,7 +25336,7 @@
       <w:tr>
         <w:tc>
           <w:tcPr/>
-          <w:bookmarkStart w:id="80" w:name="fig-leg-allometries"/>
+          <w:bookmarkStart w:id="146" w:name="fig-leg-allometries"/>
           <w:p>
             <w:pPr>
               <w:pStyle w:val="Compact"/>
@@ -23214,18 +25347,18 @@
                 <wp:inline>
                   <wp:extent cx="5969000" cy="4642555"/>
                   <wp:effectExtent b="0" l="0" r="0" t="0"/>
-                  <wp:docPr descr="" title="" id="78" name="Picture"/>
+                  <wp:docPr descr="" title="" id="144" name="Picture"/>
                   <a:graphic>
                     <a:graphicData uri="http://schemas.openxmlformats.org/drawingml/2006/picture">
                       <pic:pic>
                         <pic:nvPicPr>
-                          <pic:cNvPr descr="analysis_outputs/weta_trait_analysis/figures/leg_allometries.png" id="79" name="Picture"/>
+                          <pic:cNvPr descr="analysis_outputs/weta_trait_analysis/figures/leg_allometries.png" id="145" name="Picture"/>
                           <pic:cNvPicPr>
                             <a:picLocks noChangeArrowheads="1" noChangeAspect="1"/>
                           </pic:cNvPicPr>
                         </pic:nvPicPr>
                         <pic:blipFill>
-                          <a:blip r:embed="rId77"/>
+                          <a:blip r:embed="rId143"/>
                           <a:stretch>
                             <a:fillRect/>
                           </a:stretch>
@@ -23265,7 +25398,7 @@
               <w:t xml:space="preserve">Figure 2: Log–log relationships between pronotum length and total foreleg, midleg, and hindleg length in females and the three male morphotypes.</w:t>
             </w:r>
           </w:p>
-          <w:bookmarkEnd w:id="80"/>
+          <w:bookmarkEnd w:id="146"/>
         </w:tc>
       </w:tr>
     </w:tbl>
@@ -23287,7 +25420,7 @@
       <w:tr>
         <w:tc>
           <w:tcPr/>
-          <w:bookmarkStart w:id="84" w:name="fig-weapon-leg"/>
+          <w:bookmarkStart w:id="150" w:name="fig-weapon-leg"/>
           <w:p>
             <w:pPr>
               <w:pStyle w:val="Compact"/>
@@ -23298,18 +25431,18 @@
                 <wp:inline>
                   <wp:extent cx="5969000" cy="4642555"/>
                   <wp:effectExtent b="0" l="0" r="0" t="0"/>
-                  <wp:docPr descr="" title="" id="82" name="Picture"/>
+                  <wp:docPr descr="" title="" id="148" name="Picture"/>
                   <a:graphic>
                     <a:graphicData uri="http://schemas.openxmlformats.org/drawingml/2006/picture">
                       <pic:pic>
                         <pic:nvPicPr>
-                          <pic:cNvPr descr="analysis_outputs/weta_trait_analysis/figures/head_leg_compensation.png" id="83" name="Picture"/>
+                          <pic:cNvPr descr="analysis_outputs/weta_trait_analysis/figures/head_leg_compensation.png" id="149" name="Picture"/>
                           <pic:cNvPicPr>
                             <a:picLocks noChangeArrowheads="1" noChangeAspect="1"/>
                           </pic:cNvPicPr>
                         </pic:nvPicPr>
                         <pic:blipFill>
-                          <a:blip r:embed="rId81"/>
+                          <a:blip r:embed="rId147"/>
                           <a:stretch>
                             <a:fillRect/>
                           </a:stretch>
@@ -23349,7 +25482,7 @@
               <w:t xml:space="preserve">Figure 3: Relationship between relative head size (weapon size adjusted for pronotum length) and predicted leg length in females and the three male morphotypes. Lines show partial slopes after accounting for pronotum length.</w:t>
             </w:r>
           </w:p>
-          <w:bookmarkEnd w:id="84"/>
+          <w:bookmarkEnd w:id="150"/>
         </w:tc>
       </w:tr>
     </w:tbl>
@@ -23371,7 +25504,7 @@
       <w:tr>
         <w:tc>
           <w:tcPr/>
-          <w:bookmarkStart w:id="88" w:name="fig-ear-body"/>
+          <w:bookmarkStart w:id="154" w:name="fig-ear-body"/>
           <w:p>
             <w:pPr>
               <w:pStyle w:val="Compact"/>
@@ -23382,18 +25515,18 @@
                 <wp:inline>
                   <wp:extent cx="4775200" cy="3410857"/>
                   <wp:effectExtent b="0" l="0" r="0" t="0"/>
-                  <wp:docPr descr="" title="" id="86" name="Picture"/>
+                  <wp:docPr descr="" title="" id="152" name="Picture"/>
                   <a:graphic>
                     <a:graphicData uri="http://schemas.openxmlformats.org/drawingml/2006/picture">
                       <pic:pic>
                         <pic:nvPicPr>
-                          <pic:cNvPr descr="analysis_outputs/weta_trait_analysis/figures/ear_body_adjusted_means.png" id="87" name="Picture"/>
+                          <pic:cNvPr descr="analysis_outputs/weta_trait_analysis/figures/ear_body_adjusted_means.png" id="153" name="Picture"/>
                           <pic:cNvPicPr>
                             <a:picLocks noChangeArrowheads="1" noChangeAspect="1"/>
                           </pic:cNvPicPr>
                         </pic:nvPicPr>
                         <pic:blipFill>
-                          <a:blip r:embed="rId85"/>
+                          <a:blip r:embed="rId151"/>
                           <a:stretch>
                             <a:fillRect/>
                           </a:stretch>
@@ -23433,7 +25566,7 @@
               <w:t xml:space="preserve">Figure 4: Predicted tympanic organ area adjusted for pronotum length in females and the three male morphotypes. Error bars are 95% confidence intervals.</w:t>
             </w:r>
           </w:p>
-          <w:bookmarkEnd w:id="88"/>
+          <w:bookmarkEnd w:id="154"/>
         </w:tc>
       </w:tr>
     </w:tbl>
@@ -23455,7 +25588,7 @@
       <w:tr>
         <w:tc>
           <w:tcPr/>
-          <w:bookmarkStart w:id="92" w:name="fig-eye-body"/>
+          <w:bookmarkStart w:id="158" w:name="fig-eye-body"/>
           <w:p>
             <w:pPr>
               <w:pStyle w:val="Compact"/>
@@ -23466,18 +25599,18 @@
                 <wp:inline>
                   <wp:extent cx="4775200" cy="3410857"/>
                   <wp:effectExtent b="0" l="0" r="0" t="0"/>
-                  <wp:docPr descr="" title="" id="90" name="Picture"/>
+                  <wp:docPr descr="" title="" id="156" name="Picture"/>
                   <a:graphic>
                     <a:graphicData uri="http://schemas.openxmlformats.org/drawingml/2006/picture">
                       <pic:pic>
                         <pic:nvPicPr>
-                          <pic:cNvPr descr="analysis_outputs/weta_trait_analysis/figures/eye_body_adjusted_means.png" id="91" name="Picture"/>
+                          <pic:cNvPr descr="analysis_outputs/weta_trait_analysis/figures/eye_body_adjusted_means.png" id="157" name="Picture"/>
                           <pic:cNvPicPr>
                             <a:picLocks noChangeArrowheads="1" noChangeAspect="1"/>
                           </pic:cNvPicPr>
                         </pic:nvPicPr>
                         <pic:blipFill>
-                          <a:blip r:embed="rId89"/>
+                          <a:blip r:embed="rId155"/>
                           <a:stretch>
                             <a:fillRect/>
                           </a:stretch>
@@ -23517,7 +25650,7 @@
               <w:t xml:space="preserve">Figure 5: Predicted eye length adjusted for pronotum length in females and the three male morphotypes. Error bars are 95% confidence intervals.</w:t>
             </w:r>
           </w:p>
-          <w:bookmarkEnd w:id="92"/>
+          <w:bookmarkEnd w:id="158"/>
         </w:tc>
       </w:tr>
     </w:tbl>
@@ -23526,8 +25659,8 @@
         <w:br w:type="page"/>
       </w:r>
     </w:p>
-    <w:bookmarkEnd w:id="93"/>
-    <w:bookmarkStart w:id="94" w:name="supplementary-material"/>
+    <w:bookmarkEnd w:id="159"/>
+    <w:bookmarkStart w:id="160" w:name="supplementary-material"/>
     <w:p>
       <w:pPr>
         <w:pStyle w:val="Heading1"/>
@@ -29902,7 +32035,7 @@
         <w:t xml:space="preserve">: 0.524 signed, 0.867 absolute).</w:t>
       </w:r>
     </w:p>
-    <w:bookmarkEnd w:id="94"/>
+    <w:bookmarkEnd w:id="160"/>
     <w:sectPr>
       <w:headerReference r:id="rId10" w:type="even"/>
       <w:headerReference r:id="rId9" w:type="default"/>

</xml_diff>

<commit_message>
Minor edits to title.
</commit_message>
<xml_diff>
--- a/kelly_2026_weta_morph_investment_updated.docx
+++ b/kelly_2026_weta_morph_investment_updated.docx
@@ -83,25 +83,7 @@
         <w:pStyle w:val="FirstParagraph"/>
       </w:pPr>
       <w:r>
-        <w:t xml:space="preserve">Alternative mating strategies allow males to achieve reproductive success through divergent solutions to competition for mates. In many species, large or well-armed males defend females or reproductive resources, whereas smaller males avoid direct contests and obtain matings through sneaking, satellite behaviour or active searching</w:t>
-      </w:r>
-      <w:r>
-        <w:t xml:space="preserve"> </w:t>
-      </w:r>
-      <w:r>
-        <w:t xml:space="preserve">(Gross 1996; Shuster and Wade 2003; Oliveira, Taborsky, and Brockmann 2008)</w:t>
-      </w:r>
-      <w:r>
-        <w:t xml:space="preserve">. These strategies are frequently associated with conspicuous differences in body size and weaponry, but alternative male phenotypes can differ in many additional aspects of morphology, physiology, behaviour and life history. They are therefore better understood as integrated phenotypes than as otherwise similar males differing only in the exaggerated trait used to classify them</w:t>
-      </w:r>
-      <w:r>
-        <w:t xml:space="preserve"> </w:t>
-      </w:r>
-      <w:r>
-        <w:t xml:space="preserve">(West-Eberhard 2003)</w:t>
-      </w:r>
-      <w:r>
-        <w:t xml:space="preserve">. Selection should favour coordinated combinations of traits that facilitate the behaviour and ecological circumstances associated with each strategy.</w:t>
+        <w:t xml:space="preserve">Alternative mating strategies allow males to achieve reproductive success through divergent solutions to competition for mates. In many species, large or well-armed males defend females or reproductive resources, whereas smaller males avoid direct contests and obtain matings through sneaking, satellite behaviour or active searching (Gross 1996; Shuster &amp; Wade 2003; Oliveira et al. 2008). These strategies are frequently associated with conspicuous differences in body size and weaponry, but alternative male phenotypes can differ in many additional aspects of morphology, physiology, behaviour and life history. They are therefore better understood as integrated phenotypes than as otherwise similar males differing only in the exaggerated trait used to classify them (West-Eberhard 2003). Selection should favour coordinated combinations of traits that facilitate the behaviour and ecological circumstances associated with each strategy.</w:t>
       </w:r>
     </w:p>
     <w:p>
@@ -109,43 +91,7 @@
         <w:pStyle w:val="BodyText"/>
       </w:pPr>
       <w:r>
-        <w:t xml:space="preserve">Such phenotypic integration may arise because the development of one structure affects the resources available to others or because selection favours the coordinated expression of functionally complementary traits. Exaggerated sexually selected structures can impose developmental or performance costs that are mitigated by corresponding changes in supporting structures—a process termed secondary sexual trait compensation</w:t>
-      </w:r>
-      <w:r>
-        <w:t xml:space="preserve"> </w:t>
-      </w:r>
-      <w:r>
-        <w:t xml:space="preserve">(Tomkins, Kotiaho, and Lebas 2005; Husak and Swallow 2011)</w:t>
-      </w:r>
-      <w:r>
-        <w:t xml:space="preserve">. Alternatively, investment in an exaggerated structure may occur at the expense of other traits when their development competes for a limited pool of resources</w:t>
-      </w:r>
-      <w:r>
-        <w:t xml:space="preserve"> </w:t>
-      </w:r>
-      <w:r>
-        <w:t xml:space="preserve">(Nijhout and Emlen 1998; Emlen 2001; Moczek and Nijhout 2004)</w:t>
-      </w:r>
-      <w:r>
-        <w:t xml:space="preserve">. A third possibility is that investment in weapons and investment in supporting structures are positively integrated, such that individuals or morphs with larger weapons also invest more in locomotory and sensory traits—an outcome expected when overall phenotypic quality or developmental resources simultaneously elevate multiple traits</w:t>
-      </w:r>
-      <w:r>
-        <w:t xml:space="preserve"> </w:t>
-      </w:r>
-      <w:r>
-        <w:t xml:space="preserve">(Bonduriansky and Day 2003; Tomkins, Kotiaho, and Lebas 2005)</w:t>
-      </w:r>
-      <w:r>
-        <w:t xml:space="preserve">. These processes need not be uniform among male morphs. Developmental switches underlying alternative phenotypes can alter the covariance among traits, producing morph-specific patterns of integration even though the morphs possess the same basic anatomical structures</w:t>
-      </w:r>
-      <w:r>
-        <w:t xml:space="preserve"> </w:t>
-      </w:r>
-      <w:r>
-        <w:t xml:space="preserve">(Snell-Rood et al. 2010; Rohner, Macagno, and Moczek 2020)</w:t>
-      </w:r>
-      <w:r>
-        <w:t xml:space="preserve">.</w:t>
+        <w:t xml:space="preserve">Such phenotypic integration may arise because the development of one structure affects the resources available to others or because selection favours the coordinated expression of functionally complementary traits. Exaggerated sexually selected structures can impose developmental or performance costs that are mitigated by corresponding changes in supporting structures—a process termed secondary sexual trait compensation (Tomkins et al. 2005; Husak &amp; Swallow 2011). Alternatively, investment in an exaggerated structure may occur at the expense of other traits when their development competes for a limited pool of resources (Nijhout &amp; Emlen 1998; Emlen 2001; Moczek &amp; Nijhout 2004). A third possibility is that investment in weapons and investment in supporting structures are positively integrated, such that individuals or morphs with larger weapons also invest more in locomotory and sensory traits—an outcome expected when overall phenotypic quality or developmental resources simultaneously elevate multiple traits (Bonduriansky &amp; Day 2003; Tomkins et al. 2005). These processes need not be uniform among male morphs. Developmental switches underlying alternative phenotypes can alter the covariance among traits, producing morph-specific patterns of integration even though the morphs possess the same basic anatomical structures (Snell-Rood et al. 2010; Rohner et al. 2020).</w:t>
       </w:r>
     </w:p>
     <w:p>
@@ -153,25 +99,7 @@
         <w:pStyle w:val="BodyText"/>
       </w:pPr>
       <w:r>
-        <w:t xml:space="preserve">Most work on morph-specific integration has focused on weapons and the structures that support their use. In horned dung beetles, for example, horn length is positively integrated with fore- and hindleg morphology, and this integration can be stronger in major than in minor males</w:t>
-      </w:r>
-      <w:r>
-        <w:t xml:space="preserve"> </w:t>
-      </w:r>
-      <w:r>
-        <w:t xml:space="preserve">(Tomkins, Kotiaho, and Lebas 2005; Rohner, Macagno, and Moczek 2020)</w:t>
-      </w:r>
-      <w:r>
-        <w:t xml:space="preserve">, consistent with positive co-expression of weapons and supporting structures in the conventional morph. Similarly, male rhinoceros beetles with relatively long horns also have relatively long wings and foretibiae, potentially improving locomotion and leverage during combat, although horn size is unrelated to eye size after accounting for body size</w:t>
-      </w:r>
-      <w:r>
-        <w:t xml:space="preserve"> </w:t>
-      </w:r>
-      <w:r>
-        <w:t xml:space="preserve">(McCullough and Emlen 2013)</w:t>
-      </w:r>
-      <w:r>
-        <w:t xml:space="preserve">. By contrast, in the male-dimorphic stag beetle</w:t>
+        <w:t xml:space="preserve">Most work on morph-specific integration has focused on weapons and the structures that support their use. In horned dung beetles, for example, horn length is positively integrated with fore- and hindleg morphology, and this integration can be stronger in major than in minor males (Tomkins et al. 2005; Rohner et al. 2020), consistent with positive co-expression of weapons and supporting structures in the conventional morph. Similarly, male rhinoceros beetles with relatively long horns also have relatively long wings and foretibiae, potentially improving locomotion and leverage during combat, although horn size is unrelated to eye size after accounting for body size (McCullough &amp; Emlen 2013). By contrast, in the male-dimorphic stag beetle</w:t>
       </w:r>
       <w:r>
         <w:t xml:space="preserve"> </w:t>
@@ -184,16 +112,7 @@
         <w:t xml:space="preserve">Prosopocoilus inclinatus</w:t>
       </w:r>
       <w:r>
-        <w:t xml:space="preserve">, weapon size is integrated with eye size in major males but with foreleg length in minor males</w:t>
-      </w:r>
-      <w:r>
-        <w:t xml:space="preserve"> </w:t>
-      </w:r>
-      <w:r>
-        <w:t xml:space="preserve">(Ito, Ohkubo, and Hasegawa 2017)</w:t>
-      </w:r>
-      <w:r>
-        <w:t xml:space="preserve">, suggesting that the traits co-expressed with weaponry can differ between morphs rather than being uniformly larger in the morph with the largest weapons. These findings show that weapon exaggeration can be accompanied by coordinated changes in other traits, but that the pattern and direction of integration need not be predictable from weapon size alone.</w:t>
+        <w:t xml:space="preserve">, weapon size is integrated with eye size in major males but with foreleg length in minor males (Ito et al. 2017), suggesting that the traits co-expressed with weaponry can differ between morphs rather than being uniformly larger in the morph with the largest weapons. These findings show that weapon exaggeration can be accompanied by coordinated changes in other traits, but that the pattern and direction of integration need not be predictable from weapon size alone.</w:t>
       </w:r>
     </w:p>
     <w:p>
@@ -201,16 +120,7 @@
         <w:pStyle w:val="BodyText"/>
       </w:pPr>
       <w:r>
-        <w:t xml:space="preserve">Locomotor and sensory traits should be especially relevant to alternative mating strategies because males must both locate mating opportunities and gain access to them. The spatial distribution of receptive females can generate a fundamental contrast between remaining with and defending current mates and searching for additional mates</w:t>
-      </w:r>
-      <w:r>
-        <w:t xml:space="preserve"> </w:t>
-      </w:r>
-      <w:r>
-        <w:t xml:space="preserve">(Shuster and Wade 2003)</w:t>
-      </w:r>
-      <w:r>
-        <w:t xml:space="preserve">. Males that patrol widely or move among defended mating sites may consequently benefit from locomotor structures that enhance movement, whereas males that defend females may benefit from appendages that provide support or leverage during combat. Sensory demands may also differ among strategies, though the direction of morph differences is not predetermined. In the desert bee</w:t>
+        <w:t xml:space="preserve">Locomotor and sensory traits should be especially relevant to alternative mating strategies because males must both locate mating opportunities and gain access to them. The spatial distribution of receptive females can generate a fundamental contrast between remaining with and defending current mates and searching for additional mates (Shuster &amp; Wade 2003). Males that patrol widely or move among defended mating sites may consequently benefit from locomotor structures that enhance movement, whereas males that defend females may benefit from appendages that provide support or leverage during combat. Sensory demands may also differ among strategies, though the direction of morph differences is not predetermined. In the desert bee</w:t>
       </w:r>
       <w:r>
         <w:t xml:space="preserve"> </w:t>
@@ -223,16 +133,7 @@
         <w:t xml:space="preserve">Centris pallida</w:t>
       </w:r>
       <w:r>
-        <w:t xml:space="preserve">, small males rely primarily on vision for mate detection while large males use chemosensory cues; correspondingly, small males possess relatively larger eyes despite their smaller body size</w:t>
-      </w:r>
-      <w:r>
-        <w:t xml:space="preserve"> </w:t>
-      </w:r>
-      <w:r>
-        <w:t xml:space="preserve">(Meghan Barrett et al. 2021; M. Barrett and O’Donnell 2026)</w:t>
-      </w:r>
-      <w:r>
-        <w:t xml:space="preserve">, consistent with enhanced sensory investment in the morph that actively searches for mates. However, if conventional males require accurate sensory assessment of rivals or of gallery quality to defend harems effectively, the direction of morph differences in sensory investment could be reversed. Few studies have examined locomotor and sensory traits together within a single species to determine whether such differences represent coordinated phenotypic divergence or trait-specific responses to the demands of each strategy.</w:t>
+        <w:t xml:space="preserve">, small males rely primarily on vision for mate detection while large males use chemosensory cues; correspondingly, small males possess relatively larger eyes despite their smaller body size (Barrett et al. 2021; Barrett &amp; O’Donnell 2026), consistent with enhanced sensory investment in the morph that actively searches for mates. However, if conventional males require accurate sensory assessment of rivals or of gallery quality to defend harems effectively, the direction of morph differences in sensory investment could be reversed. Few studies have examined locomotor and sensory traits together within a single species to determine whether such differences represent coordinated phenotypic divergence or trait-specific responses to the demands of each strategy.</w:t>
       </w:r>
     </w:p>
     <w:p>
@@ -253,43 +154,7 @@
         <w:t xml:space="preserve">Hemideina crassidens</w:t>
       </w:r>
       <w:r>
-        <w:t xml:space="preserve">, provides an opportunity to address this question. This flightless, nocturnal orthopteran is harem-polygynous, and females shelter communally in cavities in trees, hereafter galleries. Males use their enlarged heads and mandibles as weapons in contests for control of female-occupied galleries, and males with larger weapons generally have an advantage during escalated fights</w:t>
-      </w:r>
-      <w:r>
-        <w:t xml:space="preserve"> </w:t>
-      </w:r>
-      <w:r>
-        <w:t xml:space="preserve">(Kelly 2005, 2006; Kelly and Adams 2010)</w:t>
-      </w:r>
-      <w:r>
-        <w:t xml:space="preserve">. Males express three genetically polymorphic, irreversible morphotypes through maturation at the eighth, ninth or tenth juvenile instar</w:t>
-      </w:r>
-      <w:r>
-        <w:t xml:space="preserve"> </w:t>
-      </w:r>
-      <w:r>
-        <w:t xml:space="preserve">(Nason and Kelly 2020; Kelly 2024)</w:t>
-      </w:r>
-      <w:r>
-        <w:t xml:space="preserve">. Large tenth-instar males possess the most exaggerated weaponry and commonly fight for control of galleries. Small eighth-instar males possess much smaller weapons and may circumvent larger defenders to obtain copulations or search vegetation for undefended females, whereas ninth-instar males exhibit an intermediate strategy that combines fighting and sneaking depending on the social context</w:t>
-      </w:r>
-      <w:r>
-        <w:t xml:space="preserve"> </w:t>
-      </w:r>
-      <w:r>
-        <w:t xml:space="preserve">(Wilson and Kelly 2019; Kelly 2025)</w:t>
-      </w:r>
-      <w:r>
-        <w:t xml:space="preserve">. The three strategies attain similar average reproductive fitness, consistent with their maintenance as a balanced polymorphism</w:t>
-      </w:r>
-      <w:r>
-        <w:t xml:space="preserve"> </w:t>
-      </w:r>
-      <w:r>
-        <w:t xml:space="preserve">(Nason and Kelly 2020)</w:t>
-      </w:r>
-      <w:r>
-        <w:t xml:space="preserve">.</w:t>
+        <w:t xml:space="preserve">, provides an opportunity to address this question. This flightless, nocturnal orthopteran is harem-polygynous, and females shelter communally in cavities in trees, hereafter galleries. Males use their enlarged heads and mandibles as weapons in contests for control of female-occupied galleries, and males with larger weapons generally have an advantage during escalated fights (Kelly 2005, 2006; Kelly &amp; Adams 2010). Males express three genetically polymorphic, irreversible morphotypes through maturation at the eighth, ninth or tenth juvenile instar (Nason &amp; Kelly 2020; Kelly 2024). Large tenth-instar males possess the most exaggerated weaponry and commonly fight for control of galleries. Small eighth-instar males possess much smaller weapons and may circumvent larger defenders to obtain copulations or search vegetation for undefended females, whereas ninth-instar males exhibit an intermediate strategy that combines fighting and sneaking depending on the social context (Wilson &amp; Kelly 2019; Kelly 2025). The three strategies attain similar average reproductive fitness, consistent with their maintenance as a balanced polymorphism (Nason &amp; Kelly 2020).</w:t>
       </w:r>
     </w:p>
     <w:p>
@@ -444,34 +309,42 @@
         <w:pStyle w:val="BodyText"/>
       </w:pPr>
       <w:r>
-        <w:t xml:space="preserve">Adult males were assigned to eighth-, ninth- or tenth-instar morphotypes from their head lengths following</w:t>
+        <w:t xml:space="preserve">Adult males were assigned to eighth-, ninth- or tenth-instar morphotypes from their head lengths using the morph-specific distribution parameters established for this population by Kelly</w:t>
       </w:r>
       <w:r>
         <w:t xml:space="preserve"> </w:t>
       </w:r>
       <w:r>
-        <w:t xml:space="preserve">Kelly and Adams (2010)</w:t>
+        <w:t xml:space="preserve">(</w:t>
+      </w:r>
+      <w:r>
+        <w:rPr>
+          <w:b/>
+          <w:bCs/>
+        </w:rPr>
+        <w:t xml:space="preserve">Kelly2025?</w:t>
+      </w:r>
+      <w:r>
+        <w:t xml:space="preserve">)</w:t>
+      </w:r>
+      <w:r>
+        <w:t xml:space="preserve">. These parameters were derived from a trimodal mixture model of male head length</w:t>
       </w:r>
       <w:r>
         <w:t xml:space="preserve"> </w:t>
       </w:r>
       <w:r>
-        <w:t xml:space="preserve">and</w:t>
-      </w:r>
-      <w:r>
-        <w:t xml:space="preserve"> </w:t>
-      </w:r>
-      <w:r>
-        <w:t xml:space="preserve">Kelly (2026)</w:t>
-      </w:r>
-      <w:r>
-        <w:t xml:space="preserve">. The later parameters were derived from a trimodal mixture model of male head length</w:t>
-      </w:r>
-      <w:r>
-        <w:t xml:space="preserve"> </w:t>
-      </w:r>
-      <w:r>
-        <w:t xml:space="preserve">(Kelly 2026)</w:t>
+        <w:t xml:space="preserve">(</w:t>
+      </w:r>
+      <w:r>
+        <w:rPr>
+          <w:b/>
+          <w:bCs/>
+        </w:rPr>
+        <w:t xml:space="preserve">Kelly2025?</w:t>
+      </w:r>
+      <w:r>
+        <w:t xml:space="preserve">)</w:t>
       </w:r>
       <w:r>
         <w:t xml:space="preserve">.</w:t>
@@ -514,7 +387,17 @@
         <w:t xml:space="preserve"> </w:t>
       </w:r>
       <w:r>
-        <w:t xml:space="preserve">(Schindelin et al. 2012)</w:t>
+        <w:t xml:space="preserve">(</w:t>
+      </w:r>
+      <w:r>
+        <w:rPr>
+          <w:b/>
+          <w:bCs/>
+        </w:rPr>
+        <w:t xml:space="preserve">Schindelin2012?</w:t>
+      </w:r>
+      <w:r>
+        <w:t xml:space="preserve">)</w:t>
       </w:r>
       <w:r>
         <w:t xml:space="preserve">. All linear traits were measured using the straight-line tool, with measurement endpoints defined by consistent anatomical landmarks illustrated in Figure 1. Ear area was measured by tracing the perimeter of the tympanal membrane using the freehand selection tool.</w:t>
@@ -809,12 +692,6 @@
         <w:t xml:space="preserve">rptR</w:t>
       </w:r>
       <w:r>
-        <w:t xml:space="preserve"> </w:t>
-      </w:r>
-      <w:r>
-        <w:t xml:space="preserve">(Stoffel, Nakagawa, and Schielzeth 2017)</w:t>
-      </w:r>
-      <w:r>
         <w:t xml:space="preserve">. Ninety-five per cent confidence intervals were obtained from 1,000 parametric bootstrap replicates. Because females and the three male morphs differ substantially in mean morphology, each analysis was repeated with morph included as a fixed effect. These adjusted estimates quantify repeatability among individuals after removing average differences among morphs. A further model included both morph and measurement round as fixed effects to estimate consistency after accounting for systematic session differences.</w:t>
       </w:r>
     </w:p>
@@ -931,7 +808,17 @@
         <w:t xml:space="preserve"> </w:t>
       </w:r>
       <w:r>
-        <w:t xml:space="preserve">(R Core Team 2025)</w:t>
+        <w:t xml:space="preserve">(</w:t>
+      </w:r>
+      <w:r>
+        <w:rPr>
+          <w:b/>
+          <w:bCs/>
+        </w:rPr>
+        <w:t xml:space="preserve">R-base?</w:t>
+      </w:r>
+      <w:r>
+        <w:t xml:space="preserve">)</w:t>
       </w:r>
       <w:r>
         <w:t xml:space="preserve">. Data preparation and visualization were performed using the</w:t>
@@ -950,7 +837,17 @@
         <w:t xml:space="preserve"> </w:t>
       </w:r>
       <w:r>
-        <w:t xml:space="preserve">(Wickham et al. 2019)</w:t>
+        <w:t xml:space="preserve">(</w:t>
+      </w:r>
+      <w:r>
+        <w:rPr>
+          <w:b/>
+          <w:bCs/>
+        </w:rPr>
+        <w:t xml:space="preserve">R-tidyverse?</w:t>
+      </w:r>
+      <w:r>
+        <w:t xml:space="preserve">)</w:t>
       </w:r>
       <w:r>
         <w:t xml:space="preserve">. Ordinary least-squares models were fitted using base R. Linear mixed-effects models were fitted using</w:t>
@@ -969,7 +866,17 @@
         <w:t xml:space="preserve"> </w:t>
       </w:r>
       <w:r>
-        <w:t xml:space="preserve">(Bates et al. 2015)</w:t>
+        <w:t xml:space="preserve">(</w:t>
+      </w:r>
+      <w:r>
+        <w:rPr>
+          <w:b/>
+          <w:bCs/>
+        </w:rPr>
+        <w:t xml:space="preserve">R-lme4?</w:t>
+      </w:r>
+      <w:r>
+        <w:t xml:space="preserve">)</w:t>
       </w:r>
       <w:r>
         <w:t xml:space="preserve"> </w:t>
@@ -991,7 +898,17 @@
         <w:t xml:space="preserve"> </w:t>
       </w:r>
       <w:r>
-        <w:t xml:space="preserve">(Kuznetsova, Brockhoff, and Christensen 2017)</w:t>
+        <w:t xml:space="preserve">(</w:t>
+      </w:r>
+      <w:r>
+        <w:rPr>
+          <w:b/>
+          <w:bCs/>
+        </w:rPr>
+        <w:t xml:space="preserve">R-lmerTest?</w:t>
+      </w:r>
+      <w:r>
+        <w:t xml:space="preserve">)</w:t>
       </w:r>
       <w:r>
         <w:t xml:space="preserve">. Estimated marginal means, allometric trends and contrasts were calculated using</w:t>
@@ -1010,7 +927,17 @@
         <w:t xml:space="preserve"> </w:t>
       </w:r>
       <w:r>
-        <w:t xml:space="preserve">(Lenth et al. 2019)</w:t>
+        <w:t xml:space="preserve">(</w:t>
+      </w:r>
+      <w:r>
+        <w:rPr>
+          <w:b/>
+          <w:bCs/>
+        </w:rPr>
+        <w:t xml:space="preserve">R-emmeans?</w:t>
+      </w:r>
+      <w:r>
+        <w:t xml:space="preserve">)</w:t>
       </w:r>
       <w:r>
         <w:t xml:space="preserve">, with Kenward–Roger approximations supported by</w:t>
@@ -1029,7 +956,17 @@
         <w:t xml:space="preserve"> </w:t>
       </w:r>
       <w:r>
-        <w:t xml:space="preserve">(Halekoh and Højsgaard 2014)</w:t>
+        <w:t xml:space="preserve">(</w:t>
+      </w:r>
+      <w:r>
+        <w:rPr>
+          <w:b/>
+          <w:bCs/>
+        </w:rPr>
+        <w:t xml:space="preserve">R-pbkrtest?</w:t>
+      </w:r>
+      <w:r>
+        <w:t xml:space="preserve">)</w:t>
       </w:r>
       <w:r>
         <w:t xml:space="preserve">. Model diagnostics and graphical checks were produced using</w:t>
@@ -1048,7 +985,17 @@
         <w:t xml:space="preserve"> </w:t>
       </w:r>
       <w:r>
-        <w:t xml:space="preserve">(Lüdecke, Ben-Shachar, et al. 2021)</w:t>
+        <w:t xml:space="preserve">(</w:t>
+      </w:r>
+      <w:r>
+        <w:rPr>
+          <w:b/>
+          <w:bCs/>
+        </w:rPr>
+        <w:t xml:space="preserve">R-performance?</w:t>
+      </w:r>
+      <w:r>
+        <w:t xml:space="preserve">)</w:t>
       </w:r>
       <w:r>
         <w:t xml:space="preserve">,</w:t>
@@ -1067,7 +1014,17 @@
         <w:t xml:space="preserve"> </w:t>
       </w:r>
       <w:r>
-        <w:t xml:space="preserve">(Lüdecke, Patil, et al. 2021)</w:t>
+        <w:t xml:space="preserve">(</w:t>
+      </w:r>
+      <w:r>
+        <w:rPr>
+          <w:b/>
+          <w:bCs/>
+        </w:rPr>
+        <w:t xml:space="preserve">R-see?</w:t>
+      </w:r>
+      <w:r>
+        <w:t xml:space="preserve">)</w:t>
       </w:r>
       <w:r>
         <w:t xml:space="preserve"> </w:t>
@@ -1089,7 +1046,17 @@
         <w:t xml:space="preserve"> </w:t>
       </w:r>
       <w:r>
-        <w:t xml:space="preserve">(Robinson 2014)</w:t>
+        <w:t xml:space="preserve">(</w:t>
+      </w:r>
+      <w:r>
+        <w:rPr>
+          <w:b/>
+          <w:bCs/>
+        </w:rPr>
+        <w:t xml:space="preserve">R-broom?</w:t>
+      </w:r>
+      <w:r>
+        <w:t xml:space="preserve">)</w:t>
       </w:r>
       <w:r>
         <w:t xml:space="preserve">. The R version and package versions used in the analysis were recorded using</w:t>
@@ -5117,16 +5084,7 @@
         <w:pStyle w:val="FirstParagraph"/>
       </w:pPr>
       <w:r>
-        <w:t xml:space="preserve">The three male morphs formed a consistent gradient in size-adjusted leg length, with tenth-instar males possessing the longest fore-, mid- and hindlegs and eighth-instar males the shortest. Ninth-instar males were generally intermediate and statistically indistinguishable from the midpoint between the two other male morphs. This morphological intermediacy is consistent with their proposed jack-of-all-trades strategy, in which males can either fight for galleries or circumvent larger competitors depending on the social context</w:t>
-      </w:r>
-      <w:r>
-        <w:t xml:space="preserve"> </w:t>
-      </w:r>
-      <w:r>
-        <w:t xml:space="preserve">(Wilson and Kelly 2019; Kelly 2025)</w:t>
-      </w:r>
-      <w:r>
-        <w:t xml:space="preserve">. It does not, however, indicate that ninth-instar morphology is specifically adapted for behavioural flexibility. An intermediate phenotype could also arise directly from maturation at an intermediate instar. Functional tests are therefore needed to establish whether the morphological position of ninth-instar males enhances their ability to alternate between fighting and searching tactics.</w:t>
+        <w:t xml:space="preserve">The three male morphs formed a consistent gradient in size-adjusted leg length, with tenth-instar males possessing the longest fore-, mid- and hindlegs and eighth-instar males the shortest. Ninth-instar males were generally intermediate and statistically indistinguishable from the midpoint between the two other male morphs. This morphological intermediacy is consistent with their proposed jack-of-all-trades strategy, in which males can either fight for galleries or circumvent larger competitors depending on the social context (Wilson &amp; Kelly 2019; Kelly 2025). It does not, however, indicate that ninth-instar morphology is specifically adapted for behavioural flexibility. An intermediate phenotype could also arise directly from maturation at an intermediate instar. Functional tests are therefore needed to establish whether the morphological position of ninth-instar males enhances their ability to alternate between fighting and searching tactics.</w:t>
       </w:r>
     </w:p>
     <w:p>
@@ -5134,16 +5092,7 @@
         <w:pStyle w:val="BodyText"/>
       </w:pPr>
       <w:r>
-        <w:t xml:space="preserve">Comparisons with females revealed a pattern that was not apparent from comparisons among male morphs alone. All male groups had relatively longer forelegs than females, whereas male–female differences in hindleg length varied from negative in eighth-instar males to positive in tenth-instar males. Consequently, tenth-instar males displayed a pronounced anterior shift in leg allocation relative to females. The anterior legs may contribute to stabilizing the body, maintaining purchase on the substrate or manoeuvring during encounters involving the head and mandibles. Such functions would make disproportionate anterior investment particularly valuable to heavily armed, gallery-defending males. Similar reasoning has been applied to the association between horns and foreleg morphology in dung and rhinoceros beetles, where the legs can provide leverage or support during contests</w:t>
-      </w:r>
-      <w:r>
-        <w:t xml:space="preserve"> </w:t>
-      </w:r>
-      <w:r>
-        <w:t xml:space="preserve">(Tomkins, Kotiaho, and Lebas 2005; McCullough and Emlen 2013)</w:t>
-      </w:r>
-      <w:r>
-        <w:t xml:space="preserve">. Nevertheless, the present data describe morphology rather than mechanical performance, and the proposed role of anterior legs in combat remains to be tested directly.</w:t>
+        <w:t xml:space="preserve">Comparisons with females revealed a pattern that was not apparent from comparisons among male morphs alone. All male groups had relatively longer forelegs than females, whereas male–female differences in hindleg length varied from negative in eighth-instar males to positive in tenth-instar males. Consequently, tenth-instar males displayed a pronounced anterior shift in leg allocation relative to females. The anterior legs may contribute to stabilizing the body, maintaining purchase on the substrate or manoeuvring during encounters involving the head and mandibles. Such functions would make disproportionate anterior investment particularly valuable to heavily armed, gallery-defending males. Similar reasoning has been applied to the association between horns and foreleg morphology in dung and rhinoceros beetles, where the legs can provide leverage or support during contests (Tomkins et al. 2005; McCullough &amp; Emlen 2013). Nevertheless, the present data describe morphology rather than mechanical performance, and the proposed role of anterior legs in combat remains to be tested directly.</w:t>
       </w:r>
     </w:p>
     <w:p>
@@ -5159,16 +5108,7 @@
         <w:pStyle w:val="BodyText"/>
       </w:pPr>
       <w:r>
-        <w:t xml:space="preserve">All leg traits scaled hypoallometrically with pronotum length, meaning that larger individuals within each group possessed proportionally shorter legs. Tenth-instar males generally had the shallowest estimated slopes, although support for specific slope differences was limited primarily to the hindleg comparison between females and tenth-instar males. Thus, the leg differences among groups were driven more consistently by changes in trait elevation at a common body size than by wholesale reprogramming of allometric slopes. This contrasts with weapon allometry in the same population, which differs substantially among male morphs, with eighth-instar weapons scaling more steeply than those of ninth- and tenth-instar males</w:t>
-      </w:r>
-      <w:r>
-        <w:t xml:space="preserve"> </w:t>
-      </w:r>
-      <w:r>
-        <w:t xml:space="preserve">(Kelly 2026)</w:t>
-      </w:r>
-      <w:r>
-        <w:t xml:space="preserve">. Locomotory and weapon morphology therefore need not share the same morph-specific scaling rules, further supporting a modular or mosaic interpretation of morphological divergence.</w:t>
+        <w:t xml:space="preserve">All leg traits scaled hypoallometrically with pronotum length, meaning that larger individuals within each group possessed proportionally shorter legs. Tenth-instar males generally had the shallowest estimated slopes, although support for specific slope differences was limited primarily to the hindleg comparison between females and tenth-instar males. Thus, the leg differences among groups were driven more consistently by changes in trait elevation at a common body size than by wholesale reprogramming of allometric slopes. This contrasts with weapon allometry in the same population, which differs substantially among male morphs, with eighth-instar weapons scaling more steeply than those of ninth- and tenth-instar males (Kelly 2025). Locomotory and weapon morphology therefore need not share the same morph-specific scaling rules, further supporting a modular or mosaic interpretation of morphological divergence.</w:t>
       </w:r>
     </w:p>
     <w:bookmarkEnd w:id="47"/>
@@ -5186,16 +5126,7 @@
         <w:pStyle w:val="FirstParagraph"/>
       </w:pPr>
       <w:r>
-        <w:t xml:space="preserve">Within groups, individuals possessing relatively larger heads generally also possessed relatively longer legs. Eleven of the 12 group-by-leg slopes were clearly positive, and none was negative. These results provide no evidence for the hypothesis that greater investment in weaponry is realized at the expense of locomotory appendages. Instead, they are consistent with positive phenotypic integration between weapons and structures that may support their use. This pattern resembles secondary sexual trait compensation, in which enlargement of a sexual trait is accompanied by enlargement of structures that bear, manoeuvre or otherwise improve the performance of that trait</w:t>
-      </w:r>
-      <w:r>
-        <w:t xml:space="preserve"> </w:t>
-      </w:r>
-      <w:r>
-        <w:t xml:space="preserve">(Tomkins, Kotiaho, and Lebas 2005; Husak and Swallow 2011)</w:t>
-      </w:r>
-      <w:r>
-        <w:t xml:space="preserve">.</w:t>
+        <w:t xml:space="preserve">Within groups, individuals possessing relatively larger heads generally also possessed relatively longer legs. Eleven of the 12 group-by-leg slopes were clearly positive, and none was negative. These results provide no evidence for the hypothesis that greater investment in weaponry is realized at the expense of locomotory appendages. Instead, they are consistent with positive phenotypic integration between weapons and structures that may support their use. This pattern resembles secondary sexual trait compensation, in which enlargement of a sexual trait is accompanied by enlargement of structures that bear, manoeuvre or otherwise improve the performance of that trait (Tomkins et al. 2005; Husak &amp; Swallow 2011).</w:t>
       </w:r>
     </w:p>
     <w:p>
@@ -5203,19 +5134,7 @@
         <w:pStyle w:val="BodyText"/>
       </w:pPr>
       <w:r>
-        <w:t xml:space="preserve">The present results also resemble those reported for the European earwig, another hemimetabolous insect in which male morphs differ in weapon size.</w:t>
-      </w:r>
-      <w:r>
-        <w:t xml:space="preserve"> </w:t>
-      </w:r>
-      <w:r>
-        <w:t xml:space="preserve">Tomkins, Kotiaho, and Lebas (2005)</w:t>
-      </w:r>
-      <w:r>
-        <w:t xml:space="preserve"> </w:t>
-      </w:r>
-      <w:r>
-        <w:t xml:space="preserve">found positive integration between forceps length and hind-femur length in exaggerated macrolabic males, but no evidence that forceps enlargement traded off against the other measured traits. They proposed that morphological trade-offs may be less readily expressed in hemimetabolous insects than in holometabolous taxa because growth is not confined to a closed pupal developmental system. Wellington tree wētā likewise acquire resources and grow through successive nymphal instars, and the uniformly non-negative weapon–leg relationships are consistent with that proposal. This comparison remains tentative, however, because the absence of a negative phenotypic correlation does not demonstrate the absence of an underlying allocation cost. Variation among individuals in resource acquisition can produce positive covariance among costly traits even when those traits compete for resources during development.</w:t>
+        <w:t xml:space="preserve">The present results also resemble those reported for the European earwig, another hemimetabolous insect in which male morphs differ in weapon size. Tomkins et al. (2005) found positive integration between forceps length and hind-femur length in exaggerated macrolabic males, but no evidence that forceps enlargement traded off against the other measured traits. They proposed that morphological trade-offs may be less readily expressed in hemimetabolous insects than in holometabolous taxa because growth is not confined to a closed pupal developmental system. Wellington tree wētā likewise acquire resources and grow through successive nymphal instars, and the uniformly non-negative weapon–leg relationships are consistent with that proposal. This comparison remains tentative, however, because the absence of a negative phenotypic correlation does not demonstrate the absence of an underlying allocation cost. Variation among individuals in resource acquisition can produce positive covariance among costly traits even when those traits compete for resources during development.</w:t>
       </w:r>
     </w:p>
     <w:p>
@@ -5254,16 +5173,7 @@
         <w:t xml:space="preserve">Centris pallida</w:t>
       </w:r>
       <w:r>
-        <w:t xml:space="preserve">, in which small searching males rely more strongly on visual detection and possess relatively larger eyes than large males</w:t>
-      </w:r>
-      <w:r>
-        <w:t xml:space="preserve"> </w:t>
-      </w:r>
-      <w:r>
-        <w:t xml:space="preserve">(Meghan Barrett et al. 2021; M. Barrett and O’Donnell 2026)</w:t>
-      </w:r>
-      <w:r>
-        <w:t xml:space="preserve">. Sensory investment therefore cannot be predicted simply from whether a morph searches actively or defends access to females.</w:t>
+        <w:t xml:space="preserve">, in which small searching males rely more strongly on visual detection and possess relatively larger eyes than large males (Barrett et al. 2021; Barrett &amp; O’Donnell 2026). Sensory investment therefore cannot be predicted simply from whether a morph searches actively or defends access to females.</w:t>
       </w:r>
     </w:p>
     <w:p>
@@ -5271,16 +5181,7 @@
         <w:pStyle w:val="BodyText"/>
       </w:pPr>
       <w:r>
-        <w:t xml:space="preserve">The greater sensory dimensions of tenth-instar males could reflect demands associated with gallery defence, rival assessment or navigation between refuges and mating opportunities. Alternatively, sensory enlargement may form part of a broader developmental programme associated with delayed maturation and increased weapon expression, without having evolved specifically for the tenth-instar mating strategy. The common sensory allometric slopes favour the latter possibility in at least one respect. Morph differences in eye and ear size reflected shifts in elevation rather than differences in how sensory dimensions increased with body size. Thus, each group followed approximately the same scaling relationship but at a different relative level of sensory expression. Similar elevation shifts can generate substantial sexual or morph-specific exaggeration without the evolution of steeper allometric slopes, as recently demonstrated for elongated sensory antennae in crane flies</w:t>
-      </w:r>
-      <w:r>
-        <w:t xml:space="preserve"> </w:t>
-      </w:r>
-      <w:r>
-        <w:t xml:space="preserve">(Hirani and Bonduriansky 2026)</w:t>
-      </w:r>
-      <w:r>
-        <w:t xml:space="preserve">.</w:t>
+        <w:t xml:space="preserve">The greater sensory dimensions of tenth-instar males could reflect demands associated with gallery defence, rival assessment or navigation between refuges and mating opportunities. Alternatively, sensory enlargement may form part of a broader developmental programme associated with delayed maturation and increased weapon expression, without having evolved specifically for the tenth-instar mating strategy. The common sensory allometric slopes favour the latter possibility in at least one respect. Morph differences in eye and ear size reflected shifts in elevation rather than differences in how sensory dimensions increased with body size. Thus, each group followed approximately the same scaling relationship but at a different relative level of sensory expression. Similar elevation shifts can generate substantial sexual or morph-specific exaggeration without the evolution of steeper allometric slopes, as recently demonstrated for elongated sensory antennae in crane flies (Hirani &amp; Bonduriansky 2026).</w:t>
       </w:r>
     </w:p>
     <w:p>
@@ -5322,16 +5223,7 @@
         <w:pStyle w:val="BodyText"/>
       </w:pPr>
       <w:r>
-        <w:t xml:space="preserve">This distinction between among-group divergence and within-group covariance is central to interpreting integrated phenotypes. Traits can differ in parallel among morph means without being tightly integrated among individuals within each morph. Conversely, traits can covary strongly within groups even when the magnitude of that covariance does not differ among strategies. Recent work on an exaggerated male sensory trait likewise found that substantial sexual divergence can be accompanied by developmental decoupling from the rest of the phenotype</w:t>
-      </w:r>
-      <w:r>
-        <w:t xml:space="preserve"> </w:t>
-      </w:r>
-      <w:r>
-        <w:t xml:space="preserve">(Hirani and Bonduriansky 2026)</w:t>
-      </w:r>
-      <w:r>
-        <w:t xml:space="preserve">. Such decoupling may facilitate independent evolutionary change by reducing the extent to which enlargement of one structure alters others. In Wellington tree wētā, sensory traits appear to retain strong coupling with their immediate anatomical substrates while being more weakly connected to variation in weapon investment. Morphological integration is therefore hierarchical: strong locally, positive between weapons and legs, but comparatively weak between weapons and ears within male morphs.</w:t>
+        <w:t xml:space="preserve">This distinction between among-group divergence and within-group covariance is central to interpreting integrated phenotypes. Traits can differ in parallel among morph means without being tightly integrated among individuals within each morph. Conversely, traits can covary strongly within groups even when the magnitude of that covariance does not differ among strategies. Recent work on an exaggerated male sensory trait likewise found that substantial sexual divergence can be accompanied by developmental decoupling from the rest of the phenotype (Hirani &amp; Bonduriansky 2026). Such decoupling may facilitate independent evolutionary change by reducing the extent to which enlargement of one structure alters others. In Wellington tree wētā, sensory traits appear to retain strong coupling with their immediate anatomical substrates while being more weakly connected to variation in weapon investment. Morphological integration is therefore hierarchical: strong locally, positive between weapons and legs, but comparatively weak between weapons and ears within male morphs.</w:t>
       </w:r>
     </w:p>
     <w:bookmarkEnd w:id="50"/>
@@ -5375,16 +5267,7 @@
         <w:pStyle w:val="FirstParagraph"/>
       </w:pPr>
       <w:r>
-        <w:t xml:space="preserve">The genetically polymorphic expression of the three male strategies strengthens the interpretation of among-morph differences. In many insects with alternative male phenotypes, morph identity depends on nutritional condition, making it difficult to distinguish trait specialization from broad differences in resource acquisition. Wellington tree wētā males raised under common conditions nevertheless mature at different instars and express the corresponding weapon morphologies, indicating that morph identity is not simply induced by poor or favourable nutrition</w:t>
-      </w:r>
-      <w:r>
-        <w:t xml:space="preserve"> </w:t>
-      </w:r>
-      <w:r>
-        <w:t xml:space="preserve">(Kelly 2024)</w:t>
-      </w:r>
-      <w:r>
-        <w:t xml:space="preserve">. The leg and sensory differences observed here are therefore less readily explained as incidental consequences of condition-dependent morph determination.</w:t>
+        <w:t xml:space="preserve">The genetically polymorphic expression of the three male strategies strengthens the interpretation of among-morph differences. In many insects with alternative male phenotypes, morph identity depends on nutritional condition, making it difficult to distinguish trait specialization from broad differences in resource acquisition. Wellington tree wētā males raised under common conditions nevertheless mature at different instars and express the corresponding weapon morphologies, indicating that morph identity is not simply induced by poor or favourable nutrition (Kelly 2024). The leg and sensory differences observed here are therefore less readily explained as incidental consequences of condition-dependent morph determination.</w:t>
       </w:r>
     </w:p>
     <w:p>
@@ -5572,7 +5455,7 @@
       </w:r>
     </w:p>
     <w:bookmarkEnd w:id="62"/>
-    <w:bookmarkStart w:id="130" w:name="references"/>
+    <w:bookmarkStart w:id="64" w:name="references"/>
     <w:p>
       <w:pPr>
         <w:pStyle w:val="Heading1"/>
@@ -5581,2031 +5464,15 @@
         <w:t xml:space="preserve">References</w:t>
       </w:r>
     </w:p>
-    <w:bookmarkStart w:id="129" w:name="refs"/>
-    <w:bookmarkStart w:id="64" w:name="ref-barrett2021"/>
+    <w:bookmarkStart w:id="63" w:name="refs"/>
+    <w:bookmarkEnd w:id="63"/>
     <w:p>
-      <w:pPr>
-        <w:pStyle w:val="Bibliography"/>
-      </w:pPr>
-      <w:r>
-        <w:t xml:space="preserve">Barrett, Meghan, Sophi Schneider, Purnima Sachdeva, Angelina Gomez, Stephen Buchmann, and Sean O’Donnell. 2021.</w:t>
-      </w:r>
-      <w:r>
-        <w:t xml:space="preserve"> </w:t>
-      </w:r>
-      <w:r>
-        <w:t xml:space="preserve">“Neuroanatomical Differentiation Associated with Alternative Reproductive Tactics in</w:t>
-      </w:r>
-      <w:r>
-        <w:t xml:space="preserve"> </w:t>
-      </w:r>
-      <w:r>
-        <w:t xml:space="preserve">Male</w:t>
-      </w:r>
-      <w:r>
-        <w:t xml:space="preserve"> </w:t>
-      </w:r>
-      <w:r>
-        <w:t xml:space="preserve">Arid Land Bees,</w:t>
-      </w:r>
-      <w:r>
-        <w:t xml:space="preserve"> </w:t>
-      </w:r>
-      <w:r>
-        <w:rPr>
-          <w:i/>
-          <w:iCs/>
-        </w:rPr>
-        <w:t xml:space="preserve">Centris</w:t>
-      </w:r>
-      <w:r>
-        <w:t xml:space="preserve"> </w:t>
-      </w:r>
-      <w:r>
-        <w:rPr>
-          <w:i/>
-          <w:iCs/>
-        </w:rPr>
-        <w:t xml:space="preserve">Pallida</w:t>
-      </w:r>
-      <w:r>
-        <w:t xml:space="preserve"> </w:t>
-      </w:r>
-      <w:r>
-        <w:t xml:space="preserve">and</w:t>
-      </w:r>
-      <w:r>
-        <w:t xml:space="preserve"> </w:t>
-      </w:r>
-      <w:r>
-        <w:rPr>
-          <w:i/>
-          <w:iCs/>
-        </w:rPr>
-        <w:t xml:space="preserve">Amegilla</w:t>
-      </w:r>
-      <w:r>
-        <w:t xml:space="preserve"> </w:t>
-      </w:r>
-      <w:r>
-        <w:rPr>
-          <w:i/>
-          <w:iCs/>
-        </w:rPr>
-        <w:t xml:space="preserve">Dawsoni</w:t>
-      </w:r>
-      <w:r>
-        <w:t xml:space="preserve">.”</w:t>
-      </w:r>
-      <w:r>
-        <w:t xml:space="preserve"> </w:t>
-      </w:r>
-      <w:r>
-        <w:rPr>
-          <w:i/>
-          <w:iCs/>
-        </w:rPr>
-        <w:t xml:space="preserve">J. Comp. Physiol. A</w:t>
-      </w:r>
-      <w:r>
-        <w:t xml:space="preserve"> </w:t>
-      </w:r>
-      <w:r>
-        <w:t xml:space="preserve">207 (4): 497–504.</w:t>
-      </w:r>
-      <w:r>
-        <w:t xml:space="preserve"> </w:t>
-      </w:r>
-      <w:hyperlink r:id="rId63">
-        <w:r>
-          <w:rPr>
-            <w:rStyle w:val="Hyperlink"/>
-          </w:rPr>
-          <w:t xml:space="preserve">https://doi.org/10.1007/s00359-021-01492-4</w:t>
-        </w:r>
-      </w:hyperlink>
-      <w:r>
-        <w:t xml:space="preserve">.</w:t>
+      <w:r>
+        <w:br w:type="page"/>
       </w:r>
     </w:p>
     <w:bookmarkEnd w:id="64"/>
-    <w:bookmarkStart w:id="66" w:name="ref-barrett2026"/>
-    <w:p>
-      <w:pPr>
-        <w:pStyle w:val="Bibliography"/>
-      </w:pPr>
-      <w:r>
-        <w:t xml:space="preserve">Barrett, M, and S O’Donnell. 2026.</w:t>
-      </w:r>
-      <w:r>
-        <w:t xml:space="preserve"> </w:t>
-      </w:r>
-      <w:r>
-        <w:t xml:space="preserve">“Sex, Head Size, and</w:t>
-      </w:r>
-      <w:r>
-        <w:t xml:space="preserve"> </w:t>
-      </w:r>
-      <w:r>
-        <w:t xml:space="preserve">Male</w:t>
-      </w:r>
-      <w:r>
-        <w:t xml:space="preserve"> </w:t>
-      </w:r>
-      <w:r>
-        <w:t xml:space="preserve">Mate Location Behavior Affect Allometric Scaling of the Eyes in</w:t>
-      </w:r>
-      <w:r>
-        <w:t xml:space="preserve"> </w:t>
-      </w:r>
-      <w:r>
-        <w:rPr>
-          <w:i/>
-          <w:iCs/>
-        </w:rPr>
-        <w:t xml:space="preserve">Centris</w:t>
-      </w:r>
-      <w:r>
-        <w:t xml:space="preserve"> </w:t>
-      </w:r>
-      <w:r>
-        <w:rPr>
-          <w:i/>
-          <w:iCs/>
-        </w:rPr>
-        <w:t xml:space="preserve">Pallida</w:t>
-      </w:r>
-      <w:r>
-        <w:t xml:space="preserve"> </w:t>
-      </w:r>
-      <w:r>
-        <w:t xml:space="preserve">(Hymenoptera: Apidae) Bees.”</w:t>
-      </w:r>
-      <w:r>
-        <w:t xml:space="preserve"> </w:t>
-      </w:r>
-      <w:r>
-        <w:rPr>
-          <w:i/>
-          <w:iCs/>
-        </w:rPr>
-        <w:t xml:space="preserve">Integr. Org. Biol.</w:t>
-      </w:r>
-      <w:r>
-        <w:t xml:space="preserve"> </w:t>
-      </w:r>
-      <w:r>
-        <w:t xml:space="preserve">8 (1): obag016.</w:t>
-      </w:r>
-      <w:r>
-        <w:t xml:space="preserve"> </w:t>
-      </w:r>
-      <w:hyperlink r:id="rId65">
-        <w:r>
-          <w:rPr>
-            <w:rStyle w:val="Hyperlink"/>
-          </w:rPr>
-          <w:t xml:space="preserve">https://doi.org/10.1093/iob/obag016</w:t>
-        </w:r>
-      </w:hyperlink>
-      <w:r>
-        <w:t xml:space="preserve">.</w:t>
-      </w:r>
-    </w:p>
-    <w:bookmarkEnd w:id="66"/>
-    <w:bookmarkStart w:id="68" w:name="ref-bates2015"/>
-    <w:p>
-      <w:pPr>
-        <w:pStyle w:val="Bibliography"/>
-      </w:pPr>
-      <w:r>
-        <w:t xml:space="preserve">Bates, Douglas, Martin Mächler, Ben Bolker, and Steve Walker. 2015.</w:t>
-      </w:r>
-      <w:r>
-        <w:t xml:space="preserve"> </w:t>
-      </w:r>
-      <w:r>
-        <w:t xml:space="preserve">“Fitting Linear Mixed-Effects Models Using Lme4.”</w:t>
-      </w:r>
-      <w:r>
-        <w:t xml:space="preserve"> </w:t>
-      </w:r>
-      <w:r>
-        <w:rPr>
-          <w:i/>
-          <w:iCs/>
-        </w:rPr>
-        <w:t xml:space="preserve">J. Stat. Softw.</w:t>
-      </w:r>
-      <w:r>
-        <w:t xml:space="preserve"> </w:t>
-      </w:r>
-      <w:r>
-        <w:t xml:space="preserve">67 (1): 1–48.</w:t>
-      </w:r>
-      <w:r>
-        <w:t xml:space="preserve"> </w:t>
-      </w:r>
-      <w:hyperlink r:id="rId67">
-        <w:r>
-          <w:rPr>
-            <w:rStyle w:val="Hyperlink"/>
-          </w:rPr>
-          <w:t xml:space="preserve">https://doi.org/10.18637/jss.v067.i01</w:t>
-        </w:r>
-      </w:hyperlink>
-      <w:r>
-        <w:t xml:space="preserve">.</w:t>
-      </w:r>
-    </w:p>
-    <w:bookmarkEnd w:id="68"/>
-    <w:bookmarkStart w:id="69" w:name="ref-bonduriansky2003"/>
-    <w:p>
-      <w:pPr>
-        <w:pStyle w:val="Bibliography"/>
-      </w:pPr>
-      <w:r>
-        <w:t xml:space="preserve">Bonduriansky, R., and Troy Day. 2003.</w:t>
-      </w:r>
-      <w:r>
-        <w:t xml:space="preserve"> </w:t>
-      </w:r>
-      <w:r>
-        <w:t xml:space="preserve">“The Evolution of Static Allometry in Sexually Selected Traits.”</w:t>
-      </w:r>
-      <w:r>
-        <w:t xml:space="preserve"> </w:t>
-      </w:r>
-      <w:r>
-        <w:rPr>
-          <w:i/>
-          <w:iCs/>
-        </w:rPr>
-        <w:t xml:space="preserve">Evolution</w:t>
-      </w:r>
-      <w:r>
-        <w:t xml:space="preserve"> </w:t>
-      </w:r>
-      <w:r>
-        <w:t xml:space="preserve">57 (11): 2450–58.</w:t>
-      </w:r>
-    </w:p>
-    <w:bookmarkEnd w:id="69"/>
-    <w:bookmarkStart w:id="71" w:name="ref-emlen2001a"/>
-    <w:p>
-      <w:pPr>
-        <w:pStyle w:val="Bibliography"/>
-      </w:pPr>
-      <w:r>
-        <w:t xml:space="preserve">Emlen, D. J. 2001.</w:t>
-      </w:r>
-      <w:r>
-        <w:t xml:space="preserve"> </w:t>
-      </w:r>
-      <w:r>
-        <w:t xml:space="preserve">“Costs and the Diversification of Exaggerated Animal Structures.”</w:t>
-      </w:r>
-      <w:r>
-        <w:t xml:space="preserve"> </w:t>
-      </w:r>
-      <w:r>
-        <w:rPr>
-          <w:i/>
-          <w:iCs/>
-        </w:rPr>
-        <w:t xml:space="preserve">Science</w:t>
-      </w:r>
-      <w:r>
-        <w:t xml:space="preserve"> </w:t>
-      </w:r>
-      <w:r>
-        <w:t xml:space="preserve">291 (5508): 1534–36.</w:t>
-      </w:r>
-      <w:r>
-        <w:t xml:space="preserve"> </w:t>
-      </w:r>
-      <w:hyperlink r:id="rId70">
-        <w:r>
-          <w:rPr>
-            <w:rStyle w:val="Hyperlink"/>
-          </w:rPr>
-          <w:t xml:space="preserve">https://doi.org/10.1126/science.1056607</w:t>
-        </w:r>
-      </w:hyperlink>
-      <w:r>
-        <w:t xml:space="preserve">.</w:t>
-      </w:r>
-    </w:p>
-    <w:bookmarkEnd w:id="71"/>
-    <w:bookmarkStart w:id="73" w:name="ref-gross1996"/>
-    <w:p>
-      <w:pPr>
-        <w:pStyle w:val="Bibliography"/>
-      </w:pPr>
-      <w:r>
-        <w:t xml:space="preserve">Gross, M. R. 1996.</w:t>
-      </w:r>
-      <w:r>
-        <w:t xml:space="preserve"> </w:t>
-      </w:r>
-      <w:r>
-        <w:t xml:space="preserve">“Alternative Reproductive Strategies and Tactics: Diversity Within Sexes.”</w:t>
-      </w:r>
-      <w:r>
-        <w:t xml:space="preserve"> </w:t>
-      </w:r>
-      <w:r>
-        <w:rPr>
-          <w:i/>
-          <w:iCs/>
-        </w:rPr>
-        <w:t xml:space="preserve">Trends Ecol Evol</w:t>
-      </w:r>
-      <w:r>
-        <w:t xml:space="preserve"> </w:t>
-      </w:r>
-      <w:r>
-        <w:t xml:space="preserve">11 (2): 92–98.</w:t>
-      </w:r>
-      <w:r>
-        <w:t xml:space="preserve"> </w:t>
-      </w:r>
-      <w:hyperlink r:id="rId72">
-        <w:r>
-          <w:rPr>
-            <w:rStyle w:val="Hyperlink"/>
-          </w:rPr>
-          <w:t xml:space="preserve">https://doi.org/10.1016/0169-5347(96)81050-0</w:t>
-        </w:r>
-      </w:hyperlink>
-      <w:r>
-        <w:t xml:space="preserve">.</w:t>
-      </w:r>
-    </w:p>
-    <w:bookmarkEnd w:id="73"/>
-    <w:bookmarkStart w:id="75" w:name="ref-halekoh2014"/>
-    <w:p>
-      <w:pPr>
-        <w:pStyle w:val="Bibliography"/>
-      </w:pPr>
-      <w:r>
-        <w:t xml:space="preserve">Halekoh, Ulrich, and Søren Højsgaard. 2014.</w:t>
-      </w:r>
-      <w:r>
-        <w:t xml:space="preserve"> </w:t>
-      </w:r>
-      <w:r>
-        <w:t xml:space="preserve">“A</w:t>
-      </w:r>
-      <w:r>
-        <w:t xml:space="preserve"> </w:t>
-      </w:r>
-      <w:r>
-        <w:t xml:space="preserve">Enward-</w:t>
-      </w:r>
-      <w:r>
-        <w:t xml:space="preserve">Oger Approximation and Parametric Bootstrap Methods for Tests in Linear Mixed Models – the</w:t>
-      </w:r>
-      <w:r>
-        <w:t xml:space="preserve"> </w:t>
-      </w:r>
-      <w:r>
-        <w:t xml:space="preserve"> </w:t>
-      </w:r>
-      <w:r>
-        <w:t xml:space="preserve">Package Pbkrtest.”</w:t>
-      </w:r>
-      <w:r>
-        <w:t xml:space="preserve"> </w:t>
-      </w:r>
-      <w:r>
-        <w:rPr>
-          <w:i/>
-          <w:iCs/>
-        </w:rPr>
-        <w:t xml:space="preserve">J. Stat. Softw.</w:t>
-      </w:r>
-      <w:r>
-        <w:t xml:space="preserve"> </w:t>
-      </w:r>
-      <w:r>
-        <w:t xml:space="preserve">59: 1–32.</w:t>
-      </w:r>
-      <w:r>
-        <w:t xml:space="preserve"> </w:t>
-      </w:r>
-      <w:hyperlink r:id="rId74">
-        <w:r>
-          <w:rPr>
-            <w:rStyle w:val="Hyperlink"/>
-          </w:rPr>
-          <w:t xml:space="preserve">https://doi.org/10.18637/jss.v059.i09</w:t>
-        </w:r>
-      </w:hyperlink>
-      <w:r>
-        <w:t xml:space="preserve">.</w:t>
-      </w:r>
-    </w:p>
-    <w:bookmarkEnd w:id="75"/>
-    <w:bookmarkStart w:id="77" w:name="ref-hirani2026"/>
-    <w:p>
-      <w:pPr>
-        <w:pStyle w:val="Bibliography"/>
-      </w:pPr>
-      <w:r>
-        <w:t xml:space="preserve">Hirani, Shay, and Russell Bonduriansky. 2026.</w:t>
-      </w:r>
-      <w:r>
-        <w:t xml:space="preserve"> </w:t>
-      </w:r>
-      <w:r>
-        <w:t xml:space="preserve">“Scaling and Developmental Integration of a Secondary Sexual Sensory Trait.”</w:t>
-      </w:r>
-      <w:r>
-        <w:t xml:space="preserve"> </w:t>
-      </w:r>
-      <w:r>
-        <w:rPr>
-          <w:i/>
-          <w:iCs/>
-        </w:rPr>
-        <w:t xml:space="preserve">Evol. Ecol.</w:t>
-      </w:r>
-      <w:r>
-        <w:t xml:space="preserve"> </w:t>
-      </w:r>
-      <w:r>
-        <w:t xml:space="preserve">40 (1): 8–25.</w:t>
-      </w:r>
-      <w:r>
-        <w:t xml:space="preserve"> </w:t>
-      </w:r>
-      <w:hyperlink r:id="rId76">
-        <w:r>
-          <w:rPr>
-            <w:rStyle w:val="Hyperlink"/>
-          </w:rPr>
-          <w:t xml:space="preserve">https://doi.org/10.1007/s10682-025-10369-w</w:t>
-        </w:r>
-      </w:hyperlink>
-      <w:r>
-        <w:t xml:space="preserve">.</w:t>
-      </w:r>
-    </w:p>
-    <w:bookmarkEnd w:id="77"/>
-    <w:bookmarkStart w:id="79" w:name="ref-husak2011"/>
-    <w:p>
-      <w:pPr>
-        <w:pStyle w:val="Bibliography"/>
-      </w:pPr>
-      <w:r>
-        <w:t xml:space="preserve">Husak, Jerry F., and John G. Swallow. 2011.</w:t>
-      </w:r>
-      <w:r>
-        <w:t xml:space="preserve"> </w:t>
-      </w:r>
-      <w:r>
-        <w:t xml:space="preserve">“Compensatory Traits and the Evolution of Male Ornaments.”</w:t>
-      </w:r>
-      <w:r>
-        <w:t xml:space="preserve"> </w:t>
-      </w:r>
-      <w:r>
-        <w:rPr>
-          <w:i/>
-          <w:iCs/>
-        </w:rPr>
-        <w:t xml:space="preserve">Behaviour</w:t>
-      </w:r>
-      <w:r>
-        <w:t xml:space="preserve"> </w:t>
-      </w:r>
-      <w:r>
-        <w:t xml:space="preserve">148 (1): 1–29.</w:t>
-      </w:r>
-      <w:r>
-        <w:t xml:space="preserve"> </w:t>
-      </w:r>
-      <w:hyperlink r:id="rId78">
-        <w:r>
-          <w:rPr>
-            <w:rStyle w:val="Hyperlink"/>
-          </w:rPr>
-          <w:t xml:space="preserve">https://www.jstor.org/stable/25799795</w:t>
-        </w:r>
-      </w:hyperlink>
-      <w:r>
-        <w:t xml:space="preserve">.</w:t>
-      </w:r>
-    </w:p>
-    <w:bookmarkEnd w:id="79"/>
-    <w:bookmarkStart w:id="81" w:name="ref-ito2017"/>
-    <w:p>
-      <w:pPr>
-        <w:pStyle w:val="Bibliography"/>
-      </w:pPr>
-      <w:r>
-        <w:t xml:space="preserve">Ito, J., Y. Ohkubo, and E. Hasegawa. 2017.</w:t>
-      </w:r>
-      <w:r>
-        <w:t xml:space="preserve"> </w:t>
-      </w:r>
-      <w:r>
-        <w:t xml:space="preserve">“Morph-</w:t>
-      </w:r>
-      <w:r>
-        <w:t xml:space="preserve">Specific Weapon-Correlated Traits</w:t>
-      </w:r>
-      <w:r>
-        <w:t xml:space="preserve"> </w:t>
-      </w:r>
-      <w:r>
-        <w:t xml:space="preserve">in a</w:t>
-      </w:r>
-      <w:r>
-        <w:t xml:space="preserve"> </w:t>
-      </w:r>
-      <w:r>
-        <w:t xml:space="preserve">Male Dimorphic Stag Beetle Prosopocoilus</w:t>
-      </w:r>
-      <w:r>
-        <w:t xml:space="preserve"> </w:t>
-      </w:r>
-      <w:r>
-        <w:t xml:space="preserve">Inclinatus, (</w:t>
-      </w:r>
-      <w:r>
-        <w:t xml:space="preserve">Coleoptera</w:t>
-      </w:r>
-      <w:r>
-        <w:t xml:space="preserve">:</w:t>
-      </w:r>
-      <w:r>
-        <w:t xml:space="preserve"> </w:t>
-      </w:r>
-      <w:r>
-        <w:t xml:space="preserve">Lucanidae</w:t>
-      </w:r>
-      <w:r>
-        <w:t xml:space="preserve">).”</w:t>
-      </w:r>
-      <w:r>
-        <w:t xml:space="preserve"> </w:t>
-      </w:r>
-      <w:r>
-        <w:rPr>
-          <w:i/>
-          <w:iCs/>
-        </w:rPr>
-        <w:t xml:space="preserve">Ann. Entomol. Soc. Am.</w:t>
-      </w:r>
-      <w:r>
-        <w:t xml:space="preserve"> </w:t>
-      </w:r>
-      <w:r>
-        <w:t xml:space="preserve">110 (3): 281–85.</w:t>
-      </w:r>
-      <w:r>
-        <w:t xml:space="preserve"> </w:t>
-      </w:r>
-      <w:hyperlink r:id="rId80">
-        <w:r>
-          <w:rPr>
-            <w:rStyle w:val="Hyperlink"/>
-          </w:rPr>
-          <w:t xml:space="preserve">https://doi.org/10.1093/aesa/saw096</w:t>
-        </w:r>
-      </w:hyperlink>
-      <w:r>
-        <w:t xml:space="preserve">.</w:t>
-      </w:r>
-    </w:p>
-    <w:bookmarkEnd w:id="81"/>
-    <w:bookmarkStart w:id="83" w:name="ref-kelly2005a"/>
-    <w:p>
-      <w:pPr>
-        <w:pStyle w:val="Bibliography"/>
-      </w:pPr>
-      <w:r>
-        <w:t xml:space="preserve">Kelly, Clint D. 2005.</w:t>
-      </w:r>
-      <w:r>
-        <w:t xml:space="preserve"> </w:t>
-      </w:r>
-      <w:r>
-        <w:t xml:space="preserve">“Allometry and Sexual Selection of Male Weaponry in</w:t>
-      </w:r>
-      <w:r>
-        <w:t xml:space="preserve"> </w:t>
-      </w:r>
-      <w:r>
-        <w:t xml:space="preserve">Wellington</w:t>
-      </w:r>
-      <w:r>
-        <w:t xml:space="preserve"> </w:t>
-      </w:r>
-      <w:r>
-        <w:t xml:space="preserve">Tree Weta,</w:t>
-      </w:r>
-      <w:r>
-        <w:t xml:space="preserve"> </w:t>
-      </w:r>
-      <w:r>
-        <w:rPr>
-          <w:i/>
-          <w:iCs/>
-        </w:rPr>
-        <w:t xml:space="preserve">Hemideina Crassidens</w:t>
-      </w:r>
-      <w:r>
-        <w:t xml:space="preserve">.”</w:t>
-      </w:r>
-      <w:r>
-        <w:t xml:space="preserve"> </w:t>
-      </w:r>
-      <w:r>
-        <w:rPr>
-          <w:i/>
-          <w:iCs/>
-        </w:rPr>
-        <w:t xml:space="preserve">Behav. Ecol.</w:t>
-      </w:r>
-      <w:r>
-        <w:t xml:space="preserve"> </w:t>
-      </w:r>
-      <w:r>
-        <w:t xml:space="preserve">16 (1): 145–52.</w:t>
-      </w:r>
-      <w:r>
-        <w:t xml:space="preserve"> </w:t>
-      </w:r>
-      <w:hyperlink r:id="rId82">
-        <w:r>
-          <w:rPr>
-            <w:rStyle w:val="Hyperlink"/>
-          </w:rPr>
-          <w:t xml:space="preserve">https://doi.org/10.1093/beheco/arh141</w:t>
-        </w:r>
-      </w:hyperlink>
-      <w:r>
-        <w:t xml:space="preserve">.</w:t>
-      </w:r>
-    </w:p>
-    <w:bookmarkEnd w:id="83"/>
-    <w:bookmarkStart w:id="85" w:name="ref-kelly2006d"/>
-    <w:p>
-      <w:pPr>
-        <w:pStyle w:val="Bibliography"/>
-      </w:pPr>
-      <w:r>
-        <w:t xml:space="preserve">———. 2006.</w:t>
-      </w:r>
-      <w:r>
-        <w:t xml:space="preserve"> </w:t>
-      </w:r>
-      <w:r>
-        <w:t xml:space="preserve">“Fighting for Harems: Assessment Strategies During Male–Male Contests in the Sexually Dimorphic</w:t>
-      </w:r>
-      <w:r>
-        <w:t xml:space="preserve"> </w:t>
-      </w:r>
-      <w:r>
-        <w:t xml:space="preserve">Wellington</w:t>
-      </w:r>
-      <w:r>
-        <w:t xml:space="preserve"> </w:t>
-      </w:r>
-      <w:r>
-        <w:t xml:space="preserve">Tree Weta.”</w:t>
-      </w:r>
-      <w:r>
-        <w:t xml:space="preserve"> </w:t>
-      </w:r>
-      <w:r>
-        <w:rPr>
-          <w:i/>
-          <w:iCs/>
-        </w:rPr>
-        <w:t xml:space="preserve">Anim. Behav.</w:t>
-      </w:r>
-      <w:r>
-        <w:t xml:space="preserve"> </w:t>
-      </w:r>
-      <w:r>
-        <w:t xml:space="preserve">72 (3): 727–36.</w:t>
-      </w:r>
-      <w:r>
-        <w:t xml:space="preserve"> </w:t>
-      </w:r>
-      <w:hyperlink r:id="rId84">
-        <w:r>
-          <w:rPr>
-            <w:rStyle w:val="Hyperlink"/>
-          </w:rPr>
-          <w:t xml:space="preserve">https://doi.org/10.1016/j.anbehav.2006.02.007</w:t>
-        </w:r>
-      </w:hyperlink>
-      <w:r>
-        <w:t xml:space="preserve">.</w:t>
-      </w:r>
-    </w:p>
-    <w:bookmarkEnd w:id="85"/>
-    <w:bookmarkStart w:id="87" w:name="ref-kelly2024"/>
-    <w:p>
-      <w:pPr>
-        <w:pStyle w:val="Bibliography"/>
-      </w:pPr>
-      <w:r>
-        <w:t xml:space="preserve">———. 2024.</w:t>
-      </w:r>
-      <w:r>
-        <w:t xml:space="preserve"> </w:t>
-      </w:r>
-      <w:r>
-        <w:t xml:space="preserve">“Alternative Mating Strategies in the</w:t>
-      </w:r>
-      <w:r>
-        <w:t xml:space="preserve"> </w:t>
-      </w:r>
-      <w:r>
-        <w:t xml:space="preserve">Wellington</w:t>
-      </w:r>
-      <w:r>
-        <w:t xml:space="preserve"> </w:t>
-      </w:r>
-      <w:r>
-        <w:t xml:space="preserve">Tree Weta Expressed via Genetic Polymorphism for Precocial Male Maturation.”</w:t>
-      </w:r>
-      <w:r>
-        <w:t xml:space="preserve"> </w:t>
-      </w:r>
-      <w:r>
-        <w:rPr>
-          <w:i/>
-          <w:iCs/>
-        </w:rPr>
-        <w:t xml:space="preserve">R. Soc. Open Sci.</w:t>
-      </w:r>
-      <w:r>
-        <w:t xml:space="preserve"> </w:t>
-      </w:r>
-      <w:r>
-        <w:t xml:space="preserve">11 (2): 240100.</w:t>
-      </w:r>
-      <w:r>
-        <w:t xml:space="preserve"> </w:t>
-      </w:r>
-      <w:hyperlink r:id="rId86">
-        <w:r>
-          <w:rPr>
-            <w:rStyle w:val="Hyperlink"/>
-          </w:rPr>
-          <w:t xml:space="preserve">https://doi.org/10.1098/rsos.240100</w:t>
-        </w:r>
-      </w:hyperlink>
-      <w:r>
-        <w:t xml:space="preserve">.</w:t>
-      </w:r>
-    </w:p>
-    <w:bookmarkEnd w:id="87"/>
-    <w:bookmarkStart w:id="89" w:name="ref-kelly2025"/>
-    <w:p>
-      <w:pPr>
-        <w:pStyle w:val="Bibliography"/>
-      </w:pPr>
-      <w:r>
-        <w:t xml:space="preserve">———. 2025.</w:t>
-      </w:r>
-      <w:r>
-        <w:t xml:space="preserve"> </w:t>
-      </w:r>
-      <w:r>
-        <w:t xml:space="preserve">“A Behaviourally Plastic Jack-of-All-Trades Mating Strategy in the</w:t>
-      </w:r>
-      <w:r>
-        <w:t xml:space="preserve"> </w:t>
-      </w:r>
-      <w:r>
-        <w:t xml:space="preserve">Wellington</w:t>
-      </w:r>
-      <w:r>
-        <w:t xml:space="preserve"> </w:t>
-      </w:r>
-      <w:r>
-        <w:t xml:space="preserve">Tree Wētā.”</w:t>
-      </w:r>
-      <w:r>
-        <w:t xml:space="preserve"> </w:t>
-      </w:r>
-      <w:r>
-        <w:rPr>
-          <w:i/>
-          <w:iCs/>
-        </w:rPr>
-        <w:t xml:space="preserve">Anim. Behav.</w:t>
-      </w:r>
-      <w:r>
-        <w:t xml:space="preserve"> </w:t>
-      </w:r>
-      <w:r>
-        <w:t xml:space="preserve">229: 123332.</w:t>
-      </w:r>
-      <w:r>
-        <w:t xml:space="preserve"> </w:t>
-      </w:r>
-      <w:hyperlink r:id="rId88">
-        <w:r>
-          <w:rPr>
-            <w:rStyle w:val="Hyperlink"/>
-          </w:rPr>
-          <w:t xml:space="preserve">https://doi.org/10.1016/j.anbehav.2025.123332</w:t>
-        </w:r>
-      </w:hyperlink>
-      <w:r>
-        <w:t xml:space="preserve">.</w:t>
-      </w:r>
-    </w:p>
-    <w:bookmarkEnd w:id="89"/>
-    <w:bookmarkStart w:id="91" w:name="ref-kelly2026"/>
-    <w:p>
-      <w:pPr>
-        <w:pStyle w:val="Bibliography"/>
-      </w:pPr>
-      <w:r>
-        <w:t xml:space="preserve">———. 2026.</w:t>
-      </w:r>
-      <w:r>
-        <w:t xml:space="preserve"> </w:t>
-      </w:r>
-      <w:r>
-        <w:t xml:space="preserve">“Can the Form of Sexual Selection Explain Patterns of Static Weapon Allometry Expressed by Alternative Mating Morphotypes?”</w:t>
-      </w:r>
-      <w:r>
-        <w:t xml:space="preserve"> </w:t>
-      </w:r>
-      <w:r>
-        <w:rPr>
-          <w:i/>
-          <w:iCs/>
-        </w:rPr>
-        <w:t xml:space="preserve">Evolution</w:t>
-      </w:r>
-      <w:r>
-        <w:t xml:space="preserve"> </w:t>
-      </w:r>
-      <w:r>
-        <w:t xml:space="preserve">80 (1): 191–201.</w:t>
-      </w:r>
-      <w:r>
-        <w:t xml:space="preserve"> </w:t>
-      </w:r>
-      <w:hyperlink r:id="rId90">
-        <w:r>
-          <w:rPr>
-            <w:rStyle w:val="Hyperlink"/>
-          </w:rPr>
-          <w:t xml:space="preserve">https://doi.org/10.1093/evolut/qpaf215</w:t>
-        </w:r>
-      </w:hyperlink>
-      <w:r>
-        <w:t xml:space="preserve">.</w:t>
-      </w:r>
-    </w:p>
-    <w:bookmarkEnd w:id="91"/>
-    <w:bookmarkStart w:id="93" w:name="ref-kelly2010"/>
-    <w:p>
-      <w:pPr>
-        <w:pStyle w:val="Bibliography"/>
-      </w:pPr>
-      <w:r>
-        <w:t xml:space="preserve">Kelly, Clint D., and Dean C. Adams. 2010.</w:t>
-      </w:r>
-      <w:r>
-        <w:t xml:space="preserve"> </w:t>
-      </w:r>
-      <w:r>
-        <w:t xml:space="preserve">“Sexual Selection, Ontogenetic Acceleration, and Hypermorphosis Generates Male Trimorphism in</w:t>
-      </w:r>
-      <w:r>
-        <w:t xml:space="preserve"> </w:t>
-      </w:r>
-      <w:r>
-        <w:t xml:space="preserve">Wellington</w:t>
-      </w:r>
-      <w:r>
-        <w:t xml:space="preserve"> </w:t>
-      </w:r>
-      <w:r>
-        <w:t xml:space="preserve">Tree Weta.”</w:t>
-      </w:r>
-      <w:r>
-        <w:t xml:space="preserve"> </w:t>
-      </w:r>
-      <w:r>
-        <w:rPr>
-          <w:i/>
-          <w:iCs/>
-        </w:rPr>
-        <w:t xml:space="preserve">Evol. Biol.</w:t>
-      </w:r>
-      <w:r>
-        <w:t xml:space="preserve"> </w:t>
-      </w:r>
-      <w:r>
-        <w:t xml:space="preserve">37 (4): 200–209.</w:t>
-      </w:r>
-      <w:r>
-        <w:t xml:space="preserve"> </w:t>
-      </w:r>
-      <w:hyperlink r:id="rId92">
-        <w:r>
-          <w:rPr>
-            <w:rStyle w:val="Hyperlink"/>
-          </w:rPr>
-          <w:t xml:space="preserve">https://doi.org/10.1007/s11692-010-9096-1</w:t>
-        </w:r>
-      </w:hyperlink>
-      <w:r>
-        <w:t xml:space="preserve">.</w:t>
-      </w:r>
-    </w:p>
-    <w:bookmarkEnd w:id="93"/>
-    <w:bookmarkStart w:id="95" w:name="ref-kuznetsova2017"/>
-    <w:p>
-      <w:pPr>
-        <w:pStyle w:val="Bibliography"/>
-      </w:pPr>
-      <w:r>
-        <w:t xml:space="preserve">Kuznetsova, Alexandra, Per B. Brockhoff, and Rune H. B. Christensen. 2017.</w:t>
-      </w:r>
-      <w:r>
-        <w:t xml:space="preserve"> </w:t>
-      </w:r>
-      <w:r>
-        <w:t xml:space="preserve">“</w:t>
-      </w:r>
-      <w:r>
-        <w:rPr>
-          <w:b/>
-          <w:bCs/>
-        </w:rPr>
-        <w:t xml:space="preserve">lmerTest</w:t>
-      </w:r>
-      <w:r>
-        <w:t xml:space="preserve"> </w:t>
-      </w:r>
-      <w:r>
-        <w:t xml:space="preserve">Package</w:t>
-      </w:r>
-      <w:r>
-        <w:t xml:space="preserve">:</w:t>
-      </w:r>
-      <w:r>
-        <w:t xml:space="preserve"> </w:t>
-      </w:r>
-      <w:r>
-        <w:t xml:space="preserve">Tests</w:t>
-      </w:r>
-      <w:r>
-        <w:t xml:space="preserve"> </w:t>
-      </w:r>
-      <w:r>
-        <w:t xml:space="preserve">in</w:t>
-      </w:r>
-      <w:r>
-        <w:t xml:space="preserve"> </w:t>
-      </w:r>
-      <w:r>
-        <w:t xml:space="preserve">Linear Mixed Effects Models</w:t>
-      </w:r>
-      <w:r>
-        <w:t xml:space="preserve">.”</w:t>
-      </w:r>
-      <w:r>
-        <w:t xml:space="preserve"> </w:t>
-      </w:r>
-      <w:r>
-        <w:rPr>
-          <w:i/>
-          <w:iCs/>
-        </w:rPr>
-        <w:t xml:space="preserve">J. Stat. Softw.</w:t>
-      </w:r>
-      <w:r>
-        <w:t xml:space="preserve"> </w:t>
-      </w:r>
-      <w:r>
-        <w:t xml:space="preserve">82 (13).</w:t>
-      </w:r>
-      <w:r>
-        <w:t xml:space="preserve"> </w:t>
-      </w:r>
-      <w:hyperlink r:id="rId94">
-        <w:r>
-          <w:rPr>
-            <w:rStyle w:val="Hyperlink"/>
-          </w:rPr>
-          <w:t xml:space="preserve">https://doi.org/10.18637/jss.v082.i13</w:t>
-        </w:r>
-      </w:hyperlink>
-      <w:r>
-        <w:t xml:space="preserve">.</w:t>
-      </w:r>
-    </w:p>
-    <w:bookmarkEnd w:id="95"/>
-    <w:bookmarkStart w:id="96" w:name="ref-lenth2019package"/>
-    <w:p>
-      <w:pPr>
-        <w:pStyle w:val="Bibliography"/>
-      </w:pPr>
-      <w:r>
-        <w:t xml:space="preserve">Lenth, R., H. Singmann, J. Love, P. Buerkner, and M. Herve. 2019.</w:t>
-      </w:r>
-      <w:r>
-        <w:t xml:space="preserve"> </w:t>
-      </w:r>
-      <w:r>
-        <w:t xml:space="preserve">“Package</w:t>
-      </w:r>
-      <w:r>
-        <w:t xml:space="preserve"> </w:t>
-      </w:r>
-      <w:r>
-        <w:t xml:space="preserve">‘Emmeans’</w:t>
-      </w:r>
-      <w:r>
-        <w:t xml:space="preserve">:</w:t>
-      </w:r>
-      <w:r>
-        <w:t xml:space="preserve"> </w:t>
-      </w:r>
-      <w:r>
-        <w:t xml:space="preserve">Estimated</w:t>
-      </w:r>
-      <w:r>
-        <w:t xml:space="preserve"> </w:t>
-      </w:r>
-      <w:r>
-        <w:t xml:space="preserve">Marginal Means, Aka Least-Squares Means.”</w:t>
-      </w:r>
-    </w:p>
-    <w:bookmarkEnd w:id="96"/>
-    <w:bookmarkStart w:id="98" w:name="ref-ludecke2021"/>
-    <w:p>
-      <w:pPr>
-        <w:pStyle w:val="Bibliography"/>
-      </w:pPr>
-      <w:r>
-        <w:t xml:space="preserve">Lüdecke, Daniel, Mattan Ben-Shachar, Indrajeet Patil, Philip Waggoner, and Dominique Makowski. 2021.</w:t>
-      </w:r>
-      <w:r>
-        <w:t xml:space="preserve"> </w:t>
-      </w:r>
-      <w:r>
-        <w:t xml:space="preserve">“Performance: An</w:t>
-      </w:r>
-      <w:r>
-        <w:t xml:space="preserve"> </w:t>
-      </w:r>
-      <w:r>
-        <w:t xml:space="preserve"> </w:t>
-      </w:r>
-      <w:r>
-        <w:t xml:space="preserve">Package for Assessment, Comparison and Testing of Statistical Models.”</w:t>
-      </w:r>
-      <w:r>
-        <w:t xml:space="preserve"> </w:t>
-      </w:r>
-      <w:r>
-        <w:rPr>
-          <w:i/>
-          <w:iCs/>
-        </w:rPr>
-        <w:t xml:space="preserve">J. Open Source Softw.</w:t>
-      </w:r>
-      <w:r>
-        <w:t xml:space="preserve"> </w:t>
-      </w:r>
-      <w:r>
-        <w:t xml:space="preserve">6 (60): 3139.</w:t>
-      </w:r>
-      <w:r>
-        <w:t xml:space="preserve"> </w:t>
-      </w:r>
-      <w:hyperlink r:id="rId97">
-        <w:r>
-          <w:rPr>
-            <w:rStyle w:val="Hyperlink"/>
-          </w:rPr>
-          <w:t xml:space="preserve">https://doi.org/10.21105/joss.03139</w:t>
-        </w:r>
-      </w:hyperlink>
-      <w:r>
-        <w:t xml:space="preserve">.</w:t>
-      </w:r>
-    </w:p>
-    <w:bookmarkEnd w:id="98"/>
-    <w:bookmarkStart w:id="100" w:name="ref-ludecke2021a"/>
-    <w:p>
-      <w:pPr>
-        <w:pStyle w:val="Bibliography"/>
-      </w:pPr>
-      <w:r>
-        <w:t xml:space="preserve">Lüdecke, Daniel, Indrajeet Patil, Mattan S. Ben-Shachar, Brenton M. Wiernik, Philip Waggoner, and Dominique Makowski. 2021.</w:t>
-      </w:r>
-      <w:r>
-        <w:t xml:space="preserve"> </w:t>
-      </w:r>
-      <w:r>
-        <w:t xml:space="preserve">“See:</w:t>
-      </w:r>
-      <w:r>
-        <w:t xml:space="preserve"> </w:t>
-      </w:r>
-      <w:r>
-        <w:t xml:space="preserve">An R Package</w:t>
-      </w:r>
-      <w:r>
-        <w:t xml:space="preserve"> </w:t>
-      </w:r>
-      <w:r>
-        <w:t xml:space="preserve">for</w:t>
-      </w:r>
-      <w:r>
-        <w:t xml:space="preserve"> </w:t>
-      </w:r>
-      <w:r>
-        <w:t xml:space="preserve">Visualizing Statistical Models</w:t>
-      </w:r>
-      <w:r>
-        <w:t xml:space="preserve">.”</w:t>
-      </w:r>
-      <w:r>
-        <w:t xml:space="preserve"> </w:t>
-      </w:r>
-      <w:r>
-        <w:rPr>
-          <w:i/>
-          <w:iCs/>
-        </w:rPr>
-        <w:t xml:space="preserve">J. Open Source Softw.</w:t>
-      </w:r>
-      <w:r>
-        <w:t xml:space="preserve"> </w:t>
-      </w:r>
-      <w:r>
-        <w:t xml:space="preserve">6 (64): 3393.</w:t>
-      </w:r>
-      <w:r>
-        <w:t xml:space="preserve"> </w:t>
-      </w:r>
-      <w:hyperlink r:id="rId99">
-        <w:r>
-          <w:rPr>
-            <w:rStyle w:val="Hyperlink"/>
-          </w:rPr>
-          <w:t xml:space="preserve">https://doi.org/10.21105/joss.03393</w:t>
-        </w:r>
-      </w:hyperlink>
-      <w:r>
-        <w:t xml:space="preserve">.</w:t>
-      </w:r>
-    </w:p>
-    <w:bookmarkEnd w:id="100"/>
-    <w:bookmarkStart w:id="102" w:name="ref-mccullough2013"/>
-    <w:p>
-      <w:pPr>
-        <w:pStyle w:val="Bibliography"/>
-      </w:pPr>
-      <w:r>
-        <w:t xml:space="preserve">McCullough, Erin, and Douglas Emlen. 2013.</w:t>
-      </w:r>
-      <w:r>
-        <w:t xml:space="preserve"> </w:t>
-      </w:r>
-      <w:r>
-        <w:t xml:space="preserve">“Evaluating the Costs of a Sexually Selected Weapon:</w:t>
-      </w:r>
-      <w:r>
-        <w:t xml:space="preserve"> </w:t>
-      </w:r>
-      <w:r>
-        <w:t xml:space="preserve">Big</w:t>
-      </w:r>
-      <w:r>
-        <w:t xml:space="preserve"> </w:t>
-      </w:r>
-      <w:r>
-        <w:t xml:space="preserve">Horns at a Small Price.”</w:t>
-      </w:r>
-      <w:r>
-        <w:t xml:space="preserve"> </w:t>
-      </w:r>
-      <w:r>
-        <w:rPr>
-          <w:i/>
-          <w:iCs/>
-        </w:rPr>
-        <w:t xml:space="preserve">Anim. Behav.</w:t>
-      </w:r>
-      <w:r>
-        <w:t xml:space="preserve"> </w:t>
-      </w:r>
-      <w:r>
-        <w:t xml:space="preserve">86 (November): 977–85.</w:t>
-      </w:r>
-      <w:r>
-        <w:t xml:space="preserve"> </w:t>
-      </w:r>
-      <w:hyperlink r:id="rId101">
-        <w:r>
-          <w:rPr>
-            <w:rStyle w:val="Hyperlink"/>
-          </w:rPr>
-          <w:t xml:space="preserve">https://doi.org/10.1016/j.anbehav.2013.08.017</w:t>
-        </w:r>
-      </w:hyperlink>
-      <w:r>
-        <w:t xml:space="preserve">.</w:t>
-      </w:r>
-    </w:p>
-    <w:bookmarkEnd w:id="102"/>
-    <w:bookmarkStart w:id="104" w:name="ref-moczek2004"/>
-    <w:p>
-      <w:pPr>
-        <w:pStyle w:val="Bibliography"/>
-      </w:pPr>
-      <w:r>
-        <w:t xml:space="preserve">Moczek, Armin P., and H. Frederik Nijhout. 2004.</w:t>
-      </w:r>
-      <w:r>
-        <w:t xml:space="preserve"> </w:t>
-      </w:r>
-      <w:r>
-        <w:t xml:space="preserve">“Trade-Offs During the Development of Primary and Secondary Sexual Traits in a Horned Beetle.”</w:t>
-      </w:r>
-      <w:r>
-        <w:t xml:space="preserve"> </w:t>
-      </w:r>
-      <w:r>
-        <w:rPr>
-          <w:i/>
-          <w:iCs/>
-        </w:rPr>
-        <w:t xml:space="preserve">Am. Nat.</w:t>
-      </w:r>
-      <w:r>
-        <w:t xml:space="preserve"> </w:t>
-      </w:r>
-      <w:r>
-        <w:t xml:space="preserve">163 (2): 184–91.</w:t>
-      </w:r>
-      <w:r>
-        <w:t xml:space="preserve"> </w:t>
-      </w:r>
-      <w:hyperlink r:id="rId103">
-        <w:r>
-          <w:rPr>
-            <w:rStyle w:val="Hyperlink"/>
-          </w:rPr>
-          <w:t xml:space="preserve">https://doi.org/10.1086/381741</w:t>
-        </w:r>
-      </w:hyperlink>
-      <w:r>
-        <w:t xml:space="preserve">.</w:t>
-      </w:r>
-    </w:p>
-    <w:bookmarkEnd w:id="104"/>
-    <w:bookmarkStart w:id="106" w:name="ref-nason2020"/>
-    <w:p>
-      <w:pPr>
-        <w:pStyle w:val="Bibliography"/>
-      </w:pPr>
-      <w:r>
-        <w:t xml:space="preserve">Nason, Sarah E., and Clint D. Kelly. 2020.</w:t>
-      </w:r>
-      <w:r>
-        <w:t xml:space="preserve"> </w:t>
-      </w:r>
-      <w:r>
-        <w:t xml:space="preserve">“Equal Fitness Among Alternative Mating Strategies in a Harem Polygynous Insect.”</w:t>
-      </w:r>
-      <w:r>
-        <w:t xml:space="preserve"> </w:t>
-      </w:r>
-      <w:r>
-        <w:rPr>
-          <w:i/>
-          <w:iCs/>
-        </w:rPr>
-        <w:t xml:space="preserve">Proc. R. Soc. B Biol. Sci.</w:t>
-      </w:r>
-      <w:r>
-        <w:t xml:space="preserve"> </w:t>
-      </w:r>
-      <w:r>
-        <w:t xml:space="preserve">287 (1931): 20200975.</w:t>
-      </w:r>
-      <w:r>
-        <w:t xml:space="preserve"> </w:t>
-      </w:r>
-      <w:hyperlink r:id="rId105">
-        <w:r>
-          <w:rPr>
-            <w:rStyle w:val="Hyperlink"/>
-          </w:rPr>
-          <w:t xml:space="preserve">https://doi.org/10.1098/rspb.2020.0975</w:t>
-        </w:r>
-      </w:hyperlink>
-      <w:r>
-        <w:t xml:space="preserve">.</w:t>
-      </w:r>
-    </w:p>
-    <w:bookmarkEnd w:id="106"/>
-    <w:bookmarkStart w:id="108" w:name="ref-nijhout1998"/>
-    <w:p>
-      <w:pPr>
-        <w:pStyle w:val="Bibliography"/>
-      </w:pPr>
-      <w:r>
-        <w:t xml:space="preserve">Nijhout, H. F., and D. J. Emlen. 1998.</w:t>
-      </w:r>
-      <w:r>
-        <w:t xml:space="preserve"> </w:t>
-      </w:r>
-      <w:r>
-        <w:t xml:space="preserve">“Competition Among Body Parts in the Development and Evolution of Insect Morphology.”</w:t>
-      </w:r>
-      <w:r>
-        <w:t xml:space="preserve"> </w:t>
-      </w:r>
-      <w:r>
-        <w:rPr>
-          <w:i/>
-          <w:iCs/>
-        </w:rPr>
-        <w:t xml:space="preserve">Proc. Natl. Acad. Sci.</w:t>
-      </w:r>
-      <w:r>
-        <w:t xml:space="preserve"> </w:t>
-      </w:r>
-      <w:r>
-        <w:t xml:space="preserve">95 (7): 3685–89.</w:t>
-      </w:r>
-      <w:r>
-        <w:t xml:space="preserve"> </w:t>
-      </w:r>
-      <w:hyperlink r:id="rId107">
-        <w:r>
-          <w:rPr>
-            <w:rStyle w:val="Hyperlink"/>
-          </w:rPr>
-          <w:t xml:space="preserve">https://doi.org/10.1073/pnas.95.7.3685</w:t>
-        </w:r>
-      </w:hyperlink>
-      <w:r>
-        <w:t xml:space="preserve">.</w:t>
-      </w:r>
-    </w:p>
-    <w:bookmarkEnd w:id="108"/>
-    <w:bookmarkStart w:id="109" w:name="ref-oliveira2008"/>
-    <w:p>
-      <w:pPr>
-        <w:pStyle w:val="Bibliography"/>
-      </w:pPr>
-      <w:r>
-        <w:t xml:space="preserve">Oliveira, Rui F., Michael Taborsky, and H. Jane Brockmann. 2008.</w:t>
-      </w:r>
-      <w:r>
-        <w:t xml:space="preserve"> </w:t>
-      </w:r>
-      <w:r>
-        <w:rPr>
-          <w:i/>
-          <w:iCs/>
-        </w:rPr>
-        <w:t xml:space="preserve">Alternative</w:t>
-      </w:r>
-      <w:r>
-        <w:rPr>
-          <w:i/>
-          <w:iCs/>
-        </w:rPr>
-        <w:t xml:space="preserve"> </w:t>
-      </w:r>
-      <w:r>
-        <w:rPr>
-          <w:i/>
-          <w:iCs/>
-        </w:rPr>
-        <w:t xml:space="preserve">Reproductive Tactics</w:t>
-      </w:r>
-      <w:r>
-        <w:t xml:space="preserve">. Cambridge University Press.</w:t>
-      </w:r>
-    </w:p>
-    <w:bookmarkEnd w:id="109"/>
-    <w:bookmarkStart w:id="110" w:name="ref-rcoreteam2025"/>
-    <w:p>
-      <w:pPr>
-        <w:pStyle w:val="Bibliography"/>
-      </w:pPr>
-      <w:r>
-        <w:t xml:space="preserve">R Core Team. 2025.</w:t>
-      </w:r>
-      <w:r>
-        <w:t xml:space="preserve"> </w:t>
-      </w:r>
-      <w:r>
-        <w:t xml:space="preserve">“R:</w:t>
-      </w:r>
-      <w:r>
-        <w:t xml:space="preserve"> </w:t>
-      </w:r>
-      <w:r>
-        <w:t xml:space="preserve">A</w:t>
-      </w:r>
-      <w:r>
-        <w:t xml:space="preserve"> </w:t>
-      </w:r>
-      <w:r>
-        <w:t xml:space="preserve">Language and Environment for Statistical Computing.”</w:t>
-      </w:r>
-      <w:r>
-        <w:t xml:space="preserve"> </w:t>
-      </w:r>
-      <w:r>
-        <w:t xml:space="preserve">R Foundation for Statistical Computing.</w:t>
-      </w:r>
-    </w:p>
-    <w:bookmarkEnd w:id="110"/>
-    <w:bookmarkStart w:id="112" w:name="ref-robinson2014"/>
-    <w:p>
-      <w:pPr>
-        <w:pStyle w:val="Bibliography"/>
-      </w:pPr>
-      <w:r>
-        <w:t xml:space="preserve">Robinson, David. 2014.</w:t>
-      </w:r>
-      <w:r>
-        <w:t xml:space="preserve"> </w:t>
-      </w:r>
-      <w:r>
-        <w:t xml:space="preserve">“Broom:</w:t>
-      </w:r>
-      <w:r>
-        <w:t xml:space="preserve"> </w:t>
-      </w:r>
-      <w:r>
-        <w:t xml:space="preserve">An R Package</w:t>
-      </w:r>
-      <w:r>
-        <w:t xml:space="preserve"> </w:t>
-      </w:r>
-      <w:r>
-        <w:t xml:space="preserve">for</w:t>
-      </w:r>
-      <w:r>
-        <w:t xml:space="preserve"> </w:t>
-      </w:r>
-      <w:r>
-        <w:t xml:space="preserve">Converting Statistical Analysis Objects Into Tidy Data Frames</w:t>
-      </w:r>
-      <w:r>
-        <w:t xml:space="preserve">.”</w:t>
-      </w:r>
-      <w:r>
-        <w:t xml:space="preserve"> </w:t>
-      </w:r>
-      <w:r>
-        <w:t xml:space="preserve">arXiv.</w:t>
-      </w:r>
-      <w:r>
-        <w:t xml:space="preserve"> </w:t>
-      </w:r>
-      <w:hyperlink r:id="rId111">
-        <w:r>
-          <w:rPr>
-            <w:rStyle w:val="Hyperlink"/>
-          </w:rPr>
-          <w:t xml:space="preserve">https://doi.org/10.48550/arXiv.1412.3565</w:t>
-        </w:r>
-      </w:hyperlink>
-      <w:r>
-        <w:t xml:space="preserve">.</w:t>
-      </w:r>
-    </w:p>
-    <w:bookmarkEnd w:id="112"/>
-    <w:bookmarkStart w:id="114" w:name="ref-rohner2020"/>
-    <w:p>
-      <w:pPr>
-        <w:pStyle w:val="Bibliography"/>
-      </w:pPr>
-      <w:r>
-        <w:t xml:space="preserve">Rohner, Patrick T., Anna L. M. Macagno, and Armin P. Moczek. 2020.</w:t>
-      </w:r>
-      <w:r>
-        <w:t xml:space="preserve"> </w:t>
-      </w:r>
-      <w:r>
-        <w:t xml:space="preserve">“Evolution and Plasticity of Morph-Specific Integration in the Bull-Headed Dung Beetle</w:t>
-      </w:r>
-      <w:r>
-        <w:t xml:space="preserve"> </w:t>
-      </w:r>
-      <w:r>
-        <w:rPr>
-          <w:i/>
-          <w:iCs/>
-        </w:rPr>
-        <w:t xml:space="preserve">Onthophagus</w:t>
-      </w:r>
-      <w:r>
-        <w:t xml:space="preserve"> </w:t>
-      </w:r>
-      <w:r>
-        <w:rPr>
-          <w:i/>
-          <w:iCs/>
-        </w:rPr>
-        <w:t xml:space="preserve">Taurus</w:t>
-      </w:r>
-      <w:r>
-        <w:t xml:space="preserve">.”</w:t>
-      </w:r>
-      <w:r>
-        <w:t xml:space="preserve"> </w:t>
-      </w:r>
-      <w:r>
-        <w:rPr>
-          <w:i/>
-          <w:iCs/>
-        </w:rPr>
-        <w:t xml:space="preserve">Ecol. Evol.</w:t>
-      </w:r>
-      <w:r>
-        <w:t xml:space="preserve"> </w:t>
-      </w:r>
-      <w:r>
-        <w:t xml:space="preserve">10 (19): 10558–70.</w:t>
-      </w:r>
-      <w:r>
-        <w:t xml:space="preserve"> </w:t>
-      </w:r>
-      <w:hyperlink r:id="rId113">
-        <w:r>
-          <w:rPr>
-            <w:rStyle w:val="Hyperlink"/>
-          </w:rPr>
-          <w:t xml:space="preserve">https://doi.org/10.1002/ece3.6711</w:t>
-        </w:r>
-      </w:hyperlink>
-      <w:r>
-        <w:t xml:space="preserve">.</w:t>
-      </w:r>
-    </w:p>
-    <w:bookmarkEnd w:id="114"/>
-    <w:bookmarkStart w:id="116" w:name="ref-schindelin2012"/>
-    <w:p>
-      <w:pPr>
-        <w:pStyle w:val="Bibliography"/>
-      </w:pPr>
-      <w:r>
-        <w:t xml:space="preserve">Schindelin, Johannes, Ignacio Arganda-Carreras, Erwin Frise, Verena Kaynig, Mark Longair, Tobias Pietzsch, Stephan Preibisch, et al. 2012.</w:t>
-      </w:r>
-      <w:r>
-        <w:t xml:space="preserve"> </w:t>
-      </w:r>
-      <w:r>
-        <w:t xml:space="preserve">“Fiji: An Open-Source Platform for Biological-Image Analysis.”</w:t>
-      </w:r>
-      <w:r>
-        <w:t xml:space="preserve"> </w:t>
-      </w:r>
-      <w:r>
-        <w:rPr>
-          <w:i/>
-          <w:iCs/>
-        </w:rPr>
-        <w:t xml:space="preserve">Nat. Methods</w:t>
-      </w:r>
-      <w:r>
-        <w:t xml:space="preserve"> </w:t>
-      </w:r>
-      <w:r>
-        <w:t xml:space="preserve">9 (7): 676–82.</w:t>
-      </w:r>
-      <w:r>
-        <w:t xml:space="preserve"> </w:t>
-      </w:r>
-      <w:hyperlink r:id="rId115">
-        <w:r>
-          <w:rPr>
-            <w:rStyle w:val="Hyperlink"/>
-          </w:rPr>
-          <w:t xml:space="preserve">https://doi.org/10.1038/nmeth.2019</w:t>
-        </w:r>
-      </w:hyperlink>
-      <w:r>
-        <w:t xml:space="preserve">.</w:t>
-      </w:r>
-    </w:p>
-    <w:bookmarkEnd w:id="116"/>
-    <w:bookmarkStart w:id="117" w:name="ref-shuster2003"/>
-    <w:p>
-      <w:pPr>
-        <w:pStyle w:val="Bibliography"/>
-      </w:pPr>
-      <w:r>
-        <w:t xml:space="preserve">Shuster, S. M., and M. J. Wade. 2003.</w:t>
-      </w:r>
-      <w:r>
-        <w:t xml:space="preserve"> </w:t>
-      </w:r>
-      <w:r>
-        <w:rPr>
-          <w:i/>
-          <w:iCs/>
-        </w:rPr>
-        <w:t xml:space="preserve">Mating</w:t>
-      </w:r>
-      <w:r>
-        <w:rPr>
-          <w:i/>
-          <w:iCs/>
-        </w:rPr>
-        <w:t xml:space="preserve"> </w:t>
-      </w:r>
-      <w:r>
-        <w:rPr>
-          <w:i/>
-          <w:iCs/>
-        </w:rPr>
-        <w:t xml:space="preserve">Systems</w:t>
-      </w:r>
-      <w:r>
-        <w:rPr>
-          <w:i/>
-          <w:iCs/>
-        </w:rPr>
-        <w:t xml:space="preserve"> </w:t>
-      </w:r>
-      <w:r>
-        <w:rPr>
-          <w:i/>
-          <w:iCs/>
-        </w:rPr>
-        <w:t xml:space="preserve">and</w:t>
-      </w:r>
-      <w:r>
-        <w:rPr>
-          <w:i/>
-          <w:iCs/>
-        </w:rPr>
-        <w:t xml:space="preserve"> </w:t>
-      </w:r>
-      <w:r>
-        <w:rPr>
-          <w:i/>
-          <w:iCs/>
-        </w:rPr>
-        <w:t xml:space="preserve">Strategies</w:t>
-      </w:r>
-      <w:r>
-        <w:t xml:space="preserve">. Princeton University Press.</w:t>
-      </w:r>
-    </w:p>
-    <w:bookmarkEnd w:id="117"/>
-    <w:bookmarkStart w:id="119" w:name="ref-snell-rood2010"/>
-    <w:p>
-      <w:pPr>
-        <w:pStyle w:val="Bibliography"/>
-      </w:pPr>
-      <w:r>
-        <w:t xml:space="preserve">Snell-Rood, Emilie C., James David Van Dyken, Tami Cruickshank, Michael J. Wade, and Armin P. Moczek. 2010.</w:t>
-      </w:r>
-      <w:r>
-        <w:t xml:space="preserve"> </w:t>
-      </w:r>
-      <w:r>
-        <w:t xml:space="preserve">“Toward a Population Genetic Framework of Developmental Evolution: The Costs, Limits, and Consequences of Phenotypic Plasticity.”</w:t>
-      </w:r>
-      <w:r>
-        <w:t xml:space="preserve"> </w:t>
-      </w:r>
-      <w:r>
-        <w:rPr>
-          <w:i/>
-          <w:iCs/>
-        </w:rPr>
-        <w:t xml:space="preserve">Bioessays</w:t>
-      </w:r>
-      <w:r>
-        <w:t xml:space="preserve"> </w:t>
-      </w:r>
-      <w:r>
-        <w:t xml:space="preserve">32 (1): 71–81.</w:t>
-      </w:r>
-      <w:r>
-        <w:t xml:space="preserve"> </w:t>
-      </w:r>
-      <w:hyperlink r:id="rId118">
-        <w:r>
-          <w:rPr>
-            <w:rStyle w:val="Hyperlink"/>
-          </w:rPr>
-          <w:t xml:space="preserve">https://doi.org/10.1002/bies.200900132</w:t>
-        </w:r>
-      </w:hyperlink>
-      <w:r>
-        <w:t xml:space="preserve">.</w:t>
-      </w:r>
-    </w:p>
-    <w:bookmarkEnd w:id="119"/>
-    <w:bookmarkStart w:id="121" w:name="ref-stoffel2017"/>
-    <w:p>
-      <w:pPr>
-        <w:pStyle w:val="Bibliography"/>
-      </w:pPr>
-      <w:r>
-        <w:t xml:space="preserve">Stoffel, Martin A., Shinichi Nakagawa, and Holger Schielzeth. 2017.</w:t>
-      </w:r>
-      <w:r>
-        <w:t xml:space="preserve"> </w:t>
-      </w:r>
-      <w:r>
-        <w:t xml:space="preserve">“</w:t>
-      </w:r>
-      <w:r>
-        <w:t xml:space="preserve">rptR</w:t>
-      </w:r>
-      <w:r>
-        <w:t xml:space="preserve">: Repeatability Estimation and Variance Decomposition by Generalized Linear Mixed-Effects Models.”</w:t>
-      </w:r>
-      <w:r>
-        <w:t xml:space="preserve"> </w:t>
-      </w:r>
-      <w:r>
-        <w:t xml:space="preserve">Edited by Sarah Goslee.</w:t>
-      </w:r>
-      <w:r>
-        <w:t xml:space="preserve"> </w:t>
-      </w:r>
-      <w:r>
-        <w:rPr>
-          <w:i/>
-          <w:iCs/>
-        </w:rPr>
-        <w:t xml:space="preserve">Methods Ecol. Evol.</w:t>
-      </w:r>
-      <w:r>
-        <w:t xml:space="preserve"> </w:t>
-      </w:r>
-      <w:r>
-        <w:t xml:space="preserve">8 (11): 1639–44.</w:t>
-      </w:r>
-      <w:r>
-        <w:t xml:space="preserve"> </w:t>
-      </w:r>
-      <w:hyperlink r:id="rId120">
-        <w:r>
-          <w:rPr>
-            <w:rStyle w:val="Hyperlink"/>
-          </w:rPr>
-          <w:t xml:space="preserve">https://doi.org/10.1111/2041-210X.12797</w:t>
-        </w:r>
-      </w:hyperlink>
-      <w:r>
-        <w:t xml:space="preserve">.</w:t>
-      </w:r>
-    </w:p>
-    <w:bookmarkEnd w:id="121"/>
-    <w:bookmarkStart w:id="123" w:name="ref-tomkins2005"/>
-    <w:p>
-      <w:pPr>
-        <w:pStyle w:val="Bibliography"/>
-      </w:pPr>
-      <w:r>
-        <w:t xml:space="preserve">Tomkins, J. L., J. S. Kotiaho, and N. R. Lebas. 2005.</w:t>
-      </w:r>
-      <w:r>
-        <w:t xml:space="preserve"> </w:t>
-      </w:r>
-      <w:r>
-        <w:t xml:space="preserve">“Phenotypic Plasticity in the Developmental Integration of Morphological Trade-Offs and Secondary Sexual Trait Compensation.”</w:t>
-      </w:r>
-      <w:r>
-        <w:t xml:space="preserve"> </w:t>
-      </w:r>
-      <w:r>
-        <w:rPr>
-          <w:i/>
-          <w:iCs/>
-        </w:rPr>
-        <w:t xml:space="preserve">Proc Biol Sci</w:t>
-      </w:r>
-      <w:r>
-        <w:t xml:space="preserve"> </w:t>
-      </w:r>
-      <w:r>
-        <w:t xml:space="preserve">272 (1562): 543–51.</w:t>
-      </w:r>
-      <w:r>
-        <w:t xml:space="preserve"> </w:t>
-      </w:r>
-      <w:hyperlink r:id="rId122">
-        <w:r>
-          <w:rPr>
-            <w:rStyle w:val="Hyperlink"/>
-          </w:rPr>
-          <w:t xml:space="preserve">https://doi.org/10.1098/rspb.2004.2950</w:t>
-        </w:r>
-      </w:hyperlink>
-      <w:r>
-        <w:t xml:space="preserve">.</w:t>
-      </w:r>
-    </w:p>
-    <w:bookmarkEnd w:id="123"/>
-    <w:bookmarkStart w:id="124" w:name="ref-west-eberhard2003"/>
-    <w:p>
-      <w:pPr>
-        <w:pStyle w:val="Bibliography"/>
-      </w:pPr>
-      <w:r>
-        <w:t xml:space="preserve">West-Eberhard, Mary Jane. 2003.</w:t>
-      </w:r>
-      <w:r>
-        <w:t xml:space="preserve"> </w:t>
-      </w:r>
-      <w:r>
-        <w:rPr>
-          <w:i/>
-          <w:iCs/>
-        </w:rPr>
-        <w:t xml:space="preserve">Developmental</w:t>
-      </w:r>
-      <w:r>
-        <w:rPr>
-          <w:i/>
-          <w:iCs/>
-        </w:rPr>
-        <w:t xml:space="preserve"> </w:t>
-      </w:r>
-      <w:r>
-        <w:rPr>
-          <w:i/>
-          <w:iCs/>
-        </w:rPr>
-        <w:t xml:space="preserve">Plasticity</w:t>
-      </w:r>
-      <w:r>
-        <w:rPr>
-          <w:i/>
-          <w:iCs/>
-        </w:rPr>
-        <w:t xml:space="preserve"> </w:t>
-      </w:r>
-      <w:r>
-        <w:rPr>
-          <w:i/>
-          <w:iCs/>
-        </w:rPr>
-        <w:t xml:space="preserve">and</w:t>
-      </w:r>
-      <w:r>
-        <w:rPr>
-          <w:i/>
-          <w:iCs/>
-        </w:rPr>
-        <w:t xml:space="preserve"> </w:t>
-      </w:r>
-      <w:r>
-        <w:rPr>
-          <w:i/>
-          <w:iCs/>
-        </w:rPr>
-        <w:t xml:space="preserve">Evolution</w:t>
-      </w:r>
-      <w:r>
-        <w:t xml:space="preserve">. Oxford, UK: Oxford University Press.</w:t>
-      </w:r>
-    </w:p>
-    <w:bookmarkEnd w:id="124"/>
-    <w:bookmarkStart w:id="126" w:name="ref-wickham2019"/>
-    <w:p>
-      <w:pPr>
-        <w:pStyle w:val="Bibliography"/>
-      </w:pPr>
-      <w:r>
-        <w:t xml:space="preserve">Wickham, Hadley, Mara Averick, Jennifer Bryan, Winston Chang, Lucy D’Agostino McGowan, Romain François, Garrett Grolemund, et al. 2019.</w:t>
-      </w:r>
-      <w:r>
-        <w:t xml:space="preserve"> </w:t>
-      </w:r>
-      <w:r>
-        <w:t xml:space="preserve">“Welcome to the</w:t>
-      </w:r>
-      <w:r>
-        <w:t xml:space="preserve"> </w:t>
-      </w:r>
-      <w:r>
-        <w:t xml:space="preserve">Tidyverse</w:t>
-      </w:r>
-      <w:r>
-        <w:t xml:space="preserve">.”</w:t>
-      </w:r>
-      <w:r>
-        <w:t xml:space="preserve"> </w:t>
-      </w:r>
-      <w:r>
-        <w:rPr>
-          <w:i/>
-          <w:iCs/>
-        </w:rPr>
-        <w:t xml:space="preserve">J. Open Source Softw.</w:t>
-      </w:r>
-      <w:r>
-        <w:t xml:space="preserve"> </w:t>
-      </w:r>
-      <w:r>
-        <w:t xml:space="preserve">4 (43): 1686.</w:t>
-      </w:r>
-      <w:r>
-        <w:t xml:space="preserve"> </w:t>
-      </w:r>
-      <w:hyperlink r:id="rId125">
-        <w:r>
-          <w:rPr>
-            <w:rStyle w:val="Hyperlink"/>
-          </w:rPr>
-          <w:t xml:space="preserve">https://doi.org/10.21105/joss.01686</w:t>
-        </w:r>
-      </w:hyperlink>
-      <w:r>
-        <w:t xml:space="preserve">.</w:t>
-      </w:r>
-    </w:p>
-    <w:bookmarkEnd w:id="126"/>
-    <w:bookmarkStart w:id="128" w:name="ref-wilson2019"/>
-    <w:p>
-      <w:pPr>
-        <w:pStyle w:val="Bibliography"/>
-      </w:pPr>
-      <w:r>
-        <w:t xml:space="preserve">Wilson, Alexander D. M., and Clint D. Kelly. 2019.</w:t>
-      </w:r>
-      <w:r>
-        <w:t xml:space="preserve"> </w:t>
-      </w:r>
-      <w:r>
-        <w:t xml:space="preserve">“Do Alternative Reproductive Strategies in the</w:t>
-      </w:r>
-      <w:r>
-        <w:t xml:space="preserve"> </w:t>
-      </w:r>
-      <w:r>
-        <w:t xml:space="preserve">Ellington Tree Weta Represent Different Behavioural Types?”</w:t>
-      </w:r>
-      <w:r>
-        <w:t xml:space="preserve"> </w:t>
-      </w:r>
-      <w:r>
-        <w:rPr>
-          <w:i/>
-          <w:iCs/>
-        </w:rPr>
-        <w:t xml:space="preserve">Ethology</w:t>
-      </w:r>
-      <w:r>
-        <w:t xml:space="preserve"> </w:t>
-      </w:r>
-      <w:r>
-        <w:t xml:space="preserve">125 (6): 380–91.</w:t>
-      </w:r>
-      <w:r>
-        <w:t xml:space="preserve"> </w:t>
-      </w:r>
-      <w:hyperlink r:id="rId127">
-        <w:r>
-          <w:rPr>
-            <w:rStyle w:val="Hyperlink"/>
-          </w:rPr>
-          <w:t xml:space="preserve">https://doi.org/10.1111/eth.12862</w:t>
-        </w:r>
-      </w:hyperlink>
-      <w:r>
-        <w:t xml:space="preserve">.</w:t>
-      </w:r>
-    </w:p>
-    <w:bookmarkEnd w:id="128"/>
-    <w:bookmarkEnd w:id="129"/>
-    <w:p>
-      <w:r>
-        <w:br w:type="page"/>
-      </w:r>
-    </w:p>
-    <w:bookmarkEnd w:id="130"/>
-    <w:bookmarkStart w:id="138" w:name="tables"/>
+    <w:bookmarkStart w:id="72" w:name="tables"/>
     <w:p>
       <w:pPr>
         <w:pStyle w:val="Heading1"/>
@@ -7627,7 +5494,7 @@
       <w:tr>
         <w:tc>
           <w:tcPr/>
-          <w:bookmarkStart w:id="131" w:name="tbl-group-summary"/>
+          <w:bookmarkStart w:id="65" w:name="tbl-group-summary"/>
           <w:p>
             <w:pPr>
               <w:jc w:val="center"/>
@@ -9295,7 +7162,7 @@
               </w:tc>
             </w:tr>
           </w:tbl>
-          <w:bookmarkEnd w:id="131"/>
+          <w:bookmarkEnd w:id="65"/>
         </w:tc>
       </w:tr>
     </w:tbl>
@@ -9317,7 +7184,7 @@
       <w:tr>
         <w:tc>
           <w:tcPr/>
-          <w:bookmarkStart w:id="132" w:name="tbl-leg-contrasts"/>
+          <w:bookmarkStart w:id="66" w:name="tbl-leg-contrasts"/>
           <w:p>
             <w:pPr>
               <w:jc w:val="center"/>
@@ -12630,7 +10497,7 @@
               </w:tc>
             </w:tr>
           </w:tbl>
-          <w:bookmarkEnd w:id="132"/>
+          <w:bookmarkEnd w:id="66"/>
         </w:tc>
       </w:tr>
     </w:tbl>
@@ -12652,7 +10519,7 @@
       <w:tr>
         <w:tc>
           <w:tcPr/>
-          <w:bookmarkStart w:id="133" w:name="tbl-leg-slopes"/>
+          <w:bookmarkStart w:id="67" w:name="tbl-leg-slopes"/>
           <w:p>
             <w:pPr>
               <w:jc w:val="center"/>
@@ -16250,7 +14117,7 @@
               </w:tc>
             </w:tr>
           </w:tbl>
-          <w:bookmarkEnd w:id="133"/>
+          <w:bookmarkEnd w:id="67"/>
         </w:tc>
       </w:tr>
     </w:tbl>
@@ -16272,7 +14139,7 @@
       <w:tr>
         <w:tc>
           <w:tcPr/>
-          <w:bookmarkStart w:id="134" w:name="tbl-segment-tests"/>
+          <w:bookmarkStart w:id="68" w:name="tbl-segment-tests"/>
           <w:p>
             <w:pPr>
               <w:jc w:val="center"/>
@@ -18598,7 +16465,7 @@
               </w:tc>
             </w:tr>
           </w:tbl>
-          <w:bookmarkEnd w:id="134"/>
+          <w:bookmarkEnd w:id="68"/>
         </w:tc>
       </w:tr>
     </w:tbl>
@@ -18620,7 +16487,7 @@
       <w:tr>
         <w:tc>
           <w:tcPr/>
-          <w:bookmarkStart w:id="135" w:name="tbl-weapon-leg-slopes"/>
+          <w:bookmarkStart w:id="69" w:name="tbl-weapon-leg-slopes"/>
           <w:p>
             <w:pPr>
               <w:jc w:val="center"/>
@@ -22920,7 +20787,7 @@
               </w:tc>
             </w:tr>
           </w:tbl>
-          <w:bookmarkEnd w:id="135"/>
+          <w:bookmarkEnd w:id="69"/>
         </w:tc>
       </w:tr>
     </w:tbl>
@@ -22942,7 +20809,7 @@
       <w:tr>
         <w:tc>
           <w:tcPr/>
-          <w:bookmarkStart w:id="136" w:name="tbl-ear-means"/>
+          <w:bookmarkStart w:id="70" w:name="tbl-ear-means"/>
           <w:p>
             <w:pPr>
               <w:jc w:val="center"/>
@@ -24070,7 +21937,7 @@
               </w:tc>
             </w:tr>
           </w:tbl>
-          <w:bookmarkEnd w:id="136"/>
+          <w:bookmarkEnd w:id="70"/>
         </w:tc>
       </w:tr>
     </w:tbl>
@@ -24092,7 +21959,7 @@
       <w:tr>
         <w:tc>
           <w:tcPr/>
-          <w:bookmarkStart w:id="137" w:name="tbl-eye-means"/>
+          <w:bookmarkStart w:id="71" w:name="tbl-eye-means"/>
           <w:p>
             <w:pPr>
               <w:jc w:val="center"/>
@@ -25220,7 +23087,7 @@
               </w:tc>
             </w:tr>
           </w:tbl>
-          <w:bookmarkEnd w:id="137"/>
+          <w:bookmarkEnd w:id="71"/>
         </w:tc>
       </w:tr>
     </w:tbl>
@@ -25229,8 +23096,8 @@
         <w:br w:type="page"/>
       </w:r>
     </w:p>
-    <w:bookmarkEnd w:id="138"/>
-    <w:bookmarkStart w:id="159" w:name="figures"/>
+    <w:bookmarkEnd w:id="72"/>
+    <w:bookmarkStart w:id="93" w:name="figures"/>
     <w:p>
       <w:pPr>
         <w:pStyle w:val="Heading1"/>
@@ -25252,7 +23119,7 @@
       <w:tr>
         <w:tc>
           <w:tcPr/>
-          <w:bookmarkStart w:id="142" w:name="fig-adjusted-legs"/>
+          <w:bookmarkStart w:id="76" w:name="fig-adjusted-legs"/>
           <w:p>
             <w:pPr>
               <w:pStyle w:val="Compact"/>
@@ -25263,18 +23130,18 @@
                 <wp:inline>
                   <wp:extent cx="5969000" cy="3316111"/>
                   <wp:effectExtent b="0" l="0" r="0" t="0"/>
-                  <wp:docPr descr="" title="" id="140" name="Picture"/>
+                  <wp:docPr descr="" title="" id="74" name="Picture"/>
                   <a:graphic>
                     <a:graphicData uri="http://schemas.openxmlformats.org/drawingml/2006/picture">
                       <pic:pic>
                         <pic:nvPicPr>
-                          <pic:cNvPr descr="analysis_outputs/weta_trait_analysis/figures/adjusted_leg_means.png" id="141" name="Picture"/>
+                          <pic:cNvPr descr="analysis_outputs/weta_trait_analysis/figures/adjusted_leg_means.png" id="75" name="Picture"/>
                           <pic:cNvPicPr>
                             <a:picLocks noChangeArrowheads="1" noChangeAspect="1"/>
                           </pic:cNvPicPr>
                         </pic:nvPicPr>
                         <pic:blipFill>
-                          <a:blip r:embed="rId139"/>
+                          <a:blip r:embed="rId73"/>
                           <a:stretch>
                             <a:fillRect/>
                           </a:stretch>
@@ -25314,7 +23181,7 @@
               <w:t xml:space="preserve">Figure 1: Size-adjusted predicted foreleg, midleg, and hindleg lengths for females and the three male morphotypes at a pronotum length of 7.2 mm. Error bars are 95% confidence intervals.</w:t>
             </w:r>
           </w:p>
-          <w:bookmarkEnd w:id="142"/>
+          <w:bookmarkEnd w:id="76"/>
         </w:tc>
       </w:tr>
     </w:tbl>
@@ -25336,7 +23203,7 @@
       <w:tr>
         <w:tc>
           <w:tcPr/>
-          <w:bookmarkStart w:id="146" w:name="fig-leg-allometries"/>
+          <w:bookmarkStart w:id="80" w:name="fig-leg-allometries"/>
           <w:p>
             <w:pPr>
               <w:pStyle w:val="Compact"/>
@@ -25347,18 +23214,18 @@
                 <wp:inline>
                   <wp:extent cx="5969000" cy="4642555"/>
                   <wp:effectExtent b="0" l="0" r="0" t="0"/>
-                  <wp:docPr descr="" title="" id="144" name="Picture"/>
+                  <wp:docPr descr="" title="" id="78" name="Picture"/>
                   <a:graphic>
                     <a:graphicData uri="http://schemas.openxmlformats.org/drawingml/2006/picture">
                       <pic:pic>
                         <pic:nvPicPr>
-                          <pic:cNvPr descr="analysis_outputs/weta_trait_analysis/figures/leg_allometries.png" id="145" name="Picture"/>
+                          <pic:cNvPr descr="analysis_outputs/weta_trait_analysis/figures/leg_allometries.png" id="79" name="Picture"/>
                           <pic:cNvPicPr>
                             <a:picLocks noChangeArrowheads="1" noChangeAspect="1"/>
                           </pic:cNvPicPr>
                         </pic:nvPicPr>
                         <pic:blipFill>
-                          <a:blip r:embed="rId143"/>
+                          <a:blip r:embed="rId77"/>
                           <a:stretch>
                             <a:fillRect/>
                           </a:stretch>
@@ -25398,7 +23265,7 @@
               <w:t xml:space="preserve">Figure 2: Log–log relationships between pronotum length and total foreleg, midleg, and hindleg length in females and the three male morphotypes.</w:t>
             </w:r>
           </w:p>
-          <w:bookmarkEnd w:id="146"/>
+          <w:bookmarkEnd w:id="80"/>
         </w:tc>
       </w:tr>
     </w:tbl>
@@ -25420,7 +23287,7 @@
       <w:tr>
         <w:tc>
           <w:tcPr/>
-          <w:bookmarkStart w:id="150" w:name="fig-weapon-leg"/>
+          <w:bookmarkStart w:id="84" w:name="fig-weapon-leg"/>
           <w:p>
             <w:pPr>
               <w:pStyle w:val="Compact"/>
@@ -25431,18 +23298,18 @@
                 <wp:inline>
                   <wp:extent cx="5969000" cy="4642555"/>
                   <wp:effectExtent b="0" l="0" r="0" t="0"/>
-                  <wp:docPr descr="" title="" id="148" name="Picture"/>
+                  <wp:docPr descr="" title="" id="82" name="Picture"/>
                   <a:graphic>
                     <a:graphicData uri="http://schemas.openxmlformats.org/drawingml/2006/picture">
                       <pic:pic>
                         <pic:nvPicPr>
-                          <pic:cNvPr descr="analysis_outputs/weta_trait_analysis/figures/head_leg_compensation.png" id="149" name="Picture"/>
+                          <pic:cNvPr descr="analysis_outputs/weta_trait_analysis/figures/head_leg_compensation.png" id="83" name="Picture"/>
                           <pic:cNvPicPr>
                             <a:picLocks noChangeArrowheads="1" noChangeAspect="1"/>
                           </pic:cNvPicPr>
                         </pic:nvPicPr>
                         <pic:blipFill>
-                          <a:blip r:embed="rId147"/>
+                          <a:blip r:embed="rId81"/>
                           <a:stretch>
                             <a:fillRect/>
                           </a:stretch>
@@ -25482,7 +23349,7 @@
               <w:t xml:space="preserve">Figure 3: Relationship between relative head size (weapon size adjusted for pronotum length) and predicted leg length in females and the three male morphotypes. Lines show partial slopes after accounting for pronotum length.</w:t>
             </w:r>
           </w:p>
-          <w:bookmarkEnd w:id="150"/>
+          <w:bookmarkEnd w:id="84"/>
         </w:tc>
       </w:tr>
     </w:tbl>
@@ -25504,7 +23371,7 @@
       <w:tr>
         <w:tc>
           <w:tcPr/>
-          <w:bookmarkStart w:id="154" w:name="fig-ear-body"/>
+          <w:bookmarkStart w:id="88" w:name="fig-ear-body"/>
           <w:p>
             <w:pPr>
               <w:pStyle w:val="Compact"/>
@@ -25515,18 +23382,18 @@
                 <wp:inline>
                   <wp:extent cx="4775200" cy="3410857"/>
                   <wp:effectExtent b="0" l="0" r="0" t="0"/>
-                  <wp:docPr descr="" title="" id="152" name="Picture"/>
+                  <wp:docPr descr="" title="" id="86" name="Picture"/>
                   <a:graphic>
                     <a:graphicData uri="http://schemas.openxmlformats.org/drawingml/2006/picture">
                       <pic:pic>
                         <pic:nvPicPr>
-                          <pic:cNvPr descr="analysis_outputs/weta_trait_analysis/figures/ear_body_adjusted_means.png" id="153" name="Picture"/>
+                          <pic:cNvPr descr="analysis_outputs/weta_trait_analysis/figures/ear_body_adjusted_means.png" id="87" name="Picture"/>
                           <pic:cNvPicPr>
                             <a:picLocks noChangeArrowheads="1" noChangeAspect="1"/>
                           </pic:cNvPicPr>
                         </pic:nvPicPr>
                         <pic:blipFill>
-                          <a:blip r:embed="rId151"/>
+                          <a:blip r:embed="rId85"/>
                           <a:stretch>
                             <a:fillRect/>
                           </a:stretch>
@@ -25566,7 +23433,7 @@
               <w:t xml:space="preserve">Figure 4: Predicted tympanic organ area adjusted for pronotum length in females and the three male morphotypes. Error bars are 95% confidence intervals.</w:t>
             </w:r>
           </w:p>
-          <w:bookmarkEnd w:id="154"/>
+          <w:bookmarkEnd w:id="88"/>
         </w:tc>
       </w:tr>
     </w:tbl>
@@ -25588,7 +23455,7 @@
       <w:tr>
         <w:tc>
           <w:tcPr/>
-          <w:bookmarkStart w:id="158" w:name="fig-eye-body"/>
+          <w:bookmarkStart w:id="92" w:name="fig-eye-body"/>
           <w:p>
             <w:pPr>
               <w:pStyle w:val="Compact"/>
@@ -25599,18 +23466,18 @@
                 <wp:inline>
                   <wp:extent cx="4775200" cy="3410857"/>
                   <wp:effectExtent b="0" l="0" r="0" t="0"/>
-                  <wp:docPr descr="" title="" id="156" name="Picture"/>
+                  <wp:docPr descr="" title="" id="90" name="Picture"/>
                   <a:graphic>
                     <a:graphicData uri="http://schemas.openxmlformats.org/drawingml/2006/picture">
                       <pic:pic>
                         <pic:nvPicPr>
-                          <pic:cNvPr descr="analysis_outputs/weta_trait_analysis/figures/eye_body_adjusted_means.png" id="157" name="Picture"/>
+                          <pic:cNvPr descr="analysis_outputs/weta_trait_analysis/figures/eye_body_adjusted_means.png" id="91" name="Picture"/>
                           <pic:cNvPicPr>
                             <a:picLocks noChangeArrowheads="1" noChangeAspect="1"/>
                           </pic:cNvPicPr>
                         </pic:nvPicPr>
                         <pic:blipFill>
-                          <a:blip r:embed="rId155"/>
+                          <a:blip r:embed="rId89"/>
                           <a:stretch>
                             <a:fillRect/>
                           </a:stretch>
@@ -25650,7 +23517,7 @@
               <w:t xml:space="preserve">Figure 5: Predicted eye length adjusted for pronotum length in females and the three male morphotypes. Error bars are 95% confidence intervals.</w:t>
             </w:r>
           </w:p>
-          <w:bookmarkEnd w:id="158"/>
+          <w:bookmarkEnd w:id="92"/>
         </w:tc>
       </w:tr>
     </w:tbl>
@@ -25659,8 +23526,8 @@
         <w:br w:type="page"/>
       </w:r>
     </w:p>
-    <w:bookmarkEnd w:id="159"/>
-    <w:bookmarkStart w:id="160" w:name="supplementary-material"/>
+    <w:bookmarkEnd w:id="93"/>
+    <w:bookmarkStart w:id="94" w:name="supplementary-material"/>
     <w:p>
       <w:pPr>
         <w:pStyle w:val="Heading1"/>
@@ -32035,7 +29902,7 @@
         <w:t xml:space="preserve">: 0.524 signed, 0.867 absolute).</w:t>
       </w:r>
     </w:p>
-    <w:bookmarkEnd w:id="160"/>
+    <w:bookmarkEnd w:id="94"/>
     <w:sectPr>
       <w:headerReference r:id="rId10" w:type="even"/>
       <w:headerReference r:id="rId9" w:type="default"/>

</xml_diff>